<commit_message>
Ada Koch I: Álvaro con herida propia y arco cerrado (propuesta de siete puntos)
Mensaje cálido tras el primero y disculpa antes de la llamada; el tono con que dice
«Ada» sembrado en el cap. 1; padre que se iba y abrigo azul; la carpeta como cuidado
y rehén a la vez; silencio y mano en el hombro de Iter en el puerto; se queda,
pregunta «¿Qué eres?» y Ada lo echa; «Ninguna» en el cuartel.

Co-Authored-By: Claude Opus 5.5 <noreply@anthropic.com>
Claude-Session: https://claude.ai/code/session_01HymiadRDUPzWBtequ8tm6m
</commit_message>
<xml_diff>
--- a/ada_koch/libro_1/Los_Amantes_de_la_Espiral.docx
+++ b/ada_koch/libro_1/Los_Amantes_de_la_Espiral.docx
@@ -669,6 +669,30 @@
         <w:pStyle w:val="BodyText"/>
       </w:pPr>
       <w:r>
+        <w:t xml:space="preserve">Hasta en tres palabras le oía la voz. La manera que tenía de decir mi nombre: la primera a larga, la segunda cayendo, como se le dice a una niña que ha vuelto a manchar el mantel.</w:t>
+      </w:r>
+      <w:r>
+        <w:t xml:space="preserve"> </w:t>
+      </w:r>
+      <w:r>
+        <w:rPr>
+          <w:iCs/>
+          <w:i/>
+        </w:rPr>
+        <w:t xml:space="preserve">Aaada.</w:t>
+      </w:r>
+      <w:r>
+        <w:t xml:space="preserve"> </w:t>
+      </w:r>
+      <w:r>
+        <w:t xml:space="preserve">Durante tres años creí que era cariño.</w:t>
+      </w:r>
+    </w:p>
+    <w:p>
+      <w:pPr>
+        <w:pStyle w:val="BodyText"/>
+      </w:pPr>
+      <w:r>
         <w:t xml:space="preserve">No le había contado a nadie de Madrid dónde vivía ahora. Me pregunté quién se lo habría dicho. Luego me pregunté por qué me importaba tanto.</w:t>
       </w:r>
     </w:p>
@@ -8793,7 +8817,43 @@
         <w:pStyle w:val="BodyText"/>
       </w:pPr>
       <w:r>
-        <w:t xml:space="preserve">Nada más.</w:t>
+        <w:t xml:space="preserve">Y uno más. Del número sin nombre.</w:t>
+      </w:r>
+    </w:p>
+    <w:p>
+      <w:pPr>
+        <w:pStyle w:val="BodyText"/>
+      </w:pPr>
+      <w:r>
+        <w:rPr>
+          <w:iCs/>
+          <w:i/>
+        </w:rPr>
+        <w:t xml:space="preserve">Ada. Perdona lo del otro día, no era forma de escribirte después de tanto tiempo. Sé que no quieres saber nada de mí y lo entiendo. He visto lo de la borrasca en las noticias. Solo quería saber que estás bien. No te molesto más.</w:t>
+      </w:r>
+    </w:p>
+    <w:p>
+      <w:pPr>
+        <w:pStyle w:val="BodyText"/>
+      </w:pPr>
+      <w:r>
+        <w:t xml:space="preserve">Lo leí tres veces.</w:t>
+      </w:r>
+    </w:p>
+    <w:p>
+      <w:pPr>
+        <w:pStyle w:val="BodyText"/>
+      </w:pPr>
+      <w:r>
+        <w:t xml:space="preserve">Era él. El de los primeros meses. El que se acordaba de que no tomo azúcar y me esperaba con el paraguas a la salida del metro. Durante un segundo me alegré de que se acordara de mí. Durante el segundo siguiente me odié por haberme alegrado.</w:t>
+      </w:r>
+    </w:p>
+    <w:p>
+      <w:pPr>
+        <w:pStyle w:val="BodyText"/>
+      </w:pPr>
+      <w:r>
+        <w:t xml:space="preserve">No contesté. Tampoco lo borré.</w:t>
       </w:r>
     </w:p>
     <w:p>
@@ -17303,7 +17363,7 @@
           <w:iCs/>
           <w:i/>
         </w:rPr>
-        <w:t xml:space="preserve">Tengo que verte. Es importante.</w:t>
+        <w:t xml:space="preserve">Perdona. Te dije que no te molestaría y te molesto. Es que ha pasado algo. ¿Puedo llamarte? Es importante.</w:t>
       </w:r>
     </w:p>
     <w:p>
@@ -17484,7 +17544,7 @@
           <w:iCs/>
           <w:i/>
         </w:rPr>
-        <w:t xml:space="preserve">Tengo que verte. Es importante.</w:t>
+        <w:t xml:space="preserve">¿Puedo llamarte? Es importante.</w:t>
       </w:r>
     </w:p>
     <w:p>
@@ -24381,31 +24441,71 @@
         <w:pStyle w:val="BodyText"/>
       </w:pPr>
       <w:r>
-        <w:t xml:space="preserve">Sonrió. Dejó la caja en el suelo, entre los dos.</w:t>
-      </w:r>
-    </w:p>
-    <w:p>
-      <w:pPr>
-        <w:pStyle w:val="BodyText"/>
-      </w:pPr>
-      <w:r>
-        <w:t xml:space="preserve">—Tus cosas. Ropa, el perfume que te regalé, unos libros. Te fuiste tan deprisa… —Abrió las manos, inocente—. Me preocupé mucho, Ada. Tu madre también. Todos nos preocupamos. Te fuiste sin explicar nada, sin despedirte, como si hubiera pasado algo horrible.</w:t>
-      </w:r>
-    </w:p>
-    <w:p>
-      <w:pPr>
-        <w:pStyle w:val="BodyText"/>
-      </w:pPr>
-      <w:r>
-        <w:t xml:space="preserve">No contesté.</w:t>
-      </w:r>
-    </w:p>
-    <w:p>
-      <w:pPr>
-        <w:pStyle w:val="BodyText"/>
-      </w:pPr>
-      <w:r>
-        <w:t xml:space="preserve">—Y hay una cosa más.</w:t>
+        <w:t xml:space="preserve">No me contestó. Dejó la caja en el suelo, entre los dos, y pasó a mi lado como si yo no estuviera.</w:t>
+      </w:r>
+    </w:p>
+    <w:p>
+      <w:pPr>
+        <w:pStyle w:val="BodyText"/>
+      </w:pPr>
+      <w:r>
+        <w:t xml:space="preserve">Fue hacia Iter.</w:t>
+      </w:r>
+    </w:p>
+    <w:p>
+      <w:pPr>
+        <w:pStyle w:val="BodyText"/>
+      </w:pPr>
+      <w:r>
+        <w:t xml:space="preserve">Lo miró de cerca. No con desprecio. Con curiosidad. Como se mira un animal raro detrás de un cristal. Le puso la mano en el hombro, la mano del reloj caro, con suavidad, como a un amigo, y se inclinó y le dijo algo al oído.</w:t>
+      </w:r>
+    </w:p>
+    <w:p>
+      <w:pPr>
+        <w:pStyle w:val="BodyText"/>
+      </w:pPr>
+      <w:r>
+        <w:t xml:space="preserve">No lo oí. Nadie lo oyó.</w:t>
+      </w:r>
+    </w:p>
+    <w:p>
+      <w:pPr>
+        <w:pStyle w:val="BodyText"/>
+      </w:pPr>
+      <w:r>
+        <w:t xml:space="preserve">Iter se quedó inmóvil. Como al principio, cuando todavía no sabía moverse si yo no lo dibujaba.</w:t>
+      </w:r>
+    </w:p>
+    <w:p>
+      <w:pPr>
+        <w:pStyle w:val="BodyText"/>
+      </w:pPr>
+      <w:r>
+        <w:t xml:space="preserve">Luego él se volvió hacia mí y sonrió.</w:t>
+      </w:r>
+    </w:p>
+    <w:p>
+      <w:pPr>
+        <w:pStyle w:val="BodyText"/>
+      </w:pPr>
+      <w:r>
+        <w:t xml:space="preserve">Esa sonrisa la conocía. Era la de Madrid. La de cuando algo le salía bien en el trabajo y llegaba a casa y me lo contaba de pie, sin quitarse el abrigo.</w:t>
+      </w:r>
+    </w:p>
+    <w:p>
+      <w:pPr>
+        <w:pStyle w:val="BodyText"/>
+      </w:pPr>
+      <w:r>
+        <w:t xml:space="preserve">El abrigo de paño azul era igual que uno que tenía su padre. Su padre, que se iba. No se murió: se iba. Cogía el coche un martes y volvía un mes después, o tres, con regalos y una explicación que nunca era la misma. Me lo contó una sola vez, en Madrid, de madrugada, como si confesara un crimen. Que de niño se aprendía los horarios de todo, los trenes, las comidas, los turnos de su madre, para que nada volviera a pillarlo por sorpresa. Que el abrigo se lo compró con el primer sueldo, porque era el que llevaba su padre la última vez que volvió.</w:t>
+      </w:r>
+    </w:p>
+    <w:p>
+      <w:pPr>
+        <w:pStyle w:val="BodyText"/>
+      </w:pPr>
+      <w:r>
+        <w:t xml:space="preserve">Yo entonces pensé que era ternura. Después pensé que era otra cosa. Ahora, en el muelle, con todo el pueblo mirando, pensé que eran las dos. Que a los dos se nos fue un padre. Yo me puse a dibujar a alguien que se quedaba. Él aprendió a que nadie pudiera irse.</w:t>
       </w:r>
     </w:p>
     <w:p>
@@ -24457,7 +24557,7 @@
         <w:pStyle w:val="BodyText"/>
       </w:pPr>
       <w:r>
-        <w:t xml:space="preserve">—La tiraste a la basura el último invierno —dijo, con voz suave—. ¿Te acuerdas? Una noche. Yo la saqué. Sabía que te arrepentirías. Siempre te arrepientes, Ada. —Me la tendió—. Yo te conozco.</w:t>
+        <w:t xml:space="preserve">—La tiraste a la basura el último invierno —dijo, con voz suave—. Una noche, a las tres. Te vi desde la ventana de la cocina. Bajé en pijama. Estaba debajo de una bolsa de cáscaras de naranja. La limpié con un trapo, hoja por hoja. La guardé en el armario, debajo de las sábanas, para que no cogiera humedad. —Me la tendió—. No te la devolví porque sabía que te daría vergüenza. Quería que un día pudieras tenerla sin tener que pedírmela. Yo te conozco.</w:t>
       </w:r>
     </w:p>
     <w:p>
@@ -24473,15 +24573,23 @@
         <w:pStyle w:val="BodyText"/>
       </w:pPr>
       <w:r>
-        <w:t xml:space="preserve">Miré la carpeta. Miré su mano sujetándola. Su mano, limpia, con el reloj caro, con las uñas cortadas. La mano que la había sacado de la basura y la había guardado un año entero en un armario de Madrid, esperando el momento de devolvérmela.</w:t>
-      </w:r>
-    </w:p>
-    <w:p>
-      <w:pPr>
-        <w:pStyle w:val="BodyText"/>
-      </w:pPr>
-      <w:r>
-        <w:t xml:space="preserve">Como un rehén.</w:t>
+        <w:t xml:space="preserve">Miré la carpeta. Miré su mano sujetándola. La mano que la había sacado de la basura y la había guardado un año entero en un armario de Madrid.</w:t>
+      </w:r>
+    </w:p>
+    <w:p>
+      <w:pPr>
+        <w:pStyle w:val="BodyText"/>
+      </w:pPr>
+      <w:r>
+        <w:t xml:space="preserve">Como un rehén, pensé.</w:t>
+      </w:r>
+    </w:p>
+    <w:p>
+      <w:pPr>
+        <w:pStyle w:val="BodyText"/>
+      </w:pPr>
+      <w:r>
+        <w:t xml:space="preserve">Y en cuanto lo pensé supe que no era solo eso. Que también la había limpiado hoja por hoja, a las tres de la mañana, en pijama. Que las dos cosas cabían en la misma mano. Eso era lo peor.</w:t>
       </w:r>
     </w:p>
     <w:p>
@@ -24505,31 +24613,15 @@
         <w:pStyle w:val="BodyText"/>
       </w:pPr>
       <w:r>
-        <w:t xml:space="preserve">Luego la soltó. Sonriendo.</w:t>
-      </w:r>
-    </w:p>
-    <w:p>
-      <w:pPr>
-        <w:pStyle w:val="BodyText"/>
-      </w:pPr>
-      <w:r>
-        <w:t xml:space="preserve">—Siempre has tenido demasiada imaginación —dijo, bajito, solo para mí—. Mira dónde te ha traído. Un faro. Una abuela. Y… —miró a Iter— esto.</w:t>
-      </w:r>
-    </w:p>
-    <w:p>
-      <w:pPr>
-        <w:pStyle w:val="BodyText"/>
-      </w:pPr>
-      <w:r>
-        <w:t xml:space="preserve">Apreté la carpeta contra el pecho.</w:t>
-      </w:r>
-    </w:p>
-    <w:p>
-      <w:pPr>
-        <w:pStyle w:val="BodyText"/>
-      </w:pPr>
-      <w:r>
-        <w:t xml:space="preserve">—Vuelve conmigo —dijo—. Aquí no tienes nada. Te estás escondiendo del mundo. Yo te conozco, Ada. Sé lo que te pasa cuando estás sola demasiado tiempo. Empiezas a ver cosas.</w:t>
+        <w:t xml:space="preserve">Luego la soltó.</w:t>
+      </w:r>
+    </w:p>
+    <w:p>
+      <w:pPr>
+        <w:pStyle w:val="BodyText"/>
+      </w:pPr>
+      <w:r>
+        <w:t xml:space="preserve">—Siempre has tenido demasiada imaginación —dijo, bajito, solo para mí. Y miró a Iter.</w:t>
       </w:r>
     </w:p>
     <w:p>
@@ -24561,6 +24653,22 @@
         <w:pStyle w:val="BodyText"/>
       </w:pPr>
       <w:r>
+        <w:t xml:space="preserve">—Vuelve conmigo, Ada.</w:t>
+      </w:r>
+    </w:p>
+    <w:p>
+      <w:pPr>
+        <w:pStyle w:val="BodyText"/>
+      </w:pPr>
+      <w:r>
+        <w:t xml:space="preserve">Así. Con la primera a larga y la segunda cayendo. Como se le dice a una niña que ha vuelto a manchar el mantel. Se me erizó la nuca. No era el nombre. Era la manera.</w:t>
+      </w:r>
+    </w:p>
+    <w:p>
+      <w:pPr>
+        <w:pStyle w:val="BodyText"/>
+      </w:pPr>
+      <w:r>
         <w:t xml:space="preserve">—No —dije.</w:t>
       </w:r>
     </w:p>
@@ -24577,7 +24685,7 @@
         <w:pStyle w:val="BodyText"/>
       </w:pPr>
       <w:r>
-        <w:t xml:space="preserve">—Ada…</w:t>
+        <w:t xml:space="preserve">—Aaada…</w:t>
       </w:r>
     </w:p>
     <w:p>
@@ -24602,6 +24710,14 @@
       </w:pPr>
       <w:r>
         <w:t xml:space="preserve">—No vuelvo. No quiero un café. No quiero tus cosas. —Le di una patada a la caja de cartón. Suave. Lo justo para que se deslizara hacia sus pies—. Esta me la quedo. —Levanté la carpeta—. Es mía. Siempre fue mía.</w:t>
+      </w:r>
+    </w:p>
+    <w:p>
+      <w:pPr>
+        <w:pStyle w:val="BodyText"/>
+      </w:pPr>
+      <w:r>
+        <w:t xml:space="preserve">Y al decirlo supe que también le estaba quitando lo único que había hecho bien. Me la quedé igual.</w:t>
       </w:r>
     </w:p>
     <w:p>
@@ -25544,31 +25660,111 @@
         <w:pStyle w:val="BodyText"/>
       </w:pPr>
       <w:r>
-        <w:t xml:space="preserve">Se le cayó la sonrisa. Toda. De golpe. Abrió la boca. Dio un paso atrás. Otro.</w:t>
-      </w:r>
-    </w:p>
-    <w:p>
-      <w:pPr>
-        <w:pStyle w:val="BodyText"/>
-      </w:pPr>
-      <w:r>
-        <w:t xml:space="preserve">Y echó a correr hacia su coche gris, resbalando en la hierba, cayéndose, levantándose, sin volverse.</w:t>
-      </w:r>
-    </w:p>
-    <w:p>
-      <w:pPr>
-        <w:pStyle w:val="BodyText"/>
-      </w:pPr>
-      <w:r>
-        <w:t xml:space="preserve">No me importó.</w:t>
-      </w:r>
-    </w:p>
-    <w:p>
-      <w:pPr>
-        <w:pStyle w:val="BodyText"/>
-      </w:pPr>
-      <w:r>
-        <w:t xml:space="preserve">Porque Ada ya no estaba a mi lado.</w:t>
+        <w:t xml:space="preserve">Se le cayó la sonrisa. Toda. De golpe. Dio un paso atrás.</w:t>
+      </w:r>
+    </w:p>
+    <w:p>
+      <w:pPr>
+        <w:pStyle w:val="BodyText"/>
+      </w:pPr>
+      <w:r>
+        <w:t xml:space="preserve">Y no se fue. Se quedó quieto bajo la lluvia, a dos metros, con la mano todavía abierta.</w:t>
+      </w:r>
+    </w:p>
+    <w:p>
+      <w:pPr>
+        <w:pStyle w:val="BodyText"/>
+      </w:pPr>
+      <w:r>
+        <w:t xml:space="preserve">—¿Qué eres? —dijo.</w:t>
+      </w:r>
+    </w:p>
+    <w:p>
+      <w:pPr>
+        <w:pStyle w:val="BodyText"/>
+      </w:pPr>
+      <w:r>
+        <w:t xml:space="preserve">No había rabia en la voz. Había miedo. Y otra cosa: la primera pregunta de verdad que le oí hacer.</w:t>
+      </w:r>
+    </w:p>
+    <w:p>
+      <w:pPr>
+        <w:pStyle w:val="BodyText"/>
+      </w:pPr>
+      <w:r>
+        <w:t xml:space="preserve">—Lo que ella dibujó —le dije.</w:t>
+      </w:r>
+    </w:p>
+    <w:p>
+      <w:pPr>
+        <w:pStyle w:val="BodyText"/>
+      </w:pPr>
+      <w:r>
+        <w:t xml:space="preserve">Me costó. Ya casi no tenía boca.</w:t>
+      </w:r>
+    </w:p>
+    <w:p>
+      <w:pPr>
+        <w:pStyle w:val="BodyText"/>
+      </w:pPr>
+      <w:r>
+        <w:t xml:space="preserve">Él se volvió hacia Ada. Ada estaba de rodillas a mi lado, con las manos sobre las mías, sin poder agarrarlas. La miró como se mira a una desconocida. Vi cómo lo entendía: que había vivido tres años con una mujer que dibujaba a otro hombre en los márgenes de un cuaderno, cada noche, y nunca lo había sabido. Que no la había conocido nunca.</w:t>
+      </w:r>
+    </w:p>
+    <w:p>
+      <w:pPr>
+        <w:pStyle w:val="BodyText"/>
+      </w:pPr>
+      <w:r>
+        <w:t xml:space="preserve">—Ada… —dijo.</w:t>
+      </w:r>
+    </w:p>
+    <w:p>
+      <w:pPr>
+        <w:pStyle w:val="BodyText"/>
+      </w:pPr>
+      <w:r>
+        <w:t xml:space="preserve">Ella se levantó.</w:t>
+      </w:r>
+    </w:p>
+    <w:p>
+      <w:pPr>
+        <w:pStyle w:val="BodyText"/>
+      </w:pPr>
+      <w:r>
+        <w:t xml:space="preserve">—Vete.</w:t>
+      </w:r>
+    </w:p>
+    <w:p>
+      <w:pPr>
+        <w:pStyle w:val="BodyText"/>
+      </w:pPr>
+      <w:r>
+        <w:t xml:space="preserve">No lo gritó. Lo dijo con la lluvia corriéndole por la cara, como se dice la hora.</w:t>
+      </w:r>
+    </w:p>
+    <w:p>
+      <w:pPr>
+        <w:pStyle w:val="BodyText"/>
+      </w:pPr>
+      <w:r>
+        <w:t xml:space="preserve">Él abrió la boca. La cerró.</w:t>
+      </w:r>
+    </w:p>
+    <w:p>
+      <w:pPr>
+        <w:pStyle w:val="BodyText"/>
+      </w:pPr>
+      <w:r>
+        <w:t xml:space="preserve">Y se fue. Andando hacia su coche gris, resbalando en la hierba, sin volverse.</w:t>
+      </w:r>
+    </w:p>
+    <w:p>
+      <w:pPr>
+        <w:pStyle w:val="BodyText"/>
+      </w:pPr>
+      <w:r>
+        <w:t xml:space="preserve">Ella no lo miró irse. Ya estaba corriendo.</w:t>
       </w:r>
     </w:p>
     <w:p>
@@ -26969,7 +27165,7 @@
         <w:pStyle w:val="BodyText"/>
       </w:pPr>
       <w:r>
-        <w:t xml:space="preserve">No salió corriendo, como el otro.</w:t>
+        <w:t xml:space="preserve">No se fue, como el otro.</w:t>
       </w:r>
     </w:p>
     <w:p>
@@ -27056,7 +27252,7 @@
         <w:pStyle w:val="BodyText"/>
       </w:pPr>
       <w:r>
-        <w:t xml:space="preserve">No sé qué quería decirle. Muchas cosas. Que había pasado miedo en el mar. Que se había metido en el agua por mí con un cuaderno contra el pecho, con mar de fondo, como yo me metí por ella el día de las rocas. Que el otro me había visto deshacerme y había huido, y que me alegraba. Que la quería. Que creo que la quería con una parte que no está en ningún papel.</w:t>
+        <w:t xml:space="preserve">No sé qué quería decirle. Muchas cosas. Que había pasado miedo en el mar. Que se había metido en el agua por mí con un cuaderno contra el pecho, con mar de fondo, como yo me metí por ella el día de las rocas. Que el otro me había visto deshacerme y se había ido cuando ella se lo dijo, y que me alegraba. Que la quería. Que creo que la quería con una parte que no está en ningún papel.</w:t>
       </w:r>
     </w:p>
     <w:p>
@@ -28229,6 +28425,80 @@
       </w:pPr>
       <w:r>
         <w:t xml:space="preserve">El guardia lo tecleó. Despacio. Con dos dedos. Me pidió que se lo deletreara y se lo deletreé, letra a letra, con la voz firme.</w:t>
+      </w:r>
+    </w:p>
+    <w:p>
+      <w:pPr>
+        <w:pStyle w:val="BodyText"/>
+      </w:pPr>
+      <w:r>
+        <w:t xml:space="preserve">—¿Relación con el denunciado?</w:t>
+      </w:r>
+    </w:p>
+    <w:p>
+      <w:pPr>
+        <w:pStyle w:val="BodyText"/>
+      </w:pPr>
+      <w:r>
+        <w:t xml:space="preserve">No contesté.</w:t>
+      </w:r>
+    </w:p>
+    <w:p>
+      <w:pPr>
+        <w:pStyle w:val="BodyText"/>
+      </w:pPr>
+      <w:r>
+        <w:t xml:space="preserve">Tres años. El abrigo azul. La carpeta limpia hoja por hoja.</w:t>
+      </w:r>
+      <w:r>
+        <w:t xml:space="preserve"> </w:t>
+      </w:r>
+      <w:r>
+        <w:rPr>
+          <w:iCs/>
+          <w:i/>
+        </w:rPr>
+        <w:t xml:space="preserve">Te echo de menos, Ada. Mucho.</w:t>
+      </w:r>
+    </w:p>
+    <w:p>
+      <w:pPr>
+        <w:pStyle w:val="BodyText"/>
+      </w:pPr>
+      <w:r>
+        <w:t xml:space="preserve">—Ninguna —dije.</w:t>
+      </w:r>
+    </w:p>
+    <w:p>
+      <w:pPr>
+        <w:pStyle w:val="BodyText"/>
+      </w:pPr>
+      <w:r>
+        <w:t xml:space="preserve">El guardia levantó la vista de la pantalla.</w:t>
+      </w:r>
+    </w:p>
+    <w:p>
+      <w:pPr>
+        <w:pStyle w:val="BodyText"/>
+      </w:pPr>
+      <w:r>
+        <w:t xml:space="preserve">—¿Ninguna? —Lo dijo despacio, como un aviso—. Si es su expareja, conviene que conste. Cambia las cosas.</w:t>
+      </w:r>
+    </w:p>
+    <w:p>
+      <w:pPr>
+        <w:pStyle w:val="BodyText"/>
+      </w:pPr>
+      <w:r>
+        <w:t xml:space="preserve">—Ninguna.</w:t>
+      </w:r>
+    </w:p>
+    <w:p>
+      <w:pPr>
+        <w:pStyle w:val="BodyText"/>
+      </w:pPr>
+      <w:r>
+        <w:t xml:space="preserve">Me miró un segundo más. Luego lo tecleó.</w:t>
       </w:r>
     </w:p>
     <w:p>

</xml_diff>

<commit_message>
Ada Koch I: Álvaro casi mudo en el puerto y caída de la máscara en el acantilado
Co-Authored-By: Claude Opus 5.5 <noreply@anthropic.com>
Claude-Session: https://claude.ai/code/session_01HymiadRDUPzWBtequ8tm6m
</commit_message>
<xml_diff>
--- a/ada_koch/libro_1/Los_Amantes_de_la_Espiral.docx
+++ b/ada_koch/libro_1/Los_Amantes_de_la_Espiral.docx
@@ -24557,23 +24557,23 @@
         <w:pStyle w:val="BodyText"/>
       </w:pPr>
       <w:r>
-        <w:t xml:space="preserve">—La tiraste a la basura el último invierno —dijo, con voz suave—. Una noche, a las tres. Te vi desde la ventana de la cocina. Bajé en pijama. Estaba debajo de una bolsa de cáscaras de naranja. La limpié con un trapo, hoja por hoja. La guardé en el armario, debajo de las sábanas, para que no cogiera humedad. —Me la tendió—. No te la devolví porque sabía que te daría vergüenza. Quería que un día pudieras tenerla sin tener que pedírmela. Yo te conozco.</w:t>
-      </w:r>
-    </w:p>
-    <w:p>
-      <w:pPr>
-        <w:pStyle w:val="BodyText"/>
-      </w:pPr>
-      <w:r>
-        <w:t xml:space="preserve">Yo te conozco.</w:t>
-      </w:r>
-    </w:p>
-    <w:p>
-      <w:pPr>
-        <w:pStyle w:val="BodyText"/>
-      </w:pPr>
-      <w:r>
-        <w:t xml:space="preserve">Miré la carpeta. Miré su mano sujetándola. La mano que la había sacado de la basura y la había guardado un año entero en un armario de Madrid.</w:t>
+        <w:t xml:space="preserve">No dijo nada. Me la tendió.</w:t>
+      </w:r>
+    </w:p>
+    <w:p>
+      <w:pPr>
+        <w:pStyle w:val="BodyText"/>
+      </w:pPr>
+      <w:r>
+        <w:t xml:space="preserve">Venía envuelta en una funda de almohada. Una de las nuestras, las de rayas grises, planchada. La carpeta estaba limpia. Alguien había pasado un trapo por cada hoja. Alguien había pegado con celo, por dentro, las dos esquinas rotas, con cuidado, para que no se notara.</w:t>
+      </w:r>
+    </w:p>
+    <w:p>
+      <w:pPr>
+        <w:pStyle w:val="BodyText"/>
+      </w:pPr>
+      <w:r>
+        <w:t xml:space="preserve">Yo la había tirado a la basura el último invierno, una noche, a las tres, sin saber muy bien por qué. Y él la había sacado. La había limpiado hoja por hoja. La había guardado un año entero en un armario de Madrid.</w:t>
       </w:r>
     </w:p>
     <w:p>
@@ -24589,7 +24589,7 @@
         <w:pStyle w:val="BodyText"/>
       </w:pPr>
       <w:r>
-        <w:t xml:space="preserve">Y en cuanto lo pensé supe que no era solo eso. Que también la había limpiado hoja por hoja, a las tres de la mañana, en pijama. Que las dos cosas cabían en la misma mano. Eso era lo peor.</w:t>
+        <w:t xml:space="preserve">Y en cuanto lo pensé supe que no era solo eso. Que también la había envuelto en una funda planchada. Que las dos cosas cabían en la misma mano. Eso era lo peor.</w:t>
       </w:r>
     </w:p>
     <w:p>
@@ -24605,23 +24605,15 @@
         <w:pStyle w:val="BodyText"/>
       </w:pPr>
       <w:r>
-        <w:t xml:space="preserve">Él no la soltó enseguida. La mantuvo un segundo, los dos agarrando la carpeta, mirándome a los ojos.</w:t>
-      </w:r>
-    </w:p>
-    <w:p>
-      <w:pPr>
-        <w:pStyle w:val="BodyText"/>
-      </w:pPr>
-      <w:r>
-        <w:t xml:space="preserve">Luego la soltó.</w:t>
-      </w:r>
-    </w:p>
-    <w:p>
-      <w:pPr>
-        <w:pStyle w:val="BodyText"/>
-      </w:pPr>
-      <w:r>
-        <w:t xml:space="preserve">—Siempre has tenido demasiada imaginación —dijo, bajito, solo para mí. Y miró a Iter.</w:t>
+        <w:t xml:space="preserve">Él no la soltó enseguida. La mantuvo un segundo, los dos agarrando la carpeta, mirándome a los ojos. Sonriendo.</w:t>
+      </w:r>
+    </w:p>
+    <w:p>
+      <w:pPr>
+        <w:pStyle w:val="BodyText"/>
+      </w:pPr>
+      <w:r>
+        <w:t xml:space="preserve">Luego la soltó. Y volvió a mirar a Iter. Solo eso. Lo miró a él y me miró a mí, y no hizo falta que dijera nada.</w:t>
       </w:r>
     </w:p>
     <w:p>
@@ -24749,7 +24741,23 @@
         <w:pStyle w:val="BodyText"/>
       </w:pPr>
       <w:r>
-        <w:t xml:space="preserve">—Muy bien —dijo. Recogió la caja. Se puso el abrigo de paño azul—. Como quieras. Pero esto no se queda así, Ada. Ya hablaremos.</w:t>
+        <w:t xml:space="preserve">Recogió la caja. Se puso el abrigo de paño azul y se lo abrochó entero, botón a botón, sin prisa, mirándome.</w:t>
+      </w:r>
+    </w:p>
+    <w:p>
+      <w:pPr>
+        <w:pStyle w:val="BodyText"/>
+      </w:pPr>
+      <w:r>
+        <w:t xml:space="preserve">—Hasta luego, Aaada.</w:t>
+      </w:r>
+    </w:p>
+    <w:p>
+      <w:pPr>
+        <w:pStyle w:val="BodyText"/>
+      </w:pPr>
+      <w:r>
+        <w:t xml:space="preserve">Con la primera a larga.</w:t>
       </w:r>
     </w:p>
     <w:p>
@@ -25708,15 +25716,79 @@
         <w:pStyle w:val="BodyText"/>
       </w:pPr>
       <w:r>
-        <w:t xml:space="preserve">Él se volvió hacia Ada. Ada estaba de rodillas a mi lado, con las manos sobre las mías, sin poder agarrarlas. La miró como se mira a una desconocida. Vi cómo lo entendía: que había vivido tres años con una mujer que dibujaba a otro hombre en los márgenes de un cuaderno, cada noche, y nunca lo había sabido. Que no la había conocido nunca.</w:t>
-      </w:r>
-    </w:p>
-    <w:p>
-      <w:pPr>
-        <w:pStyle w:val="BodyText"/>
-      </w:pPr>
-      <w:r>
-        <w:t xml:space="preserve">—Ada… —dijo.</w:t>
+        <w:t xml:space="preserve">Él no se movió. Luego sí. Dio un paso hacia mí. Otro. Se agachó delante, con el abrigo azul arrastrando por el barro, y alargó la mano. La misma mano. Como se acerca la mano a algo que quema.</w:t>
+      </w:r>
+    </w:p>
+    <w:p>
+      <w:pPr>
+        <w:pStyle w:val="BodyText"/>
+      </w:pPr>
+      <w:r>
+        <w:t xml:space="preserve">Me tocó el hombro. Donde me lo había tocado en el puerto.</w:t>
+      </w:r>
+    </w:p>
+    <w:p>
+      <w:pPr>
+        <w:pStyle w:val="BodyText"/>
+      </w:pPr>
+      <w:r>
+        <w:t xml:space="preserve">Su mano entró en mí. No entera. Como entra en el agua turbia: notó algo, un frío, una resistencia blanda, y luego nada. La retiró como si le hubiera mordido. Se la miró. La giró. Se miró la palma mojada como si fuera de otro.</w:t>
+      </w:r>
+    </w:p>
+    <w:p>
+      <w:pPr>
+        <w:pStyle w:val="BodyText"/>
+      </w:pPr>
+      <w:r>
+        <w:t xml:space="preserve">Luego miró al acantilado. Al sitio exacto donde había abierto la mano.</w:t>
+      </w:r>
+    </w:p>
+    <w:p>
+      <w:pPr>
+        <w:pStyle w:val="BodyText"/>
+      </w:pPr>
+      <w:r>
+        <w:t xml:space="preserve">Lo vi entenderlo. No de una vez. Por capas, como se entiende una mala noticia por teléfono. Primero se le quedó la cara en blanco. Luego se le aflojó la boca. Luego algo en los hombros, que siempre llevaba altos, cuadrados, de hombre que entra en una sala y la ocupa, se le vino abajo.</w:t>
+      </w:r>
+    </w:p>
+    <w:p>
+      <w:pPr>
+        <w:pStyle w:val="BodyText"/>
+      </w:pPr>
+      <w:r>
+        <w:t xml:space="preserve">—Lo he tirado yo —dijo. Muy bajo. No me lo decía a mí.</w:t>
+      </w:r>
+    </w:p>
+    <w:p>
+      <w:pPr>
+        <w:pStyle w:val="BodyText"/>
+      </w:pPr>
+      <w:r>
+        <w:t xml:space="preserve">Se volvió hacia Ada.</w:t>
+      </w:r>
+    </w:p>
+    <w:p>
+      <w:pPr>
+        <w:pStyle w:val="BodyText"/>
+      </w:pPr>
+      <w:r>
+        <w:t xml:space="preserve">Ada estaba de rodillas a mi lado, con las manos sobre las mías, sin poder agarrarlas. Él la miró. No era la mirada de la cocina, ni la del puerto, ni ninguna de las que yo le había visto. Era la de un niño que se ha perdido en una estación y acaba de entender que nadie va a venir a buscarlo. La miró como se mira a una desconocida. Tres años durmiendo al lado de una mujer que cada noche, en los márgenes de un cuaderno, dibujaba a otro hombre. Y él no lo había sabido nunca. No la había conocido nunca.</w:t>
+      </w:r>
+    </w:p>
+    <w:p>
+      <w:pPr>
+        <w:pStyle w:val="BodyText"/>
+      </w:pPr>
+      <w:r>
+        <w:t xml:space="preserve">Abrió la boca. Le temblaba.</w:t>
+      </w:r>
+    </w:p>
+    <w:p>
+      <w:pPr>
+        <w:pStyle w:val="BodyText"/>
+      </w:pPr>
+      <w:r>
+        <w:t xml:space="preserve">—Ada, yo…</w:t>
       </w:r>
     </w:p>
     <w:p>
@@ -25748,15 +25820,23 @@
         <w:pStyle w:val="BodyText"/>
       </w:pPr>
       <w:r>
-        <w:t xml:space="preserve">Él abrió la boca. La cerró.</w:t>
-      </w:r>
-    </w:p>
-    <w:p>
-      <w:pPr>
-        <w:pStyle w:val="BodyText"/>
-      </w:pPr>
-      <w:r>
-        <w:t xml:space="preserve">Y se fue. Andando hacia su coche gris, resbalando en la hierba, sin volverse.</w:t>
+        <w:t xml:space="preserve">Él no se movió.</w:t>
+      </w:r>
+    </w:p>
+    <w:p>
+      <w:pPr>
+        <w:pStyle w:val="BodyText"/>
+      </w:pPr>
+      <w:r>
+        <w:t xml:space="preserve">—Vete —repitió ella, más bajo.</w:t>
+      </w:r>
+    </w:p>
+    <w:p>
+      <w:pPr>
+        <w:pStyle w:val="BodyText"/>
+      </w:pPr>
+      <w:r>
+        <w:t xml:space="preserve">Se levantó como un hombre mucho más viejo. Se quedó un segundo mirando la hierba. Luego se fue, andando hacia su coche gris, resbalando, sin volverse. Sin la sonrisa. Sin la de debajo. Sin ninguna.</w:t>
       </w:r>
     </w:p>
     <w:p>

</xml_diff>

<commit_message>
Ada Koch I: reglas del dibujo trasladadas al acantilado (cap. 26) y tentación de volver antes del cuartel (cap. 29)
Co-Authored-By: Claude Opus 5.5 <noreply@anthropic.com>
Claude-Session: https://claude.ai/code/session_01HymiadRDUPzWBtequ8tm6m
</commit_message>
<xml_diff>
--- a/ada_koch/libro_1/Los_Amantes_de_la_Espiral.docx
+++ b/ada_koch/libro_1/Los_Amantes_de_la_Espiral.docx
@@ -23356,38 +23356,6 @@
         <w:pStyle w:val="FirstParagraph"/>
       </w:pPr>
       <w:r>
-        <w:t xml:space="preserve">Voy a contar las cosas como las he aprendido. No sé contarlas de otra manera.</w:t>
-      </w:r>
-    </w:p>
-    <w:p>
-      <w:pPr>
-        <w:pStyle w:val="BodyText"/>
-      </w:pPr>
-      <w:r>
-        <w:t xml:space="preserve">Lo que Ada traza en el papel, lo soy. La nariz, los ojos, las manos. Si me dibuja una sonrisa, la boca sonríe. Si me borra la boca, me quedo sin voz.</w:t>
-      </w:r>
-    </w:p>
-    <w:p>
-      <w:pPr>
-        <w:pStyle w:val="BodyText"/>
-      </w:pPr>
-      <w:r>
-        <w:t xml:space="preserve">Lo que vivo no está en el papel. El café, el frío del mar, la primera vez que me dolió algo. Eso no lo puede dibujar. Tampoco lo puede borrar. Pero si me redibuja una parte entera, esa parte vuelve como era en el papel, y lo que yo había vivido en ella se queda fuera. Como la cicatriz del alambre.</w:t>
-      </w:r>
-    </w:p>
-    <w:p>
-      <w:pPr>
-        <w:pStyle w:val="BodyText"/>
-      </w:pPr>
-      <w:r>
-        <w:t xml:space="preserve">Si el papel se moja, me mojo por dentro. Si el papel se rompe, me rompo.</w:t>
-      </w:r>
-    </w:p>
-    <w:p>
-      <w:pPr>
-        <w:pStyle w:val="BodyText"/>
-      </w:pPr>
-      <w:r>
         <w:t xml:space="preserve">Los demás me ven. La abuela me vio. La mujer verde me vio. El hombre del chubasquero me vio y me dio la mano.</w:t>
       </w:r>
     </w:p>
@@ -25636,6 +25604,46 @@
         <w:pStyle w:val="BodyText"/>
       </w:pPr>
       <w:r>
+        <w:t xml:space="preserve">Entonces lo entendí entero. Las reglas que había ido aprendiendo una a una, tragando agua, como se aprende a nadar. Me pasaron todas por delante a la vez, mientras se cumplían.</w:t>
+      </w:r>
+    </w:p>
+    <w:p>
+      <w:pPr>
+        <w:pStyle w:val="BodyText"/>
+      </w:pPr>
+      <w:r>
+        <w:t xml:space="preserve">Lo que Ada traza en el papel, lo soy. La nariz, los ojos, las manos. Si me dibuja una sonrisa, la boca sonríe. Si me borra la boca, me quedo sin voz.</w:t>
+      </w:r>
+    </w:p>
+    <w:p>
+      <w:pPr>
+        <w:pStyle w:val="BodyText"/>
+      </w:pPr>
+      <w:r>
+        <w:t xml:space="preserve">Lo que vivo no está en el papel. El café, el frío del mar, la primera vez que me dolió algo. Eso no lo puede dibujar ni borrar. Pero si me redibuja una parte entera, vuelve como era en el papel, y lo vivido se queda fuera. Como la cicatriz del alambre.</w:t>
+      </w:r>
+    </w:p>
+    <w:p>
+      <w:pPr>
+        <w:pStyle w:val="BodyText"/>
+      </w:pPr>
+      <w:r>
+        <w:t xml:space="preserve">Y si el papel se moja, me mojo por dentro. Si el papel se rompe, me rompo.</w:t>
+      </w:r>
+    </w:p>
+    <w:p>
+      <w:pPr>
+        <w:pStyle w:val="BodyText"/>
+      </w:pPr>
+      <w:r>
+        <w:t xml:space="preserve">Lo sabía desde hacía semanas. Lo que no sabía era que se sentía así.</w:t>
+      </w:r>
+    </w:p>
+    <w:p>
+      <w:pPr>
+        <w:pStyle w:val="BodyText"/>
+      </w:pPr>
+      <w:r>
         <w:t xml:space="preserve">Caí de rodillas en la hierba.</w:t>
       </w:r>
     </w:p>
@@ -28410,6 +28418,166 @@
       </w:pPr>
       <w:r>
         <w:t xml:space="preserve">—Tu abuela hace empanada. —Me miró, muy serio—. Para tres.</w:t>
+      </w:r>
+    </w:p>
+    <w:p>
+      <w:r>
+        <w:pict>
+          <v:rect style="width:0;height:1.5pt" o:hralign="center" o:hrstd="t" o:hr="t"/>
+        </w:pict>
+      </w:r>
+    </w:p>
+    <w:p>
+      <w:pPr>
+        <w:pStyle w:val="FirstParagraph"/>
+      </w:pPr>
+      <w:r>
+        <w:t xml:space="preserve">Después de comer me senté en el coche, delante del faro, con las llaves en la mano. Y no arranqué.</w:t>
+      </w:r>
+    </w:p>
+    <w:p>
+      <w:pPr>
+        <w:pStyle w:val="BodyText"/>
+      </w:pPr>
+      <w:r>
+        <w:t xml:space="preserve">Desbloqueé el móvil. Fui a los contactos bloqueados. Estaba ahí. Sin nombre. Nueve números.</w:t>
+      </w:r>
+    </w:p>
+    <w:p>
+      <w:pPr>
+        <w:pStyle w:val="BodyText"/>
+      </w:pPr>
+      <w:r>
+        <w:t xml:space="preserve">Un dedo. Eso es lo que hacía falta. Desbloquear y escribir</w:t>
+      </w:r>
+      <w:r>
+        <w:t xml:space="preserve"> </w:t>
+      </w:r>
+      <w:r>
+        <w:rPr>
+          <w:iCs/>
+          <w:i/>
+        </w:rPr>
+        <w:t xml:space="preserve">perdona</w:t>
+      </w:r>
+      <w:r>
+        <w:t xml:space="preserve">,</w:t>
+      </w:r>
+      <w:r>
+        <w:t xml:space="preserve"> </w:t>
+      </w:r>
+      <w:r>
+        <w:rPr>
+          <w:iCs/>
+          <w:i/>
+        </w:rPr>
+        <w:t xml:space="preserve">estoy muy nerviosa</w:t>
+      </w:r>
+      <w:r>
+        <w:t xml:space="preserve">,</w:t>
+      </w:r>
+      <w:r>
+        <w:t xml:space="preserve"> </w:t>
+      </w:r>
+      <w:r>
+        <w:rPr>
+          <w:iCs/>
+          <w:i/>
+        </w:rPr>
+        <w:t xml:space="preserve">ha sido todo muy raro</w:t>
+      </w:r>
+      <w:r>
+        <w:t xml:space="preserve">,</w:t>
+      </w:r>
+      <w:r>
+        <w:t xml:space="preserve"> </w:t>
+      </w:r>
+      <w:r>
+        <w:rPr>
+          <w:iCs/>
+          <w:i/>
+        </w:rPr>
+        <w:t xml:space="preserve">¿podemos hablar?</w:t>
+      </w:r>
+      <w:r>
+        <w:t xml:space="preserve"> </w:t>
+      </w:r>
+      <w:r>
+        <w:t xml:space="preserve">Y él contestaría en menos de un minuto, porque siempre contestaba en menos de un minuto. Diría que no pasaba nada. Que lo retiraba todo. Que me esperaba en A Coruña. Y yo volvería al piso de la calle Ibiza, a las sábanas de rayas grises, a las cenas con sus amigos donde todo el mundo se reía de sus chistes. Mi madre volvería a llamarme los domingos. Mi madre lo adoraba.</w:t>
+      </w:r>
+      <w:r>
+        <w:t xml:space="preserve"> </w:t>
+      </w:r>
+      <w:r>
+        <w:rPr>
+          <w:iCs/>
+          <w:i/>
+        </w:rPr>
+        <w:t xml:space="preserve">Un chico así, Ada. Con lo difícil que eres tú.</w:t>
+      </w:r>
+    </w:p>
+    <w:p>
+      <w:pPr>
+        <w:pStyle w:val="BodyText"/>
+      </w:pPr>
+      <w:r>
+        <w:t xml:space="preserve">Sería tan fácil. No porque lo quisiera. Porque me lo sabía. Porque allí sabía dónde estaba cada cosa, incluida yo.</w:t>
+      </w:r>
+    </w:p>
+    <w:p>
+      <w:pPr>
+        <w:pStyle w:val="BodyText"/>
+      </w:pPr>
+      <w:r>
+        <w:t xml:space="preserve">Me miré en el retrovisor.</w:t>
+      </w:r>
+    </w:p>
+    <w:p>
+      <w:pPr>
+        <w:pStyle w:val="BodyText"/>
+      </w:pPr>
+      <w:r>
+        <w:t xml:space="preserve">Tenía la cara hinchada de no dormir y el pelo todavía tieso de sal. Y unos ojos que no me gustaron. Los ojos de alguien que está calculando cuánto le costaría rendirse. Me vi fea. No por las ojeras. Por eso otro.</w:t>
+      </w:r>
+    </w:p>
+    <w:p>
+      <w:pPr>
+        <w:pStyle w:val="BodyText"/>
+      </w:pPr>
+      <w:r>
+        <w:t xml:space="preserve">Tuve el dedo encima del botón mucho rato.</w:t>
+      </w:r>
+    </w:p>
+    <w:p>
+      <w:pPr>
+        <w:pStyle w:val="BodyText"/>
+      </w:pPr>
+      <w:r>
+        <w:t xml:space="preserve">Luego pensé en él agachado en la hierba, mirándose la palma de la mano como si fuera de otro. Tres años a mi lado y no sabía que yo dibujaba.</w:t>
+      </w:r>
+    </w:p>
+    <w:p>
+      <w:pPr>
+        <w:pStyle w:val="BodyText"/>
+      </w:pPr>
+      <w:r>
+        <w:t xml:space="preserve">Ese hombre no sabía quién era yo. Y yo había estado a punto de volver a no saberlo tampoco.</w:t>
+      </w:r>
+    </w:p>
+    <w:p>
+      <w:pPr>
+        <w:pStyle w:val="BodyText"/>
+      </w:pPr>
+      <w:r>
+        <w:t xml:space="preserve">Cerré la lista. Guardé el móvil en la guantera. Arranqué.</w:t>
+      </w:r>
+    </w:p>
+    <w:p>
+      <w:pPr>
+        <w:pStyle w:val="BodyText"/>
+      </w:pPr>
+      <w:r>
+        <w:t xml:space="preserve">Por el camino, sin decidirlo del todo, supe lo que iba a contestar si alguien me preguntaba qué era él para mí.</w:t>
       </w:r>
     </w:p>
     <w:p>

</xml_diff>

<commit_message>
Ada Koch I: recupera las correcciones de continuidad, erratas y oficio perdidas al restaurar
La abuela calla la llegada de Klaus (cap. 2) y Ada lleva el apellido de la madre
desde que el padre se fue. Baúl, generador, lente, Lúa, cartas, seis semanas,
declaración, Hamburgo, miércoles, Cóidama, tragué, Corcubión, niño de la roca,
cuarto de alemana, ensemble, umbral, Julia, eco Fátima/Iter, cicatriz del alambre,
encabezado del cap. 23. Añade merge_acts.py.

Co-Authored-By: Claude Opus 5.5 <noreply@anthropic.com>
Claude-Session: https://claude.ai/code/session_01HymiadRDUPzWBtequ8tm6m
</commit_message>
<xml_diff>
--- a/ada_koch/libro_1/Los_Amantes_de_la_Espiral.docx
+++ b/ada_koch/libro_1/Los_Amantes_de_la_Espiral.docx
@@ -167,7 +167,7 @@
         <w:pStyle w:val="BodyText"/>
       </w:pPr>
       <w:r>
-        <w:t xml:space="preserve">Sonreí sola. Mi abuela diría que estoy tola. Que bañarse en octubre es cosa de locas y de alemanes. Como yo soy medio alemana, lo tengo medio perdonado.</w:t>
+        <w:t xml:space="preserve">Sonreí sola. Mi abuela diría que estoy tola. Que bañarse en octubre es cosa de locas y de alemanes. Como yo tengo un cuarto de alemana, lo tengo un cuarto perdonado.</w:t>
       </w:r>
     </w:p>
     <w:p>
@@ -356,7 +356,7 @@
         <w:pStyle w:val="BodyText"/>
       </w:pPr>
       <w:r>
-        <w:t xml:space="preserve">Cada noche se lanza cincuenta y una veces, cada vez con los datos un poco cambiados, para ver cuánto puede equivocarse. Se llaman iteraciones. Normalmente se separan como los hilos de una trenza deshecha. Me gusta mirarlas. Me gusta pensar que el futuro tiene cincuenta y una formas y que una sola llegará a pasar.</w:t>
+        <w:t xml:space="preserve">Cada noche se lanza cincuenta y una veces, cada vez con los datos un poco cambiados, para ver cuánto puede equivocarse. En el oficio se llaman miembros del ensemble. Yo los llamo iteraciones, desde la facultad, porque me suena a algo que vuelve. Normalmente se separan como los hilos de una trenza deshecha. Me gusta mirarlas. Me gusta pensar que el futuro tiene cincuenta y una formas y que una sola llegará a pasar.</w:t>
       </w:r>
     </w:p>
     <w:p>
@@ -1577,15 +1577,39 @@
         <w:pStyle w:val="BodyText"/>
       </w:pPr>
       <w:r>
-        <w:t xml:space="preserve">—Y vino.</w:t>
-      </w:r>
-    </w:p>
-    <w:p>
-      <w:pPr>
-        <w:pStyle w:val="BodyText"/>
-      </w:pPr>
-      <w:r>
-        <w:t xml:space="preserve">—Tres semanas después. Llamó a la puerta de casa de mis padres con una maleta de cartón y un diccionario. Mi padre casi le pega, porque pensaba que era un vendedor. —Se rió otra vez, y luego se puso seria—. Y me dijo que su casa era donde estuviera yo. Que ya había vivido bastante lejos de su casa.</w:t>
+        <w:t xml:space="preserve">—¿Y?</w:t>
+      </w:r>
+    </w:p>
+    <w:p>
+      <w:pPr>
+        <w:pStyle w:val="BodyText"/>
+      </w:pPr>
+      <w:r>
+        <w:t xml:space="preserve">Se levantó a mirar la masa.</w:t>
+      </w:r>
+    </w:p>
+    <w:p>
+      <w:pPr>
+        <w:pStyle w:val="BodyText"/>
+      </w:pPr>
+      <w:r>
+        <w:t xml:space="preserve">—Y eso ya otro día, que se me pasa la empanada.</w:t>
+      </w:r>
+    </w:p>
+    <w:p>
+      <w:pPr>
+        <w:pStyle w:val="BodyText"/>
+      </w:pPr>
+      <w:r>
+        <w:t xml:space="preserve">Siempre hace lo mismo. Llega al andén de Stuttgart, a ella sola con la maleta, y se levanta. Me lo ha contado mil veces y nunca me ha contado esa parte. Sé que él vino, porque está en la foto del aparador y porque yo me apellido Koch. Pero no sé cómo. Ni cuándo. Ni si dudó. Cuando se lo pregunto, se ríe y me dice que hay cosas que no se cuentan, que se cantan, y que yo ya no canto.</w:t>
+      </w:r>
+    </w:p>
+    <w:p>
+      <w:pPr>
+        <w:pStyle w:val="BodyText"/>
+      </w:pPr>
+      <w:r>
+        <w:t xml:space="preserve">Koch es el apellido de mi madre. Lo llevo delante desde el invierno en que mi padre se fue a Vigo. Mi madre fue al registro esa misma semana y pidió que le dieran la vuelta a mis apellidos. El de mi padre se quedó detrás, donde no se ve. No lo he echado de menos ni un día.</w:t>
       </w:r>
     </w:p>
     <w:p>
@@ -1601,7 +1625,7 @@
         <w:pStyle w:val="BodyText"/>
       </w:pPr>
       <w:r>
-        <w:t xml:space="preserve">Cuando era pequeña, pensaba que el amor era eso. Que algún día alguien cruzaría media Europa con una maleta de cartón para llamar a mi puerta. Ahora tengo treinta y dos años y ya no lo pienso. O lo pienso, pero me da vergüenza pensarlo.</w:t>
+        <w:t xml:space="preserve">Cuando era pequeña, pensaba que el amor era eso. Que algún día alguien cruzaría media Europa para llamar a mi puerta. Ahora tengo treinta y dos años y ya no lo pienso. O lo pienso, pero me da vergüenza pensarlo.</w:t>
       </w:r>
     </w:p>
     <w:p>
@@ -3282,7 +3306,7 @@
         <w:pStyle w:val="FirstParagraph"/>
       </w:pPr>
       <w:r>
-        <w:t xml:space="preserve">El barómetro de la pared, el viejo de aguja que venía con la casa, marcaba una presión que no le había visto nunca. Había caído treinta y dos milibares en veinticuatro horas. Para que una borrasca se considere explosiva bastan veinticuatro.</w:t>
+        <w:t xml:space="preserve">El barómetro de la pared, el viejo de aguja que venía con la casa, marcaba una presión que no le había visto nunca. Había caído treinta y dos milibares en veinticuatro horas. A esta latitud, para que una borrasca se considere explosiva, bastan diecinueve.</w:t>
       </w:r>
     </w:p>
     <w:p>
@@ -3739,7 +3763,7 @@
         <w:pStyle w:val="BodyText"/>
       </w:pPr>
       <w:r>
-        <w:t xml:space="preserve">Pensé en mi abuelo llamando a su puerta con una maleta de cartón.</w:t>
+        <w:t xml:space="preserve">Pensé en mi abuelo, que un día llamó a la puerta de mi abuela de una manera que ella nunca me ha querido contar.</w:t>
       </w:r>
     </w:p>
     <w:p>
@@ -4368,7 +4392,7 @@
         <w:pStyle w:val="BodyText"/>
       </w:pPr>
       <w:r>
-        <w:t xml:space="preserve">En las tres palabras del mensaje. En alguien que se sube a un coche de noche y conduce seiscientos kilómetros para llamar a mi puerta, como mi abuelo llamó a la de mi abuela con su maleta de cartón.</w:t>
+        <w:t xml:space="preserve">En las tres palabras del mensaje. En alguien que se sube a un coche de noche y conduce seiscientos kilómetros para llamar a mi puerta, como mi abuelo, de alguna manera, llamó un día a la de mi abuela.</w:t>
       </w:r>
     </w:p>
     <w:p>
@@ -5217,14 +5241,6 @@
         <w:t xml:space="preserve">Era él.</w:t>
       </w:r>
     </w:p>
-    <w:p>
-      <w:pPr>
-        <w:pStyle w:val="BodyText"/>
-      </w:pPr>
-      <w:r>
-        <w:t xml:space="preserve">Era el niño de la roca. El que se queda.</w:t>
-      </w:r>
-    </w:p>
     <w:bookmarkEnd w:id="28"/>
     <w:bookmarkEnd w:id="29"/>
     <w:bookmarkStart w:id="31" w:name="ada-5"/>
@@ -8355,7 +8371,7 @@
         <w:pStyle w:val="BodyText"/>
       </w:pPr>
       <w:r>
-        <w:t xml:space="preserve">—Cincuenta y una iteraciones. Así las llamamos. Las miras todas juntas y ves cuáles se parecen y cuáles se separan. Así sabes cuánto puedes fiarte.</w:t>
+        <w:t xml:space="preserve">—Cincuenta y una iteraciones. Así las llamo yo. Los demás dicen miembros del ensemble, que suena a orquesta. Las miras todas juntas y ves cuáles se parecen y cuáles se separan. Así sabes cuánto puedes fiarte.</w:t>
       </w:r>
     </w:p>
     <w:p>
@@ -10745,7 +10761,7 @@
         <w:pStyle w:val="BodyText"/>
       </w:pPr>
       <w:r>
-        <w:t xml:space="preserve">No era grande. Era una ola de fondo, de esas que deja el temporal, que se levanta de la nada en una cala tranquila. Me pilló de lado, me hundió, me revolcó contra la arena. Tragé agua. Salí tosiendo, riendo, con el pelo en la cara, perfectamente bien.</w:t>
+        <w:t xml:space="preserve">No era grande. Era una ola de fondo, de esas que deja el temporal, que se levanta de la nada en una cala tranquila. Me pilló de lado, me hundió, me revolcó contra la arena. Tragué agua. Salí tosiendo, riendo, con el pelo en la cara, perfectamente bien.</w:t>
       </w:r>
     </w:p>
     <w:p>
@@ -11287,7 +11303,7 @@
         <w:pStyle w:val="BodyText"/>
       </w:pPr>
       <w:r>
-        <w:t xml:space="preserve">Me reí tanto que tragé agua.</w:t>
+        <w:t xml:space="preserve">Me reí tanto que tragué agua.</w:t>
       </w:r>
     </w:p>
     <w:p>
@@ -16655,7 +16671,7 @@
         <w:pStyle w:val="BodyText"/>
       </w:pPr>
       <w:r>
-        <w:t xml:space="preserve">En las cartas. Dieciocho meses de cartas en las que yo no había escrito su nombre ni una sola vez.</w:t>
+        <w:t xml:space="preserve">En las cartas. Casi tres años de cartas en las que yo no había escrito su nombre ni una sola vez.</w:t>
       </w:r>
       <w:r>
         <w:t xml:space="preserve"> </w:t>
@@ -20833,7 +20849,7 @@
         <w:pStyle w:val="BodyText"/>
       </w:pPr>
       <w:r>
-        <w:t xml:space="preserve">—A mí me dijiste que no era real —dijo, muy bajo—. Y a él, que no es nada tuyo, se lo has dado.</w:t>
+        <w:t xml:space="preserve">—A mí me dijiste que no era real —dijo, muy bajo—. Y a él se lo cuentas.</w:t>
       </w:r>
     </w:p>
     <w:p>
@@ -22224,7 +22240,7 @@
     </w:p>
     <w:bookmarkEnd w:id="63"/>
     <w:bookmarkEnd w:id="64"/>
-    <w:bookmarkStart w:id="66" w:name="ada-22"/>
+    <w:bookmarkStart w:id="67" w:name="ada-22"/>
     <w:p>
       <w:pPr>
         <w:pStyle w:val="Heading2"/>
@@ -22691,14 +22707,13 @@
       </w:r>
     </w:p>
     <w:bookmarkEnd w:id="65"/>
-    <w:bookmarkEnd w:id="66"/>
-    <w:bookmarkStart w:id="67" w:name="ada-continúa"/>
-    <w:p>
-      <w:pPr>
-        <w:pStyle w:val="Heading2"/>
-      </w:pPr>
-      <w:r>
-        <w:t xml:space="preserve">23 · Ada (continúa)</w:t>
+    <w:bookmarkStart w:id="66" w:name="ada-el-faro-hoy"/>
+    <w:p>
+      <w:pPr>
+        <w:pStyle w:val="Heading3"/>
+      </w:pPr>
+      <w:r>
+        <w:t xml:space="preserve">Ada · El faro, hoy</w:t>
       </w:r>
     </w:p>
     <w:p>
@@ -23276,6 +23291,7 @@
         <w:t xml:space="preserve">Y le enseñó los dientes a Iter.</w:t>
       </w:r>
     </w:p>
+    <w:bookmarkEnd w:id="66"/>
     <w:bookmarkEnd w:id="67"/>
     <w:bookmarkEnd w:id="68"/>
     <w:bookmarkStart w:id="83" w:name="tercer-acto-julian"/>
@@ -23333,7 +23349,7 @@
         <w:pStyle w:val="BodyText"/>
       </w:pPr>
       <w:r>
-        <w:t xml:space="preserve">Yo he visto a esa perra tumbarse panza arriba para una desconocida en la arena. Desde la galería. Lo vi todo. Una perra así no le enseña los dientes a nadie por nada.</w:t>
+        <w:t xml:space="preserve">Ada me contó que esa perra se tumbó panza arriba para ella en la arena de la playa grande, sin conocerla de nada. Una perra así no le enseña los dientes a nadie por nada.</w:t>
       </w:r>
     </w:p>
     <w:p>
@@ -26830,7 +26846,7 @@
         <w:pStyle w:val="BodyText"/>
       </w:pPr>
       <w:r>
-        <w:t xml:space="preserve">Klaus me vio por encima de la cabeza de mi padre. Se puso todavía más rojo. Abrió el diccionario, temblando, por una página marcada con un papelito. Leyó en voz alta, despacio, con sus erres de piedra, una frase que había preparado durante tres semanas y mil quinientos kilómetros.</w:t>
+        <w:t xml:space="preserve">Klaus me vio por encima de la cabeza de mi padre. Se puso todavía más rojo. Abrió el diccionario, temblando, por una página marcada con un papelito. Leyó en voz alta, despacio, con sus erres de piedra, una frase que había preparado durante seis semanas y mil quinientos kilómetros.</w:t>
       </w:r>
     </w:p>
     <w:p>
@@ -27198,7 +27214,7 @@
         <w:pStyle w:val="BodyText"/>
       </w:pPr>
       <w:r>
-        <w:t xml:space="preserve">La cicatriz del alambre no la dibujó. No podía. Esa la borró ella misma en la torre, y no la vio volver, porque no volvió. Los cortes de las rocas tampoco. Se perdieron con la mano en la galería.</w:t>
+        <w:t xml:space="preserve">La cicatriz del alambre también la dibujó. Esa la perdí en la galería, cuando me devolvió la mano desde el papel. Ahora la dibujaba desde lo que había visto. Pequeña, en el nudillo. Y volvió. Los cortes de las rocas no: esos no los vio nunca, me los curé solo, de noche.</w:t>
       </w:r>
     </w:p>
     <w:p>
@@ -27888,7 +27904,7 @@
         <w:pStyle w:val="BodyText"/>
       </w:pPr>
       <w:r>
-        <w:t xml:space="preserve">—Hay una figura matemática —dije—. Un fractal. Se llama el conjunto de Julia. Cuando la dibujas, cambia entera según el punto del que partes. Nunca sale igual dos veces. Puedes pasarte la vida dibujándola y siempre te sorprende.</w:t>
+        <w:t xml:space="preserve">—Hay una figura matemática —dije—. Un fractal. Se llama el conjunto de Julia. Depende de un número. Cambias ese número un poquito, una cifra de nada, y sale una figura completamente distinta. Como los modelos del tiempo. Puedes pasarte la vida dibujándola y siempre te sorprende.</w:t>
       </w:r>
     </w:p>
     <w:p>
@@ -27904,7 +27920,7 @@
         <w:pStyle w:val="BodyText"/>
       </w:pPr>
       <w:r>
-        <w:t xml:space="preserve">—Tú tampoco sales igual dos veces —dije—. Llevo un mes intentando dibujarte y me sorprendes cada mañana.</w:t>
+        <w:t xml:space="preserve">—Contigo me pasa lo mismo —dije—. Cambia una cosa de nada y eres otro. Llevo un mes intentando dibujarte y me sorprendes cada mañana.</w:t>
       </w:r>
     </w:p>
     <w:p>
@@ -28139,7 +28155,7 @@
         <w:pStyle w:val="BodyText"/>
       </w:pPr>
       <w:r>
-        <w:t xml:space="preserve">—El de Madrid pasó la noche en el cuartel de Cee —dijo él, mirando al mar, como quien da el parte del tiempo—. Allanamiento. Tu abuela ya ha ido a declarar. Dicen que tienes que ir tú también, a firmar.</w:t>
+        <w:t xml:space="preserve">—El de Madrid pasó la noche en el cuartel de Cee —dijo él, mirando al mar, como quien da el parte del tiempo—. Allanamiento. Tu abuela ya ha ido a declarar lo del coche, y yo lo del eucalipto. Lo de dentro solo lo puedes contar tú. Tienes que ir a Cee.</w:t>
       </w:r>
     </w:p>
     <w:p>
@@ -28401,15 +28417,15 @@
         <w:pStyle w:val="BodyText"/>
       </w:pPr>
       <w:r>
-        <w:t xml:space="preserve">—Mañana es miércoles —dijo.</w:t>
-      </w:r>
-    </w:p>
-    <w:p>
-      <w:pPr>
-        <w:pStyle w:val="BodyText"/>
-      </w:pPr>
-      <w:r>
-        <w:t xml:space="preserve">—¿Y?</w:t>
+        <w:t xml:space="preserve">—El miércoles —dijo.</w:t>
+      </w:r>
+    </w:p>
+    <w:p>
+      <w:pPr>
+        <w:pStyle w:val="BodyText"/>
+      </w:pPr>
+      <w:r>
+        <w:t xml:space="preserve">—¿Qué pasa el miércoles?</w:t>
       </w:r>
     </w:p>
     <w:p>
@@ -28608,7 +28624,7 @@
         <w:pStyle w:val="BodyText"/>
       </w:pPr>
       <w:r>
-        <w:t xml:space="preserve">El cuartel olía a café de máquina y a papel. Un guardia joven, con gafas, me hizo sentar delante de un ordenador viejo y me leyó en voz alta la declaración de mi abuela. Allanamiento. Daños. Un cuaderno arrojado al mar desde el acantilado. Lo escribía todo con dos dedos.</w:t>
+        <w:t xml:space="preserve">El cuartel olía a café de máquina y a papel. Un guardia joven, con gafas, me hizo sentar delante de un ordenador viejo y me leyó en voz alta lo que ya tenían: mi abuela, que había visto el coche gris subir la cuesta; Brais, que lo había encontrado atascado junto al eucalipto. Luego me pidió lo mío. Se lo conté. Los tres golpes. La puerta. Un cuaderno arrojado al mar desde el acantilado. Lo escribía todo con dos dedos.</w:t>
       </w:r>
     </w:p>
     <w:p>
@@ -28810,7 +28826,7 @@
         <w:pStyle w:val="BodyText"/>
       </w:pPr>
       <w:r>
-        <w:t xml:space="preserve">Volví por la carretera de la costa con la ventanilla bajada, aunque hacía frío. No me acordé de él hasta Corcubón. Y solo para darme cuenta de que no me había acordado.</w:t>
+        <w:t xml:space="preserve">Volví por la carretera de la costa con la ventanilla bajada, aunque hacía frío. No me acordé de él hasta Corcubión. Y solo para darme cuenta de que no me había acordado.</w:t>
       </w:r>
     </w:p>
     <w:p>
@@ -28858,7 +28874,7 @@
         <w:pStyle w:val="BodyText"/>
       </w:pPr>
       <w:r>
-        <w:t xml:space="preserve">—Coidámola, alemán.</w:t>
+        <w:t xml:space="preserve">—Cóidama, alemán.</w:t>
       </w:r>
     </w:p>
     <w:p>
@@ -29216,7 +29232,7 @@
         <w:pStyle w:val="BodyText"/>
       </w:pPr>
       <w:r>
-        <w:t xml:space="preserve">Se rió. Por primera vez en tres días. Con la cabeza echada hacia atrás.</w:t>
+        <w:t xml:space="preserve">Se rió. Por primera vez en una semana. Con la cabeza echada hacia atrás.</w:t>
       </w:r>
     </w:p>
     <w:p>
@@ -29247,7 +29263,7 @@
         <w:pStyle w:val="BodyText"/>
       </w:pPr>
       <w:r>
-        <w:t xml:space="preserve">No tardó. Llevaba tres días sin dormir de verdad. Se quedó dormida en la cama de arriba con el lápiz rojo todavía en la mano y la hoja de</w:t>
+        <w:t xml:space="preserve">No tardó. Llevaba días sin dormir de verdad. Se quedó dormida en la cama de arriba con el lápiz rojo todavía en la mano y la hoja de</w:t>
       </w:r>
       <w:r>
         <w:t xml:space="preserve"> </w:t>
@@ -29279,7 +29295,7 @@
         <w:pStyle w:val="BodyText"/>
       </w:pPr>
       <w:r>
-        <w:t xml:space="preserve">El baúl de hierro estaba en el cuarto de las herramientas, debajo de la escalera de caracol. Ada lo había abierto el primer día y lo había vuelto a cerrar. Dentro había cosas de los fareros que vivieron aquí antes que ella. Una gorra. Un libro de registro con las tapas hinchadas por la humedad. Y dos manuales, en castellano antiguo, con dibujos a plumilla:</w:t>
+        <w:t xml:space="preserve">El baúl de hierro estaba arriba, en la linterna, debajo de la lámpara. El mismo donde Ada había encerrado el cuaderno con candado. Ya no tenía candado. Dentro había cosas de los fareros que vivieron aquí antes que ella. Una gorra. Un libro de registro con las tapas hinchadas por la humedad. Y dos manuales, en castellano antiguo, con dibujos a plumilla:</w:t>
       </w:r>
       <w:r>
         <w:t xml:space="preserve"> </w:t>
@@ -29339,7 +29355,7 @@
         <w:pStyle w:val="FirstParagraph"/>
       </w:pPr>
       <w:r>
-        <w:t xml:space="preserve">El generador estaba en la caseta de atrás. Oxidado. Con una capa de polvo y de nidos.</w:t>
+        <w:t xml:space="preserve">El grupo auxiliar de la lámpara estaba en la caseta de atrás. No el pequeño de la casa, el que Ada enciende cada vez que se va la luz: el otro, el grande, el que nadie había arrancado desde el ochenta y siete. Oxidado. Con una capa de polvo y de nidos.</w:t>
       </w:r>
     </w:p>
     <w:p>
@@ -29450,7 +29466,7 @@
         <w:pStyle w:val="BodyText"/>
       </w:pPr>
       <w:r>
-        <w:t xml:space="preserve">Arriba, la linterna. La lente grande, de cristal tallado en anillos, como una cebolla de vidrio del tamaño de un hombre. Ada la limpiaba los domingos con un trapo y vinagre. Decía que era la cosa más bonita que había visto nunca. Decía que nadie la había encendido desde 1987, cuando automatizaron el de Fisterra y este se quedó sin oficio.</w:t>
+        <w:t xml:space="preserve">Arriba, la linterna. La lente grande, de cristal tallado en anillos, como una cebolla de vidrio del tamaño de un hombre. Ada le había quitado la funda la semana anterior, para enseñármela. Decía que era la cosa más bonita que había visto nunca. Decía que nadie la había encendido desde 1987, cuando automatizaron el de Fisterra y este se quedó sin oficio.</w:t>
       </w:r>
     </w:p>
     <w:p>
@@ -29648,7 +29664,7 @@
         <w:pStyle w:val="FirstParagraph"/>
       </w:pPr>
       <w:r>
-        <w:t xml:space="preserve">Nos sentamos en el suelo de hierro, espalda contra espalda, como en el muelle de Hamburgo de su dibujo. El generador ronroneaba abajo. El mar respiraba. La luz giraba.</w:t>
+        <w:t xml:space="preserve">Nos sentamos en el suelo de hierro, espalda contra espalda. El generador ronroneaba abajo. El mar respiraba. La luz giraba.</w:t>
       </w:r>
     </w:p>
     <w:p>

</xml_diff>

<commit_message>
Ada Koch I: cuarta lectura — cap. 24 sin paréntesis, escena del coche ampliada, capítulo de Maruxa «La primera noche», poda de muletillas restituida, contradicciones resueltas
- Reflexión de la boca y la mano borradas pasa al cap. 28 (niebla).
- Coche: padre de Álvaro (sale del muelle), Perseidas y «Le quise», medio mensaje
  escrito y borrado, la madre, la calle Ibiza.
- Lucía: llamada con la promesa de Navidad.
- Susurro del muelle: Iter declara que lo calla. «Quieto como un dibujo».
- Álvaro sabía que dibujaba, no a quién. Fuera los cortes de las rocas en el 28.
- Apellido: el padre firma. Tercer acto rotulado «El nombre».

Co-Authored-By: Claude Opus 5.5 <noreply@anthropic.com>
Claude-Session: https://claude.ai/code/session_01HymiadRDUPzWBtequ8tm6m
</commit_message>
<xml_diff>
--- a/ada_koch/libro_1/Los_Amantes_de_la_Espiral.docx
+++ b/ada_koch/libro_1/Los_Amantes_de_la_Espiral.docx
@@ -143,7 +143,7 @@
         <w:pStyle w:val="BodyText"/>
       </w:pPr>
       <w:r>
-        <w:t xml:space="preserve">Me quedé un momento quieta bajo el edredón, escuchando. El viento todavía era suave. Las gaviotas no habían empezado. Solo se oía el mar, abajo, respirando contra las rocas con ese ritmo lento que al principio no me dejaba dormir y que ahora no sé si podría dormir sin él.</w:t>
+        <w:t xml:space="preserve">Estuve un momento quieta bajo el edredón, escuchando. El viento todavía era suave. Las gaviotas no habían empezado. Solo se oía el mar, abajo, respirando contra las rocas con ese ritmo lento que al principio no me dejaba dormir y que ahora no sé si podría dormir sin él.</w:t>
       </w:r>
     </w:p>
     <w:p>
@@ -198,7 +198,7 @@
         <w:pStyle w:val="BodyText"/>
       </w:pPr>
       <w:r>
-        <w:t xml:space="preserve">Dejé la toalla en la roca de siempre y me quité el abrigo. Debajo llevaba solo el bañador. El aire me erizó la piel entera, los brazos, la nuca, el vientre. Me quedé así un segundo, con los ojos cerrados, sintiendo cómo el cuerpo se encogía y se despertaba a la vez.</w:t>
+        <w:t xml:space="preserve">Dejé la toalla en la roca de siempre y me quité el abrigo. Debajo llevaba solo el bañador. El aire me erizó la piel entera, los brazos, la nuca, el vientre. Aguanté así un segundo, con los ojos cerrados, sintiendo cómo el cuerpo se encogía y se despertaba a la vez.</w:t>
       </w:r>
     </w:p>
     <w:p>
@@ -428,7 +428,7 @@
         <w:pStyle w:val="BodyText"/>
       </w:pPr>
       <w:r>
-        <w:t xml:space="preserve">No supe qué contestar. Lucía cambió de tema para salvarme, como siempre. Pero cuando colgamos me escribió por privado.</w:t>
+        <w:t xml:space="preserve">Me quedé callada. Lucía cambió de tema para salvarme, como siempre. Pero cuando colgamos me escribió por privado.</w:t>
       </w:r>
     </w:p>
     <w:p>
@@ -661,7 +661,7 @@
         <w:pStyle w:val="BodyText"/>
       </w:pPr>
       <w:r>
-        <w:t xml:space="preserve">Me quedé mirando la pantalla. Tres palabras, sin saludo, como si hubiéramos hablado ayer. Sentí algo en el pecho que no supe nombrar. Cansancio, quizá. O tristeza. Un año entero aprendiendo a no esperar sus mensajes, y bastaban tres palabras para que todo volviera a moverse por dentro.</w:t>
+        <w:t xml:space="preserve">Miré la pantalla. Tres palabras, sin saludo, como si hubiéramos hablado ayer. Sentí algo en el pecho. Cansancio, quizá. O tristeza. Un año entero aprendiendo a no esperar sus mensajes, y bastaban tres palabras para que todo volviera a moverse por dentro.</w:t>
       </w:r>
     </w:p>
     <w:p>
@@ -725,7 +725,7 @@
         <w:pStyle w:val="BodyText"/>
       </w:pPr>
       <w:r>
-        <w:t xml:space="preserve">Puse agua a calentar para una infusión y me quedé mirando el cazo hasta que hirvió, sin moverme, y luego apagué el fuego y no me la hice. Tenía el estómago cerrado como un puño. Ni siquiera el olor del pan que había comprado por la mañana me apetecía.</w:t>
+        <w:t xml:space="preserve">Puse agua a calentar para una infusión y miré el cazo hasta que hirvió, sin moverme, y luego apagué el fuego y no me la hice. Tenía el estómago cerrado como un puño. Ni siquiera el olor del pan que había comprado por la mañana me apetecía.</w:t>
       </w:r>
     </w:p>
     <w:p>
@@ -1275,7 +1275,7 @@
         <w:pStyle w:val="BodyText"/>
       </w:pPr>
       <w:r>
-        <w:t xml:space="preserve">Me quedé abrazada a ella un poco más de lo normal. Ella no dijo nada. Solo me dio unas palmaditas en la espalda, como cuando era pequeña y me despertaba de una pesadilla.</w:t>
+        <w:t xml:space="preserve">Me quedé abrazada a ella un poco más de lo normal. Ella solo me dio unas palmaditas en la espalda, como cuando era pequeña y me despertaba de una pesadilla.</w:t>
       </w:r>
     </w:p>
     <w:p>
@@ -1609,7 +1609,7 @@
         <w:pStyle w:val="BodyText"/>
       </w:pPr>
       <w:r>
-        <w:t xml:space="preserve">Koch es el apellido de mi madre. Lo llevo delante desde el invierno en que mi padre se fue a Vigo. Mi madre fue al registro esa misma semana y pidió que le dieran la vuelta a mis apellidos. El de mi padre se quedó detrás, donde no se ve. No lo he echado de menos ni un día.</w:t>
+        <w:t xml:space="preserve">Koch es el apellido de mi madre. Lo llevo delante desde el invierno en que mi padre se fue a Vigo. Mi madre fue al registro esa misma semana a pedir que le dieran la vuelta a mis apellidos, y mi padre firmó sin rechistar, como firmaba todo lo que lo alejaba de nosotras. El de mi padre se quedó detrás, donde no se ve. No lo he echado de menos ni un día.</w:t>
       </w:r>
     </w:p>
     <w:p>
@@ -1961,7 +1961,7 @@
         <w:pStyle w:val="BodyText"/>
       </w:pPr>
       <w:r>
-        <w:t xml:space="preserve">Hasta esa tarde. Me dio un beso en la frente, despacio, con los labios secos y cálidos, y me miró con esa cara de saber algo que yo no le había contado.</w:t>
+        <w:t xml:space="preserve">Hasta esa tarde. Me dio un beso en la frente, con los labios secos y cálidos, y me miró con esa cara de saber algo que yo no le había contado.</w:t>
       </w:r>
     </w:p>
     <w:p>
@@ -2667,7 +2667,7 @@
         <w:pStyle w:val="BodyText"/>
       </w:pPr>
       <w:r>
-        <w:t xml:space="preserve">Una tarde dibujé a un niño. No sé por qué. Un niño de mi edad, con el pelo oscuro y revuelto, sentado en una roca, mirando el mar. Yo nunca había visto el mar de verdad más que en vacaciones, en casa de la abuela. Pero lo dibujé de memoria, con sus olas pequeñas y su horizonte recto.</w:t>
+        <w:t xml:space="preserve">Una tarde dibujé a un niño. Un niño de mi edad, con el pelo oscuro y revuelto, sentado en una roca, mirando el mar. Yo nunca había visto el mar de verdad más que en vacaciones, en casa de la abuela. Pero lo dibujé de memoria, con sus olas pequeñas y su horizonte recto.</w:t>
       </w:r>
     </w:p>
     <w:p>
@@ -2802,7 +2802,7 @@
         <w:pStyle w:val="BodyText"/>
       </w:pPr>
       <w:r>
-        <w:t xml:space="preserve">Me quedé mirándolas mucho rato. Me pregunté cómo serían sobre mi piel. Si serían ásperas o suaves. Si serían lentas.</w:t>
+        <w:t xml:space="preserve">Las miré mucho rato. Me pregunté cómo serían sobre mi piel. Si serían ásperas o suaves. Si serían lentas.</w:t>
       </w:r>
     </w:p>
     <w:p>
@@ -2898,23 +2898,23 @@
         <w:pStyle w:val="BodyText"/>
       </w:pPr>
       <w:r>
-        <w:t xml:space="preserve">Pasé la yema del dedo por el borde de su mandíbula. Muy despacio, sin tocar el grafito del todo, para no emborronarlo. Fue un gesto tonto. Un gesto de niña. Pero el papel estaba tibio por la lámpara, y por un segundo, solo por un segundo, me pareció piel.</w:t>
-      </w:r>
-    </w:p>
-    <w:p>
-      <w:pPr>
-        <w:pStyle w:val="BodyText"/>
-      </w:pPr>
-      <w:r>
-        <w:t xml:space="preserve">Retiré la mano de golpe.</w:t>
-      </w:r>
-    </w:p>
-    <w:p>
-      <w:pPr>
-        <w:pStyle w:val="BodyText"/>
-      </w:pPr>
-      <w:r>
-        <w:t xml:space="preserve">Cerré el cuaderno. Me quedé con las dos manos encima de las tapas negras, como si guardara algo que pudiera escaparse.</w:t>
+        <w:t xml:space="preserve">Pasé la yema del dedo por el borde de su mandíbula. Casi sin tocar el grafito, para no emborronarlo. Fue un gesto tonto. Un gesto de niña. Pero el papel estaba tibio por la lámpara, y por un segundo, solo por un segundo, me pareció piel.</w:t>
+      </w:r>
+    </w:p>
+    <w:p>
+      <w:pPr>
+        <w:pStyle w:val="BodyText"/>
+      </w:pPr>
+      <w:r>
+        <w:t xml:space="preserve">Retiré la mano.</w:t>
+      </w:r>
+    </w:p>
+    <w:p>
+      <w:pPr>
+        <w:pStyle w:val="BodyText"/>
+      </w:pPr>
+      <w:r>
+        <w:t xml:space="preserve">Cerré el cuaderno. Dejé las dos manos encima de las tapas negras, como si guardara algo que pudiera escaparse.</w:t>
       </w:r>
     </w:p>
     <w:p>
@@ -3129,7 +3129,7 @@
         <w:pStyle w:val="BodyText"/>
       </w:pPr>
       <w:r>
-        <w:t xml:space="preserve">Yo me quedé mirando la cinta, con el corazón desbocado, y dejé pasar cuatro piezas sin revisarlas. Una de ellas, seguramente, con el agujero torcido.</w:t>
+        <w:t xml:space="preserve">Yo clavé los ojos en la cinta, con el corazón desbocado, y dejé pasar cuatro piezas sin revisarlas. Una de ellas, seguramente, con el agujero torcido.</w:t>
       </w:r>
     </w:p>
     <w:p>
@@ -3435,7 +3435,7 @@
         <w:pStyle w:val="BodyText"/>
       </w:pPr>
       <w:r>
-        <w:t xml:space="preserve">Son ciento doce escalones de caracol, de piedra gastada en el centro por cien años de fareros subiendo y bajando. Los subí despacio, con la mano en la pared fría. A medida que subía, el ruido crecía. El viento silbaba por las rendijas de la linterna, arriba del todo, como un órgano desafinado.</w:t>
+        <w:t xml:space="preserve">Son ciento doce escalones de caracol, de piedra gastada en el centro por cien años de fareros subiendo y bajando. Los subí con la mano en la pared fría. A medida que subía, el ruido crecía. El viento silbaba por las rendijas de la linterna, arriba del todo, como un órgano desafinado.</w:t>
       </w:r>
     </w:p>
     <w:p>
@@ -3483,7 +3483,7 @@
         <w:pStyle w:val="BodyText"/>
       </w:pPr>
       <w:r>
-        <w:t xml:space="preserve">Me agarré a la barandilla de hierro y me quedé mirando hasta que tuve frío en los huesos. Tenía miedo, claro. Pero era un miedo limpio. Un miedo que entendía. El mar es peligroso porque es el mar. No miente. No finge ser otra cosa.</w:t>
+        <w:t xml:space="preserve">Me agarré a la barandilla de hierro y miré hasta que tuve frío en los huesos. Tenía miedo, claro. Pero era un miedo limpio. Un miedo que entendía. El mar es peligroso porque es el mar. No miente. No finge ser otra cosa.</w:t>
       </w:r>
     </w:p>
     <w:p>
@@ -3618,15 +3618,15 @@
         <w:pStyle w:val="BodyText"/>
       </w:pPr>
       <w:r>
-        <w:t xml:space="preserve">Así que me quedé quieta, escuchando.</w:t>
-      </w:r>
-    </w:p>
-    <w:p>
-      <w:pPr>
-        <w:pStyle w:val="BodyText"/>
-      </w:pPr>
-      <w:r>
-        <w:t xml:space="preserve">En un momento dado me pareció oír una voz. Fuera, entre las ráfagas. Una voz de hombre, llamando algo. Me incorporé de golpe, con el corazón en la garganta, y contuve la respiración.</w:t>
+        <w:t xml:space="preserve">Así que no me moví. Escuché.</w:t>
+      </w:r>
+    </w:p>
+    <w:p>
+      <w:pPr>
+        <w:pStyle w:val="BodyText"/>
+      </w:pPr>
+      <w:r>
+        <w:t xml:space="preserve">En un momento dado me pareció oír una voz. Fuera, entre las ráfagas. Una voz de hombre, llamando algo. Me incorporé, con el corazón en la garganta, y contuve la respiración.</w:t>
       </w:r>
     </w:p>
     <w:p>
@@ -4102,7 +4102,7 @@
         <w:pStyle w:val="FirstParagraph"/>
       </w:pPr>
       <w:r>
-        <w:t xml:space="preserve">No sé cuánto tiempo estuve cantando. Una hora. Más.</w:t>
+        <w:t xml:space="preserve">Estuve cantando una hora. Más.</w:t>
       </w:r>
     </w:p>
     <w:p>
@@ -4225,7 +4225,7 @@
         <w:pStyle w:val="BodyText"/>
       </w:pPr>
       <w:r>
-        <w:t xml:space="preserve">No respiré. No moví ni un dedo. Me quedé en el sofá, con la manta sobre las piernas y el cuaderno apretado contra el pecho, escuchando con todo el cuerpo.</w:t>
+        <w:t xml:space="preserve">No respiré. No moví ni un dedo. Seguí en el sofá, con la manta sobre las piernas y el cuaderno apretado contra el pecho, escuchando con todo el cuerpo.</w:t>
       </w:r>
     </w:p>
     <w:p>
@@ -4265,7 +4265,7 @@
         <w:pStyle w:val="BodyText"/>
       </w:pPr>
       <w:r>
-        <w:t xml:space="preserve">Solté el aire despacio. Me reí un poco de mí misma, nerviosa.</w:t>
+        <w:t xml:space="preserve">Solté el aire. Me reí un poco de mí misma, nerviosa.</w:t>
       </w:r>
     </w:p>
     <w:p>
@@ -4431,15 +4431,15 @@
         <w:pStyle w:val="FirstParagraph"/>
       </w:pPr>
       <w:r>
-        <w:t xml:space="preserve">Cogí la linterna de la mesa. Pensé en coger también un cuchillo de la cocina y me sentí ridícula. Luego pensé que más ridículo sería no cogerlo. Al final no lo cogí. No sé por qué. Quizá porque hay cosas que sabes con el cuerpo antes que con la cabeza.</w:t>
-      </w:r>
-    </w:p>
-    <w:p>
-      <w:pPr>
-        <w:pStyle w:val="BodyText"/>
-      </w:pPr>
-      <w:r>
-        <w:t xml:space="preserve">Crucé el pasillo despacio. El suelo de madera crujía bajo mis pies descalzos. La puerta de la casa del farero es antigua, de roble macizo, con una mirilla redonda de cristal grueso a la altura de los ojos y un cerrojo de hierro que hay que empujar con las dos manos.</w:t>
+        <w:t xml:space="preserve">Cogí la linterna de la mesa. Pensé en coger también un cuchillo de la cocina y me sentí ridícula. Luego pensé que más ridículo sería no cogerlo. Al final no lo cogí. Quizá porque hay cosas que sabes con el cuerpo antes que con la cabeza.</w:t>
+      </w:r>
+    </w:p>
+    <w:p>
+      <w:pPr>
+        <w:pStyle w:val="BodyText"/>
+      </w:pPr>
+      <w:r>
+        <w:t xml:space="preserve">Crucé el pasillo. El suelo de madera crujía bajo mis pies descalzos. La puerta de la casa del farero es antigua, de roble macizo, con una mirilla redonda de cristal grueso a la altura de los ojos y un cerrojo de hierro que hay que empujar con las dos manos.</w:t>
       </w:r>
     </w:p>
     <w:p>
@@ -4527,7 +4527,7 @@
         <w:pStyle w:val="BodyText"/>
       </w:pPr>
       <w:r>
-        <w:t xml:space="preserve">No sé cuánto tiempo estuvimos así. Medio minuto. Un minuto. Una eternidad.</w:t>
+        <w:t xml:space="preserve">Estuvimos así medio minuto. Un minuto. Una eternidad.</w:t>
       </w:r>
     </w:p>
     <w:p>
@@ -4861,7 +4861,7 @@
         <w:pStyle w:val="BodyText"/>
       </w:pPr>
       <w:r>
-        <w:t xml:space="preserve">Olía a mar. A mar de noche, a sal y a frío y a algo más, algo limpio que no supe nombrar.</w:t>
+        <w:t xml:space="preserve">Olía a mar. A mar de noche, a sal y a frío y a algo más, algo limpio.</w:t>
       </w:r>
     </w:p>
     <w:p>
@@ -5020,7 +5020,7 @@
         <w:pStyle w:val="BodyText"/>
       </w:pPr>
       <w:r>
-        <w:t xml:space="preserve">Sonó la sirena del final del turno. Las chicas se levantaron de la cadena estirándose, quitándose los pañuelos del pelo, riendo por algo que había dicho una italiana. Yo me quedé un momento más, recogiendo mis cosas despacio, porque no tenía prisa por volver al barracón.</w:t>
+        <w:t xml:space="preserve">Sonó la sirena del final del turno. Las chicas se levantaron de la cadena estirándose, quitándose los pañuelos del pelo, riendo por algo que había dicho una italiana. Yo me quedé un momento más, recogiendo mis cosas, porque no tenía prisa por volver al barracón.</w:t>
       </w:r>
     </w:p>
     <w:p>
@@ -5156,7 +5156,7 @@
         <w:pStyle w:val="BodyText"/>
       </w:pPr>
       <w:r>
-        <w:t xml:space="preserve">Se quedó ahí, al otro lado de la cinta, aguantando mi risa con las orejas ardiendo. Y poco a poco, despacio, como si le costara un trabajo enorme, la comisura de su boca empezó a levantarse.</w:t>
+        <w:t xml:space="preserve">Se quedó ahí, al otro lado de la cinta, aguantando mi risa con las orejas ardiendo. Y poco a poco, como si le costara un trabajo enorme, la comisura de su boca empezó a levantarse.</w:t>
       </w:r>
     </w:p>
     <w:p>
@@ -5297,7 +5297,7 @@
         <w:pStyle w:val="BodyText"/>
       </w:pPr>
       <w:r>
-        <w:t xml:space="preserve">Él no dijo nada. Me miraba.</w:t>
+        <w:t xml:space="preserve">Él me miraba, callado.</w:t>
       </w:r>
     </w:p>
     <w:p>
@@ -5329,7 +5329,7 @@
         <w:pStyle w:val="BodyText"/>
       </w:pPr>
       <w:r>
-        <w:t xml:space="preserve">Me agaché despacio, sin dejar de mirarlo, y toqué el suelo con la punta de los dedos.</w:t>
+        <w:t xml:space="preserve">Me agaché sin dejar de mirarlo, y toqué el suelo con la punta de los dedos.</w:t>
       </w:r>
     </w:p>
     <w:p>
@@ -5591,7 +5591,7 @@
         <w:pStyle w:val="BodyText"/>
       </w:pPr>
       <w:r>
-        <w:t xml:space="preserve">La solté como si me hubiera mordido. Me quedé mirándola, colgada en la silla, goteando sobre las baldosas. Luego me obligué a respirar y colgué la camisa a su lado, sin mirarla por dentro. No quería saber.</w:t>
+        <w:t xml:space="preserve">La solté como si me hubiera mordido. La miré, colgada en la silla, goteando sobre las baldosas. Luego me obligué a respirar y colgué la camisa a su lado, sin mirarla por dentro. No quería saber.</w:t>
       </w:r>
     </w:p>
     <w:p>
@@ -5726,7 +5726,7 @@
         <w:pStyle w:val="BodyText"/>
       </w:pPr>
       <w:r>
-        <w:t xml:space="preserve">Cuando por fin lo solté, se quedó mirándose la muñeca un rato, en el sitio donde habían estado mis dedos. Luego se puso la otra mano encima, despacio, cubriendo el lugar exacto.</w:t>
+        <w:t xml:space="preserve">Cuando por fin lo solté, se quedó mirándose la muñeca un rato, en el sitio donde habían estado mis dedos. Luego se puso la otra mano encima, cubriendo el lugar exacto.</w:t>
       </w:r>
     </w:p>
     <w:p>
@@ -5997,7 +5997,7 @@
         <w:pStyle w:val="BodyText"/>
       </w:pPr>
       <w:r>
-        <w:t xml:space="preserve">Y entonces hice algo que todavía no sé de dónde saqué el valor para hacer. Alargué la mano por encima de la mesa, muy despacio, como quien acerca la mano a un animal que puede morder o puede huir. Y le toqué el dorso de la suya.</w:t>
+        <w:t xml:space="preserve">Y entonces hice algo que todavía no sé de dónde saqué el valor para hacer. Alargué la mano por encima de la mesa, muy despacio, como se acerca la mano a un animal que puede morder o puede huir. Y le toqué el dorso de la suya.</w:t>
       </w:r>
     </w:p>
     <w:p>
@@ -6021,7 +6021,7 @@
         <w:pStyle w:val="BodyText"/>
       </w:pPr>
       <w:r>
-        <w:t xml:space="preserve">Él no se movió. Solo bajó la vista hacia mi mano sobre la suya, y luego la subió hacia mí. Y en sus ojos vi algo que no supe nombrar. Algo como asombro. O como alivio.</w:t>
+        <w:t xml:space="preserve">Él no se movió. Solo bajó la vista hacia mi mano sobre la suya, y luego la subió hacia mí. Y en sus ojos vi algo como asombro. O como alivio.</w:t>
       </w:r>
     </w:p>
     <w:p>
@@ -6037,7 +6037,7 @@
         <w:pStyle w:val="BodyText"/>
       </w:pPr>
       <w:r>
-        <w:t xml:space="preserve">—¿Tienes miedo? —le pregunté. No sé por qué. Me salió así.</w:t>
+        <w:t xml:space="preserve">—¿Tienes miedo? —le pregunté. Me salió así.</w:t>
       </w:r>
     </w:p>
     <w:p>
@@ -6276,7 +6276,7 @@
         <w:pStyle w:val="BodyText"/>
       </w:pPr>
       <w:r>
-        <w:t xml:space="preserve">Él levantó la vista del horario. Me vio. Se puso rojo otra vez, desde la bufanda hasta las orejas. Y se acercó despacio, con las manos en los bolsillos del abrigo, como quien se acerca a un pájaro que puede echar a volar.</w:t>
+        <w:t xml:space="preserve">Él levantó la vista del horario. Me vio. Se puso rojo otra vez, desde la bufanda hasta las orejas. Y se acercó con las manos en los bolsillos del abrigo, como se acerca uno a un pájaro que puede echar a volar.</w:t>
       </w:r>
     </w:p>
     <w:p>
@@ -6475,7 +6475,7 @@
         <w:t xml:space="preserve"> </w:t>
       </w:r>
       <w:r>
-        <w:t xml:space="preserve">y escribí al lado, despacio, con mi letra redonda de colegio de monjas:</w:t>
+        <w:t xml:space="preserve">y escribí al lado, con mi letra redonda de colegio de monjas:</w:t>
       </w:r>
       <w:r>
         <w:t xml:space="preserve"> </w:t>
@@ -6568,7 +6568,7 @@
         <w:pStyle w:val="BodyText"/>
       </w:pPr>
       <w:r>
-        <w:t xml:space="preserve">Fátima levantó la vista de su carta a Lisboa. Me miró un rato largo, por encima de las gafas. No dijo nada, como siempre.</w:t>
+        <w:t xml:space="preserve">Fátima levantó la vista de su carta a Lisboa. Me miró un rato largo, por encima de las gafas. Callada, como siempre.</w:t>
       </w:r>
     </w:p>
     <w:p>
@@ -6690,7 +6690,7 @@
         <w:pStyle w:val="BodyText"/>
       </w:pPr>
       <w:r>
-        <w:t xml:space="preserve">Me quedé un rato sentada en la cama, con el cuaderno abierto sobre las rodillas, sin atreverme a moverme. Fuera, el viento había bajado un poco. Ya no rugía. Gemía, largo y cansado, como alguien que ha gritado toda la noche y ya no tiene voz.</w:t>
+        <w:t xml:space="preserve">Estuve un rato sentada en la cama, con el cuaderno abierto sobre las rodillas, sin atreverme a moverme. Fuera, el viento había bajado un poco. Ya no rugía. Gemía, largo y cansado, como alguien que ha gritado toda la noche y ya no tiene voz.</w:t>
       </w:r>
     </w:p>
     <w:p>
@@ -6857,7 +6857,7 @@
         <w:pStyle w:val="BodyText"/>
       </w:pPr>
       <w:r>
-        <w:t xml:space="preserve">Me quedé con la taza en el aire. Supongo que era verdad. Supongo que después de treinta y dos años de cafés por la mañana, yo olía a café. Pero nadie me lo había dicho nunca así, como quien descubre algo.</w:t>
+        <w:t xml:space="preserve">Me quedé con la taza en el aire. Supongo que era verdad. Supongo que después de treinta y dos años de cafés por la mañana, yo olía a café. Pero nadie me lo había dicho nunca así, descubriéndolo.</w:t>
       </w:r>
     </w:p>
     <w:p>
@@ -6881,7 +6881,7 @@
         <w:pStyle w:val="BodyText"/>
       </w:pPr>
       <w:r>
-        <w:t xml:space="preserve">No supe qué contestar a eso. Me escondí detrás de mi taza.</w:t>
+        <w:t xml:space="preserve">Me escondí detrás de mi taza.</w:t>
       </w:r>
     </w:p>
     <w:p>
@@ -7111,7 +7111,7 @@
         <w:pStyle w:val="BodyText"/>
       </w:pPr>
       <w:r>
-        <w:t xml:space="preserve">En cada cuaderno había una época de mi vida. Lo vi ahí, de golpe, con los cuadernos abiertos sobre la mesa como cartas de una baraja. El del año de selectividad, lleno de nubes nerviosas y de él estudiando a mi lado, con un libro abierto que nunca terminé de dibujar. El de Hamburgo, el invierno del Erasmus, con él caminando por la nieve junto al río, el cuello de la chaqueta levantado, porque yo tenía tanto frío y tanta soledad que lo dibujé conmigo. El de Madrid, el primer año, cuando todo era bonito, con él casi escondido, pequeñito, en las esquinas, como si le diera vergüenza estar.</w:t>
+        <w:t xml:space="preserve">En cada cuaderno había una época de mi vida. Lo vi ahí, con los cuadernos abiertos sobre la mesa como cartas de una baraja. El del año de selectividad, lleno de nubes nerviosas y de él estudiando a mi lado, con un libro abierto que nunca terminé de dibujar. El de Hamburgo, el invierno del Erasmus, con él caminando por la nieve junto al río, el cuello de la chaqueta levantado, porque yo tenía tanto frío y tanta soledad que lo dibujé conmigo. El de Madrid, el primer año, cuando todo era bonito, con él casi escondido, pequeñito, en las esquinas, como si le diera vergüenza estar.</w:t>
       </w:r>
     </w:p>
     <w:p>
@@ -7143,7 +7143,7 @@
         <w:pStyle w:val="BodyText"/>
       </w:pPr>
       <w:r>
-        <w:t xml:space="preserve">Él no dijo nada. Pero cuando levanté la vista, me estaba mirando a mí, no a los cuadernos. Y había algo en sus ojos que se parecía mucho a la pena.</w:t>
+        <w:t xml:space="preserve">Él calló. Pero cuando levanté la vista, me estaba mirando a mí, no a los cuadernos. Y había algo en sus ojos que se parecía mucho a la pena.</w:t>
       </w:r>
     </w:p>
     <w:p>
@@ -7199,7 +7199,7 @@
         <w:pStyle w:val="BodyText"/>
       </w:pPr>
       <w:r>
-        <w:t xml:space="preserve">Me lo dije varias veces. No me lo creí del todo.</w:t>
+        <w:t xml:space="preserve">Me lo dije varias veces. No me lo creí.</w:t>
       </w:r>
     </w:p>
     <w:p>
@@ -7322,7 +7322,7 @@
         <w:pStyle w:val="BodyText"/>
       </w:pPr>
       <w:r>
-        <w:t xml:space="preserve">Me quedé mirando mi nombre.</w:t>
+        <w:t xml:space="preserve">Miré mi nombre.</w:t>
       </w:r>
     </w:p>
     <w:p>
@@ -7802,7 +7802,7 @@
         <w:pStyle w:val="BodyText"/>
       </w:pPr>
       <w:r>
-        <w:t xml:space="preserve">Él se sentó despacio. Miró la frase. Me miró a mí. Y luego, despacio, buscando cada palabra en su cabeza como quien busca piedras en el fondo de un río, me la tradujo.</w:t>
+        <w:t xml:space="preserve">Él se sentó. Miró la frase. Me miró a mí. Y luego, despacio, buscando cada palabra en su cabeza como piedras en el fondo de un río, me la tradujo.</w:t>
       </w:r>
     </w:p>
     <w:p>
@@ -8036,7 +8036,7 @@
         <w:pStyle w:val="BodyText"/>
       </w:pPr>
       <w:r>
-        <w:t xml:space="preserve">—No. —Se llevó otra cucharada a la boca, despacio—. Es que no sabía que las cosas sabían.</w:t>
+        <w:t xml:space="preserve">—No. —Se llevó otra cucharada a la boca—. Es que no sabía que las cosas sabían.</w:t>
       </w:r>
     </w:p>
     <w:p>
@@ -8251,7 +8251,7 @@
         <w:pStyle w:val="BodyText"/>
       </w:pPr>
       <w:r>
-        <w:t xml:space="preserve">Él se colocó detrás de mí, de pie. Al principio a una distancia prudente. Luego un poco más cerca. Tan cerca que noté el calor de su cuerpo en la espalda, a través del jersey, y olí su olor. Olía a sal, a lana mojada, a algo que no supe nombrar. Algo como papel.</w:t>
+        <w:t xml:space="preserve">Él se colocó detrás de mí, de pie. Al principio a una distancia prudente. Luego un poco más cerca. Tan cerca que noté el calor de su cuerpo en la espalda, a través del jersey, y olí su olor. Olía a sal, a lana mojada. Y a algo como papel.</w:t>
       </w:r>
     </w:p>
     <w:p>
@@ -8602,7 +8602,7 @@
         <w:pStyle w:val="BodyText"/>
       </w:pPr>
       <w:r>
-        <w:t xml:space="preserve">Me quedé mirándola. Pensé que podría pasarme la vida entera mirando esa sonrisa. Y me asusté tanto de haberlo pensado que me levanté a echar leña al fuego, aunque no hacía falta.</w:t>
+        <w:t xml:space="preserve">La miré. Pensé que podría pasarme la vida entera mirando esa sonrisa. Y me asusté tanto de haberlo pensado que me levanté a echar leña al fuego, aunque no hacía falta.</w:t>
       </w:r>
     </w:p>
     <w:p>
@@ -8626,7 +8626,7 @@
         <w:pStyle w:val="BodyText"/>
       </w:pPr>
       <w:r>
-        <w:t xml:space="preserve">Lo dijo sin ansiedad. Como quien pregunta si mañana lloverá.</w:t>
+        <w:t xml:space="preserve">Lo dijo sin ansiedad.</w:t>
       </w:r>
     </w:p>
     <w:p>
@@ -8769,7 +8769,7 @@
         <w:pStyle w:val="BodyText"/>
       </w:pPr>
       <w:r>
-        <w:t xml:space="preserve">Yo dormida en el sofá, con la boca un poco abierta, probablemente, y el pelo hecho un nido. Él levantándose de su silla en la oscuridad, con la estufa casi apagada. Acercándose despacio para no despertarme. Cogiendo la manta del suelo, donde se me habría caído. Extendiéndola sobre mí. Remetiéndola bajo mis pies con esas manos grandes que yo había dibujado tantas veces y que ahora, de verdad, habían estado tan cerca.</w:t>
+        <w:t xml:space="preserve">Yo dormida en el sofá, con la boca un poco abierta, probablemente, y el pelo hecho un nido. Él levantándose de su silla en la oscuridad, con la estufa casi apagada. Acercándose de puntillas para no despertarme. Cogiendo la manta del suelo, donde se me habría caído. Extendiéndola sobre mí. Remetiéndola bajo mis pies con esas manos grandes que yo había dibujado tantas veces y que ahora, de verdad, habían estado tan cerca.</w:t>
       </w:r>
     </w:p>
     <w:p>
@@ -8793,7 +8793,7 @@
         <w:pStyle w:val="BodyText"/>
       </w:pPr>
       <w:r>
-        <w:t xml:space="preserve">Me quedé así un minuto entero, respirando ese olor, con el corazón haciéndome cosas que no le dejaba hacer desde hacía mucho tiempo.</w:t>
+        <w:t xml:space="preserve">Estuve así un minuto entero, respirando ese olor, con el corazón haciéndome cosas que no le dejaba hacer desde hacía mucho tiempo.</w:t>
       </w:r>
     </w:p>
     <w:p>
@@ -8817,7 +8817,7 @@
         <w:pStyle w:val="BodyText"/>
       </w:pPr>
       <w:r>
-        <w:t xml:space="preserve">El móvil vibró sobre la mesa. Una vez. Otra. Otra. Había vuelto la cobertura y llegaban todos los mensajes de golpe, uno detrás de otro, como pájaros que vuelven al árbol después de la tormenta.</w:t>
+        <w:t xml:space="preserve">El móvil vibró sobre la mesa. Una vez. Otra. Otra. Había vuelto la cobertura y llegaban todos los mensajes, uno detrás de otro, como pájaros que vuelven al árbol después de la tormenta.</w:t>
       </w:r>
     </w:p>
     <w:p>
@@ -8995,7 +8995,7 @@
         <w:pStyle w:val="BodyText"/>
       </w:pPr>
       <w:r>
-        <w:t xml:space="preserve">El primer sol de verdad desde octubre. Los alemanes salían a la calle como lagartijas, con las caras vueltas hacia el cielo y los ojos cerrados, y las orillas del Neckar se llenaron de familias, de bicicletas, de niños con globos. Los almendros del parque habían florecido de golpe, en una sola noche, y estaban blancos y rosas como novias.</w:t>
+        <w:t xml:space="preserve">El primer sol de verdad desde octubre. Los alemanes salían a la calle como lagartijas, con las caras vueltas hacia el cielo y los ojos cerrados, y las orillas del Neckar se llenaron de familias, de bicicletas, de niños con globos. Los almendros del parque habían florecido en una sola noche, y estaban blancos y rosas como novias.</w:t>
       </w:r>
     </w:p>
     <w:p>
@@ -9131,7 +9131,7 @@
         <w:pStyle w:val="BodyText"/>
       </w:pPr>
       <w:r>
-        <w:t xml:space="preserve">Le quité el lápiz. Escribí debajo, muy despacio, con mi letra redonda:</w:t>
+        <w:t xml:space="preserve">Le quité el lápiz. Escribí debajo, con mi letra redonda:</w:t>
       </w:r>
     </w:p>
     <w:p>
@@ -9273,7 +9273,7 @@
         <w:pStyle w:val="BodyText"/>
       </w:pPr>
       <w:r>
-        <w:t xml:space="preserve">Me quedé mirando todos esos días tachados con lápiz.</w:t>
+        <w:t xml:space="preserve">Miré todos esos días tachados con lápiz.</w:t>
       </w:r>
     </w:p>
     <w:p>
@@ -9342,7 +9342,7 @@
         <w:pStyle w:val="BodyText"/>
       </w:pPr>
       <w:r>
-        <w:t xml:space="preserve">De noche, con las velas y la tormenta, podía ser un sueño. De día tenía poros. Tenía una barba de dos días que le sombreaba la mandíbula, que yo no le había dibujado nunca. Tenía los ojos un poco hinchados, como quien ha dormido mal. Tenía una mancha de ceniza en la manga, de la estufa.</w:t>
+        <w:t xml:space="preserve">De noche, con las velas y la tormenta, podía ser un sueño. De día tenía poros. Tenía una barba de dos días que le sombreaba la mandíbula, que yo no le había dibujado nunca. Tenía los ojos un poco hinchados, de haber dormido mal. Tenía una mancha de ceniza en la manga, de la estufa.</w:t>
       </w:r>
     </w:p>
     <w:p>
@@ -9358,7 +9358,7 @@
         <w:pStyle w:val="BodyText"/>
       </w:pPr>
       <w:r>
-        <w:t xml:space="preserve">Me quedé mirándola mucho rato.</w:t>
+        <w:t xml:space="preserve">La miré mucho rato.</w:t>
       </w:r>
     </w:p>
     <w:p>
@@ -9509,15 +9509,15 @@
         <w:pStyle w:val="BodyText"/>
       </w:pPr>
       <w:r>
-        <w:t xml:space="preserve">Miró sus pies. Asintió, despacio, como si eso fuera una razón de verdad. Me sentí un poco miserable.</w:t>
-      </w:r>
-    </w:p>
-    <w:p>
-      <w:pPr>
-        <w:pStyle w:val="BodyText"/>
-      </w:pPr>
-      <w:r>
-        <w:t xml:space="preserve">Cogí el bolso, las llaves del coche, la lista que había hecho en el dorso de un sobre. Y entonces me quedé parada en la puerta, mirando el cuaderno sobre la mesa de la cocina.</w:t>
+        <w:t xml:space="preserve">Miró sus pies. Asintió, como si eso fuera una razón de verdad. Me sentí un poco miserable.</w:t>
+      </w:r>
+    </w:p>
+    <w:p>
+      <w:pPr>
+        <w:pStyle w:val="BodyText"/>
+      </w:pPr>
+      <w:r>
+        <w:t xml:space="preserve">Cogí el bolso, las llaves del coche, la lista que había hecho en el dorso de un sobre. Y entonces me paré en la puerta, mirando el cuaderno sobre la mesa de la cocina.</w:t>
       </w:r>
     </w:p>
     <w:p>
@@ -9746,7 +9746,7 @@
         <w:pStyle w:val="BodyText"/>
       </w:pPr>
       <w:r>
-        <w:t xml:space="preserve">Cuando aparqué delante del faro, no me bajé enseguida. Me quedé con las manos en el volante, mirando la puerta de roble.</w:t>
+        <w:t xml:space="preserve">Cuando aparqué delante del faro, no me bajé enseguida. Seguí con las manos en el volante, mirando la puerta de roble.</w:t>
       </w:r>
     </w:p>
     <w:p>
@@ -10276,15 +10276,15 @@
         <w:pStyle w:val="BodyText"/>
       </w:pPr>
       <w:r>
-        <w:t xml:space="preserve">Eso también era nuevo. Que durmiera. La segunda noche se quedó dormido sentado, con la cabeza contra el respaldo de la silla, y yo le puse la manta encima y él no se despertó. Respiraba despacio, con la boca un poco abierta. Tenía las pestañas larguísimas.</w:t>
-      </w:r>
-    </w:p>
-    <w:p>
-      <w:pPr>
-        <w:pStyle w:val="BodyText"/>
-      </w:pPr>
-      <w:r>
-        <w:t xml:space="preserve">No se lo dije a nadie, pero me quedé un buen rato mirándolo dormir.</w:t>
+        <w:t xml:space="preserve">Eso también era nuevo. Que durmiera. La segunda noche se quedó dormido sentado, con la cabeza contra el respaldo de la silla, y yo le puse la manta encima y él no se despertó. Respiraba con la boca un poco abierta. Tenía las pestañas larguísimas.</w:t>
+      </w:r>
+    </w:p>
+    <w:p>
+      <w:pPr>
+        <w:pStyle w:val="BodyText"/>
+      </w:pPr>
+      <w:r>
+        <w:t xml:space="preserve">No se lo dije a nadie, pero estuve un buen rato mirándolo dormir.</w:t>
       </w:r>
     </w:p>
     <w:p>
@@ -10315,7 +10315,7 @@
         <w:pStyle w:val="FirstParagraph"/>
       </w:pPr>
       <w:r>
-        <w:t xml:space="preserve">Se puso las zapatillas nuevas con una ceremonia que me dio risa. Se las ató y se las desató tres veces, probando distintos nudos, hasta que le enseñé el de toda la vida. Luego dio unos pasos por la cocina, muy despacio, mirándose los pies como si caminara sobre algo que pudiera romperse.</w:t>
+        <w:t xml:space="preserve">Se puso las zapatillas nuevas con una ceremonia que me dio risa. Se las ató y se las desató tres veces, probando distintos nudos, hasta que le enseñé el de toda la vida. Luego dio unos pasos por la cocina, mirándose los pies como si caminara sobre algo que pudiera romperse.</w:t>
       </w:r>
     </w:p>
     <w:p>
@@ -10578,7 +10578,7 @@
         <w:pStyle w:val="BodyText"/>
       </w:pPr>
       <w:r>
-        <w:t xml:space="preserve">Lo dijo tan tranquilo. Tan claro. Me quedé con la boca abierta.</w:t>
+        <w:t xml:space="preserve">Lo dijo tan tranquilo. Tan claro. Lo miré con la boca abierta.</w:t>
       </w:r>
     </w:p>
     <w:p>
@@ -10626,7 +10626,7 @@
         <w:pStyle w:val="BodyText"/>
       </w:pPr>
       <w:r>
-        <w:t xml:space="preserve">Se me escapó. Me di cuenta en cuanto lo dije. Él me miró por primera vez desde que habíamos llegado a la cala. Con algo en los ojos que no supe leer.</w:t>
+        <w:t xml:space="preserve">Se me escapó. Me di cuenta en cuanto lo dije. Él me miró por primera vez desde que habíamos llegado a la cala. Con algo nuevo en los ojos.</w:t>
       </w:r>
     </w:p>
     <w:p>
@@ -10864,7 +10864,7 @@
         <w:pStyle w:val="BodyText"/>
       </w:pPr>
       <w:r>
-        <w:t xml:space="preserve">El frío, el susto, la tensión, todo se me salió de golpe en una carcajada que resonó en toda la cala. Él me miró reírme con la cara ofendida, con el pelo pegado a la frente y las cejas juntas, y eso me hizo reír todavía más.</w:t>
+        <w:t xml:space="preserve">El frío, el susto, la tensión, todo se me salió en una carcajada que resonó en toda la cala. Él me miró reírme con la cara ofendida, con el pelo pegado a la frente y las cejas juntas, y eso me hizo reír todavía más.</w:t>
       </w:r>
     </w:p>
     <w:p>
@@ -10960,7 +10960,7 @@
         <w:pStyle w:val="BodyText"/>
       </w:pPr>
       <w:r>
-        <w:t xml:space="preserve">Yo me quedé un rato más en el agua.</w:t>
+        <w:t xml:space="preserve">Yo seguí un rato más en el agua.</w:t>
       </w:r>
     </w:p>
     <w:p>
@@ -11483,7 +11483,7 @@
         <w:pStyle w:val="BodyText"/>
       </w:pPr>
       <w:r>
-        <w:t xml:space="preserve">No supe qué contestar. Me levanté y me metí en la ducha, y cuando salí él estaba junto a la ventana, de espaldas, y no se dio la vuelta cuando me despedí.</w:t>
+        <w:t xml:space="preserve">Me levanté y me metí en la ducha, y cuando salí él estaba junto a la ventana, de espaldas, y no se dio la vuelta cuando me despedí.</w:t>
       </w:r>
     </w:p>
     <w:p>
@@ -11769,7 +11769,7 @@
         <w:pStyle w:val="BodyText"/>
       </w:pPr>
       <w:r>
-        <w:t xml:space="preserve">Él lo recogió todo, despacio, y lo metió de nuevo en la bolsa. No dijo nada. Pero cuando me la devolvió, me miró a los ojos con una media sonrisa que no supe interpretar.</w:t>
+        <w:t xml:space="preserve">Él lo recogió todo y lo metió de nuevo en la bolsa. Pero cuando me la devolvió, me miró a los ojos con media sonrisa.</w:t>
       </w:r>
     </w:p>
     <w:p>
@@ -12084,7 +12084,7 @@
         <w:pStyle w:val="BodyText"/>
       </w:pPr>
       <w:r>
-        <w:t xml:space="preserve">Me miró un momento más. Luego abrió la puerta del copiloto y se sentó. Se puso el cinturón, despacio, con cuidado, como le había enseñado.</w:t>
+        <w:t xml:space="preserve">Me miró un momento más. Luego abrió la puerta del copiloto y se sentó. Se puso el cinturón con cuidado, como le había enseñado.</w:t>
       </w:r>
     </w:p>
     <w:p>
@@ -12172,7 +12172,7 @@
         <w:pStyle w:val="BodyText"/>
       </w:pPr>
       <w:r>
-        <w:t xml:space="preserve">Iter asintió, despacio. Abrió la puerta. Se bajó.</w:t>
+        <w:t xml:space="preserve">Iter asintió. Abrió la puerta. Se bajó.</w:t>
       </w:r>
     </w:p>
     <w:p>
@@ -12582,7 +12582,7 @@
         <w:pStyle w:val="BodyText"/>
       </w:pPr>
       <w:r>
-        <w:t xml:space="preserve">Dejó el táper de filloas en la mesa, junto a la caja de tiritas. Miró la caja. No dijo nada.</w:t>
+        <w:t xml:space="preserve">Dejó el táper de filloas en la mesa, junto a la caja de tiritas. Miró la caja.</w:t>
       </w:r>
     </w:p>
     <w:p>
@@ -12598,7 +12598,7 @@
         <w:pStyle w:val="BodyText"/>
       </w:pPr>
       <w:r>
-        <w:t xml:space="preserve">Se secó las manos con el trapo, despacio, dedo por dedo. Se sentó en la silla que estaba más cerca de la estufa. La de él.</w:t>
+        <w:t xml:space="preserve">Se secó las manos con el trapo, dedo por dedo. Se sentó en la silla que estaba más cerca de la estufa. La de él.</w:t>
       </w:r>
     </w:p>
     <w:p>
@@ -12773,7 +12773,7 @@
         <w:pStyle w:val="BodyText"/>
       </w:pPr>
       <w:r>
-        <w:t xml:space="preserve">Me quedé en la puerta hasta que la furgoneta desapareció en la curva. Luego me apoyé en el marco y cerré los ojos.</w:t>
+        <w:t xml:space="preserve">Esperé en la puerta hasta que la furgoneta desapareció en la curva. Luego me apoyé en el marco y cerré los ojos.</w:t>
       </w:r>
     </w:p>
     <w:p>
@@ -13317,7 +13317,7 @@
         <w:pStyle w:val="FirstParagraph"/>
       </w:pPr>
       <w:r>
-        <w:t xml:space="preserve">No sé cuánto tiempo estuvimos callados. Yo sentada, él de pie. La estufa crepitando. El mar abajo.</w:t>
+        <w:t xml:space="preserve">Estuvimos callados mucho rato. Yo sentada, él de pie. La estufa crepitando. El mar abajo.</w:t>
       </w:r>
     </w:p>
     <w:p>
@@ -13941,7 +13941,7 @@
         <w:pStyle w:val="BodyText"/>
       </w:pPr>
       <w:r>
-        <w:t xml:space="preserve">Alrededor del sol había un anillo. Muy tenue, casi invisible, un círculo perfecto de luz blanquecina con un borde rojizo por dentro, como un aro de bruma. Un halo. Detrás, el cielo no era azul del todo. Tenía un velo lechoso, finísimo, que yo no había visto.</w:t>
+        <w:t xml:space="preserve">Alrededor del sol había un anillo. Muy tenue, casi invisible, un círculo perfecto de luz blanquecina con un borde rojizo por dentro, como un aro de bruma. Un halo. Detrás, el cielo no era azul limpio. Tenía un velo lechoso, finísimo, que yo no había visto.</w:t>
       </w:r>
     </w:p>
     <w:p>
@@ -14113,7 +14113,7 @@
         <w:pStyle w:val="BodyText"/>
       </w:pPr>
       <w:r>
-        <w:t xml:space="preserve">No sé por qué. Quizá para recuperar terreno. Le saqué el atlas internacional, el de verdad, el que me regaló mi abuelo cuando entré en la facultad, con fotos en blanco y negro y nombres en latín. Nos sentamos en el sofá con el libro sobre las rodillas de los dos.</w:t>
+        <w:t xml:space="preserve">Quizá para recuperar terreno. Le saqué el atlas internacional, el de verdad, el que me regaló mi abuelo cuando entré en la facultad, con fotos en blanco y negro y nombres en latín. Nos sentamos en el sofá con el libro sobre las rodillas de los dos.</w:t>
       </w:r>
     </w:p>
     <w:p>
@@ -14355,7 +14355,7 @@
         <w:pStyle w:val="BodyText"/>
       </w:pPr>
       <w:r>
-        <w:t xml:space="preserve">Me quedé en la cama con los ojos abiertos, escuchándolo, sin poder creérmelo.</w:t>
+        <w:t xml:space="preserve">Seguí en la cama con los ojos abiertos, escuchándolo, sin poder creérmelo.</w:t>
       </w:r>
     </w:p>
     <w:p>
@@ -14570,7 +14570,7 @@
         <w:pStyle w:val="BodyText"/>
       </w:pPr>
       <w:r>
-        <w:t xml:space="preserve">Iter no dijo nada durante un rato. Luego alargó la mano por encima de la mesa y la puso sobre el cuaderno negro, que estaba cerrado entre los dos.</w:t>
+        <w:t xml:space="preserve">Iter tardó en contestar. Luego alargó la mano por encima de la mesa y la puso sobre el cuaderno negro, que estaba cerrado entre los dos.</w:t>
       </w:r>
     </w:p>
     <w:p>
@@ -14737,7 +14737,7 @@
         <w:pStyle w:val="BodyText"/>
       </w:pPr>
       <w:r>
-        <w:t xml:space="preserve">Dejó el cuchillo y el tenedor en el plato, muy despacio, en paralelo, como hacía siempre. Miró a su madre a los ojos.</w:t>
+        <w:t xml:space="preserve">Dejó el cuchillo y el tenedor en el plato, en paralelo, como hacía siempre. Miró a su madre a los ojos.</w:t>
       </w:r>
     </w:p>
     <w:p>
@@ -15054,7 +15054,7 @@
         <w:pStyle w:val="BodyText"/>
       </w:pPr>
       <w:r>
-        <w:t xml:space="preserve">Me di la vuelta de golpe.</w:t>
+        <w:t xml:space="preserve">Me di la vuelta.</w:t>
       </w:r>
     </w:p>
     <w:p>
@@ -15078,7 +15078,7 @@
         <w:pStyle w:val="BodyText"/>
       </w:pPr>
       <w:r>
-        <w:t xml:space="preserve">Me quedé un buen rato con el corazón golpeándome las costillas, mirando el reflejo. Luego me reí de mí misma, bajito. Una nube. Un defecto del cristal. Las nueve horas de sueño que no había dormido en toda la semana.</w:t>
+        <w:t xml:space="preserve">Estuve un buen rato con el corazón golpeándome las costillas, mirando el reflejo. Luego me reí de mí misma, bajito. Una nube. Un defecto del cristal. Las nueve horas de sueño que no había dormido en toda la semana.</w:t>
       </w:r>
     </w:p>
     <w:p>
@@ -15306,7 +15306,7 @@
         <w:pStyle w:val="BodyText"/>
       </w:pPr>
       <w:r>
-        <w:t xml:space="preserve">No supe qué decirle.</w:t>
+        <w:t xml:space="preserve">Me quedé muda.</w:t>
       </w:r>
     </w:p>
     <w:p>
@@ -15731,7 +15731,7 @@
         <w:pStyle w:val="BodyText"/>
       </w:pPr>
       <w:r>
-        <w:t xml:space="preserve">No se rió. Me apartó la sábana de la cara, despacio, con un dedo, como quien aparta una cortina.</w:t>
+        <w:t xml:space="preserve">No se rió. Me apartó la sábana de la cara con un dedo.</w:t>
       </w:r>
     </w:p>
     <w:p>
@@ -15763,7 +15763,7 @@
         <w:pStyle w:val="BodyText"/>
       </w:pPr>
       <w:r>
-        <w:t xml:space="preserve">No supe qué decir. Me quedé muy quieta, dejándome mirar, mientras la luz de la ventana iba pasando de gris a blanca y los tranvías empezaban a sonar en la calle.</w:t>
+        <w:t xml:space="preserve">Me quedé muy quieta, dejándome mirar, mientras la luz de la ventana iba pasando de gris a blanca y los tranvías empezaban a sonar en la calle.</w:t>
       </w:r>
     </w:p>
     <w:p>
@@ -16018,7 +16018,7 @@
         <w:pStyle w:val="BodyText"/>
       </w:pPr>
       <w:r>
-        <w:t xml:space="preserve">Me quedé mirando la pregunta. El cursor parpadeando.</w:t>
+        <w:t xml:space="preserve">Miré la pregunta. El cursor parpadeando.</w:t>
       </w:r>
     </w:p>
     <w:p>
@@ -16150,7 +16150,7 @@
         <w:pStyle w:val="BodyText"/>
       </w:pPr>
       <w:r>
-        <w:t xml:space="preserve">No supe qué contestar a eso. Apagué el móvil.</w:t>
+        <w:t xml:space="preserve">Apagué el móvil.</w:t>
       </w:r>
     </w:p>
     <w:p>
@@ -16727,7 +16727,7 @@
         <w:pStyle w:val="BodyText"/>
       </w:pPr>
       <w:r>
-        <w:t xml:space="preserve">—No es que no —dije deprisa, cogiéndole la mano—. No es no. Es todavía no.</w:t>
+        <w:t xml:space="preserve">—Todavía no —dije deprisa, cogiéndole la mano.</w:t>
       </w:r>
     </w:p>
     <w:p>
@@ -16743,7 +16743,7 @@
         <w:pStyle w:val="BodyText"/>
       </w:pPr>
       <w:r>
-        <w:t xml:space="preserve">Él se quedó mirando el anillo en su palma mucho rato. Luego lo metió en el bolsillo del abrigo, con mucho cuidado, como quien guarda algo para más tarde.</w:t>
+        <w:t xml:space="preserve">Él se quedó mirando el anillo en su palma mucho rato. Luego lo metió en el bolsillo del abrigo, con mucho cuidado.</w:t>
       </w:r>
     </w:p>
     <w:p>
@@ -16865,7 +16865,7 @@
         <w:pStyle w:val="BodyText"/>
       </w:pPr>
       <w:r>
-        <w:t xml:space="preserve">Iter lo miraba con la frente arrugada, con los codos en la mesa y las manos en las sienes, como quien intenta resolver un problema de matemáticas.</w:t>
+        <w:t xml:space="preserve">Iter lo miraba con la frente arrugada, con los codos en la mesa y las manos en las sienes, como un niño delante de un problema de matemáticas.</w:t>
       </w:r>
     </w:p>
     <w:p>
@@ -16913,7 +16913,7 @@
         <w:pStyle w:val="BodyText"/>
       </w:pPr>
       <w:r>
-        <w:t xml:space="preserve">—Aquí. —Pasó las páginas hacia atrás, despacio—. Y aquí. Y aquí. En todas me miras. Bueno. En todas te miro. Con esta cara. —Señaló sus propios ojos en el papel—. ¿La dibujaste así para que te quisiera?</w:t>
+        <w:t xml:space="preserve">—Aquí. —Pasó las páginas hacia atrás—. Y aquí. Y aquí. En todas me miras. Bueno. En todas te miro. Con esta cara. —Señaló sus propios ojos en el papel—. ¿La dibujaste así para que te quisiera?</w:t>
       </w:r>
     </w:p>
     <w:p>
@@ -17048,7 +17048,7 @@
         <w:pStyle w:val="BodyText"/>
       </w:pPr>
       <w:r>
-        <w:t xml:space="preserve">Me quedé mirando sus nudillos. Los mismos que yo le había dibujado tantas veces, marcados, de alguien que sabe hacer cosas. Ahora tenían una cicatriz pequeña, del alambre de la contraventana. Esa no era mía.</w:t>
+        <w:t xml:space="preserve">Miré sus nudillos. Los mismos que yo le había dibujado tantas veces, marcados, de alguien que sabe hacer cosas. Ahora tenían una cicatriz pequeña, del alambre de la contraventana. Esa no era mía.</w:t>
       </w:r>
     </w:p>
     <w:p>
@@ -18068,7 +18068,7 @@
         <w:pStyle w:val="FirstParagraph"/>
       </w:pPr>
       <w:r>
-        <w:t xml:space="preserve">Subí los ciento doce escalones despacio. Cuando llegué arriba, él seguía mirando la carretera por donde se había ido la furgoneta.</w:t>
+        <w:t xml:space="preserve">Subí los ciento doce escalones. Cuando llegué arriba, él seguía mirando la carretera por donde se había ido la furgoneta.</w:t>
       </w:r>
     </w:p>
     <w:p>
@@ -18084,7 +18084,7 @@
         <w:pStyle w:val="BodyText"/>
       </w:pPr>
       <w:r>
-        <w:t xml:space="preserve">Iter no dijo nada durante un rato.</w:t>
+        <w:t xml:space="preserve">Iter tardó en hablar.</w:t>
       </w:r>
     </w:p>
     <w:p>
@@ -18124,7 +18124,7 @@
         <w:pStyle w:val="BodyText"/>
       </w:pPr>
       <w:r>
-        <w:t xml:space="preserve">Asintió, despacio. Siguió mirando la carretera vacía.</w:t>
+        <w:t xml:space="preserve">Asintió. Siguió mirando la carretera vacía.</w:t>
       </w:r>
     </w:p>
     <w:p>
@@ -18140,7 +18140,7 @@
         <w:pStyle w:val="BodyText"/>
       </w:pPr>
       <w:r>
-        <w:t xml:space="preserve">Lo dijo sin celos. Sin rabia. Lo dijo como quien constata un hecho. Como quien dice que mañana va a llover.</w:t>
+        <w:t xml:space="preserve">Lo dijo sin celos. Sin rabia. Lo dijo como quien constata un hecho.</w:t>
       </w:r>
     </w:p>
     <w:p>
@@ -18427,7 +18427,7 @@
         <w:pStyle w:val="BodyText"/>
       </w:pPr>
       <w:r>
-        <w:t xml:space="preserve">Me quedé sentada en el borde de la bañera con el móvil en la mano.</w:t>
+        <w:t xml:space="preserve">Seguí sentada en el borde de la bañera con el móvil en la mano.</w:t>
       </w:r>
     </w:p>
     <w:p>
@@ -18451,7 +18451,7 @@
         <w:pStyle w:val="BodyText"/>
       </w:pPr>
       <w:r>
-        <w:t xml:space="preserve">No sé cuánto tiempo estuve allí. Lo suficiente para que las piernas se me durmieran. Lo suficiente para que, cuando me levanté, tuviera que agarrarme al lavabo.</w:t>
+        <w:t xml:space="preserve">Estuve allí lo suficiente para que las piernas se me durmieran. Lo suficiente para que, cuando me levanté, tuviera que agarrarme al lavabo.</w:t>
       </w:r>
     </w:p>
     <w:p>
@@ -19751,7 +19751,7 @@
         <w:pStyle w:val="BodyText"/>
       </w:pPr>
       <w:r>
-        <w:t xml:space="preserve">Yo me quedé sentada junto a la cocina de hierro, con su jersey, con Lúa a mis pies, temblando.</w:t>
+        <w:t xml:space="preserve">Yo esperé sentada junto a la cocina de hierro, con su jersey, con Lúa a mis pies, temblando.</w:t>
       </w:r>
     </w:p>
     <w:p>
@@ -19790,7 +19790,7 @@
         <w:pStyle w:val="FirstParagraph"/>
       </w:pPr>
       <w:r>
-        <w:t xml:space="preserve">Volvió con ropa seca y el pelo revuelto. No dijo nada. Puso agua a calentar. Hizo café en una cafetera italiana, mucho más fuerte que el mío. Le echó un chorro de orujo de una botella sin etiqueta.</w:t>
+        <w:t xml:space="preserve">Volvió con ropa seca y el pelo revuelto. Puso agua a calentar. Hizo café en una cafetera italiana, mucho más fuerte que el mío. Le echó un chorro de orujo de una botella sin etiqueta.</w:t>
       </w:r>
     </w:p>
     <w:p>
@@ -19830,7 +19830,7 @@
         <w:pStyle w:val="BodyText"/>
       </w:pPr>
       <w:r>
-        <w:t xml:space="preserve">—Has perdido la rasqueta —dije. No sé por qué dije eso.</w:t>
+        <w:t xml:space="preserve">—Has perdido la rasqueta —dije. Fue lo primero que me salió.</w:t>
       </w:r>
     </w:p>
     <w:p>
@@ -19989,7 +19989,7 @@
         <w:pStyle w:val="BodyText"/>
       </w:pPr>
       <w:r>
-        <w:t xml:space="preserve">Él no dijo nada durante un rato largo. Miró el fuego por la portezuela de la cocina de hierro. Lúa suspiró en sueños.</w:t>
+        <w:t xml:space="preserve">Él guardó silencio un rato largo. Miró el fuego por la portezuela de la cocina de hierro. Lúa suspiró en sueños.</w:t>
       </w:r>
     </w:p>
     <w:p>
@@ -20112,7 +20112,7 @@
         <w:pStyle w:val="BodyText"/>
       </w:pPr>
       <w:r>
-        <w:t xml:space="preserve">Me quedé mirando la nota.</w:t>
+        <w:t xml:space="preserve">Miré la nota.</w:t>
       </w:r>
     </w:p>
     <w:p>
@@ -20248,7 +20248,7 @@
         <w:pStyle w:val="BodyText"/>
       </w:pPr>
       <w:r>
-        <w:t xml:space="preserve">Entré. Me quedé de pie en mitad del cuarto.</w:t>
+        <w:t xml:space="preserve">Entré. Me planté en mitad del cuarto.</w:t>
       </w:r>
     </w:p>
     <w:p>
@@ -21087,7 +21087,7 @@
         <w:pStyle w:val="BodyText"/>
       </w:pPr>
       <w:r>
-        <w:t xml:space="preserve">Y yo, en vez de parar, en vez de soltar la goma, en vez de gritar, seguí. No sé por qué. Las manos se me movían solas. Pasé la goma por su mano derecha. La que me había agarrado de los hombros en el acantilado. La que sangraba.</w:t>
+        <w:t xml:space="preserve">Y yo, en vez de parar, en vez de soltar la goma, en vez de gritar, seguí. Las manos se me movían solas. Pasé la goma por su mano derecha. La que me había agarrado de los hombros en el acantilado. La que sangraba.</w:t>
       </w:r>
     </w:p>
     <w:p>
@@ -21322,7 +21322,7 @@
         <w:pStyle w:val="BodyText"/>
       </w:pPr>
       <w:r>
-        <w:t xml:space="preserve">Me quedé en la puerta del lavadero con la mano en la boca. No me vieron. Estuve mirándolos un buen rato. Klaus no mejoraba. Bailaba como un armario con patas. Se equivocaba de pie, se equivocaba de compás, se equivocaba de todo. Pero no paraba. Fátima le corregía, él asentía muy serio, y volvía a intentarlo.</w:t>
+        <w:t xml:space="preserve">Me apoyé en la puerta del lavadero con la mano en la boca. No me vieron. Estuve mirándolos un buen rato. Klaus no mejoraba. Bailaba como un armario con patas. Se equivocaba de pie, se equivocaba de compás, se equivocaba de todo. Pero no paraba. Fátima le corregía, él asentía muy serio, y volvía a intentarlo.</w:t>
       </w:r>
     </w:p>
     <w:p>
@@ -21430,7 +21430,7 @@
         <w:pStyle w:val="FirstParagraph"/>
       </w:pPr>
       <w:r>
-        <w:t xml:space="preserve">No sé cuánto tiempo estuvimos así. Yo de rodillas. Él de pie. El viento silbando en la linterna.</w:t>
+        <w:t xml:space="preserve">Estuvimos así mucho rato. Yo de rodillas. Él de pie. El viento silbando en la linterna.</w:t>
       </w:r>
     </w:p>
     <w:p>
@@ -21446,7 +21446,7 @@
         <w:pStyle w:val="BodyText"/>
       </w:pPr>
       <w:r>
-        <w:t xml:space="preserve">Cruzó la galería despacio. Se arrodilló delante de mí, al otro lado del cuaderno abierto. Me miró. Abrió la boca. Nada.</w:t>
+        <w:t xml:space="preserve">Cruzó la galería. Se arrodilló delante de mí, al otro lado del cuaderno abierto. Me miró. Abrió la boca. Nada.</w:t>
       </w:r>
     </w:p>
     <w:p>
@@ -21650,15 +21650,15 @@
         <w:pStyle w:val="BodyText"/>
       </w:pPr>
       <w:r>
-        <w:t xml:space="preserve">Tardé mucho. Las manos siempre me cuestan. Y esta vez no podía equivocarme. Los dedos largos. Los nudillos marcados. La forma del pulgar. Lo hice despacio, muy despacio, mientras él mantenía la otra mano sobre la mía y miraba su muñeca vacía.</w:t>
-      </w:r>
-    </w:p>
-    <w:p>
-      <w:pPr>
-        <w:pStyle w:val="BodyText"/>
-      </w:pPr>
-      <w:r>
-        <w:t xml:space="preserve">No se formó de golpe. Fue apareciendo con el lápiz. Primero un contorno, como de niebla. Luego los nudillos. Luego los dedos, uno por uno, mientras yo los dibujaba, como si los estuviera tejiendo en el aire.</w:t>
+        <w:t xml:space="preserve">Tardé mucho. Las manos siempre me cuestan. Y esta vez no podía equivocarme. Los dedos largos. Los nudillos marcados. La forma del pulgar. Lo hice muy despacio, mientras él mantenía la otra mano sobre la mía y miraba su muñeca vacía.</w:t>
+      </w:r>
+    </w:p>
+    <w:p>
+      <w:pPr>
+        <w:pStyle w:val="BodyText"/>
+      </w:pPr>
+      <w:r>
+        <w:t xml:space="preserve">No se formó entera. Fue apareciendo con el lápiz. Primero un contorno, como de niebla. Luego los nudillos. Luego los dedos, uno por uno, mientras yo los dibujaba, como si los estuviera tejiendo en el aire.</w:t>
       </w:r>
     </w:p>
     <w:p>
@@ -22147,7 +22147,7 @@
         <w:pStyle w:val="BodyText"/>
       </w:pPr>
       <w:r>
-        <w:t xml:space="preserve">Le enseñé la carta. La leyó dos veces, moviendo los labios, despacio, como leía el español. Luego la dobló y me la devolvió.</w:t>
+        <w:t xml:space="preserve">Le enseñé la carta. La leyó dos veces, moviendo los labios, como leía el español. Luego la dobló y me la devolvió.</w:t>
       </w:r>
     </w:p>
     <w:p>
@@ -22262,7 +22262,7 @@
         <w:pStyle w:val="BodyText"/>
       </w:pPr>
       <w:r>
-        <w:t xml:space="preserve">No me moví. Me quedé muy quieta, con los ojos cerrados, sintiendo el peso de su brazo en mi cintura y su respiración en la nuca. Lenta. Tranquila. Dormido.</w:t>
+        <w:t xml:space="preserve">No me moví. Muy quieta, con los ojos cerrados, sintiendo el peso de su brazo en mi cintura y su respiración en la nuca. Lenta. Tranquila. Dormido.</w:t>
       </w:r>
     </w:p>
     <w:p>
@@ -22793,7 +22793,7 @@
         <w:pStyle w:val="BodyText"/>
       </w:pPr>
       <w:r>
-        <w:t xml:space="preserve">Y antes de que pudiera preguntarle qué quería decir, se dio la vuelta y echó a andar cuesta abajo hacia la furgoneta de Lola, despacio, agarrada a su bolso.</w:t>
+        <w:t xml:space="preserve">Y antes de que pudiera preguntarle qué quería decir, se dio la vuelta y echó a andar cuesta abajo hacia la furgoneta de Lola, agarrada a su bolso.</w:t>
       </w:r>
     </w:p>
     <w:p>
@@ -22964,7 +22964,7 @@
         <w:pStyle w:val="BodyText"/>
       </w:pPr>
       <w:r>
-        <w:t xml:space="preserve">Cuando levanté la vista, él estaba al pie de la escalera de la torre. No sé cuánto llevaba ahí. Lo suficiente.</w:t>
+        <w:t xml:space="preserve">Cuando levanté la vista, él estaba al pie de la escalera de la torre. Había oído lo suficiente.</w:t>
       </w:r>
     </w:p>
     <w:p>
@@ -23294,13 +23294,13 @@
     <w:bookmarkEnd w:id="66"/>
     <w:bookmarkEnd w:id="67"/>
     <w:bookmarkEnd w:id="68"/>
-    <w:bookmarkStart w:id="83" w:name="tercer-acto-julian"/>
+    <w:bookmarkStart w:id="84" w:name="tercer-acto-el-nombre"/>
     <w:p>
       <w:pPr>
         <w:pStyle w:val="Heading1"/>
       </w:pPr>
       <w:r>
-        <w:t xml:space="preserve">Tercer acto · Julian</w:t>
+        <w:t xml:space="preserve">Tercer acto · El nombre</w:t>
       </w:r>
     </w:p>
     <w:bookmarkStart w:id="70" w:name="iter"/>
@@ -23403,39 +23403,7 @@
         <w:pStyle w:val="FirstParagraph"/>
       </w:pPr>
       <w:r>
-        <w:t xml:space="preserve">Tengo que decir otra cosa, aunque no sepa decirla bien.</w:t>
-      </w:r>
-    </w:p>
-    <w:p>
-      <w:pPr>
-        <w:pStyle w:val="BodyText"/>
-      </w:pPr>
-      <w:r>
-        <w:t xml:space="preserve">Cuando Ada me borró la boca, no me quedé callado. Callado es cuando tienes las palabras y no las dices. Yo tenía las palabras y no tenía dónde ponerlas. Era como estar dentro de una habitación sin puerta, gritando, y que el grito no llegara ni a la pared.</w:t>
-      </w:r>
-    </w:p>
-    <w:p>
-      <w:pPr>
-        <w:pStyle w:val="BodyText"/>
-      </w:pPr>
-      <w:r>
-        <w:t xml:space="preserve">Y cuando me borró la mano, la vi irse. Primero las uñas. Luego los dedos. Vi la barandilla a través de mí.</w:t>
-      </w:r>
-    </w:p>
-    <w:p>
-      <w:pPr>
-        <w:pStyle w:val="BodyText"/>
-      </w:pPr>
-      <w:r>
-        <w:t xml:space="preserve">No había dolor. Eso fue lo peor. Si duele, hay algo que duele. Allí no había nada.</w:t>
-      </w:r>
-    </w:p>
-    <w:p>
-      <w:pPr>
-        <w:pStyle w:val="BodyText"/>
-      </w:pPr>
-      <w:r>
-        <w:t xml:space="preserve">Después me devolvió la mano, y la voz, y nos acostamos juntos, y fue lo mejor que me ha pasado desde que llamé a su puerta. Las dos cosas son verdad. No sé cómo caben juntas. Caben.</w:t>
+        <w:t xml:space="preserve">La noche de la galería me devolvió la mano, y la voz, y nos acostamos juntos, y fue lo mejor que me ha pasado desde que llamé a su puerta.</w:t>
       </w:r>
     </w:p>
     <w:p>
@@ -23744,7 +23712,7 @@
         <w:pStyle w:val="BodyText"/>
       </w:pPr>
       <w:r>
-        <w:t xml:space="preserve">No se lo pedí. Se lo dije. Ella asintió desde la mesa, con los ojos en los monitores, y vi que apretaba los dientes. Pero no dijo nada. Me dio dinero para el pan.</w:t>
+        <w:t xml:space="preserve">No se lo pedí. Se lo dije. Ella asintió desde la mesa, con los ojos en los monitores, y vi que apretaba los dientes. Pero me dio dinero para el pan.</w:t>
       </w:r>
     </w:p>
     <w:p>
@@ -24290,7 +24258,7 @@
         <w:pStyle w:val="BodyText"/>
       </w:pPr>
       <w:r>
-        <w:t xml:space="preserve">Miró por encima de mi hombro. Vio a Iter. Lo miró de arriba abajo, despacio, como se mira un mueble en una tienda.</w:t>
+        <w:t xml:space="preserve">Miró por encima de mi hombro. Vio a Iter. Lo miró de arriba abajo, como se mira un mueble en una tienda.</w:t>
       </w:r>
     </w:p>
     <w:p>
@@ -24457,7 +24425,7 @@
         <w:pStyle w:val="BodyText"/>
       </w:pPr>
       <w:r>
-        <w:t xml:space="preserve">Iter se quedó inmóvil. Como al principio, cuando todavía no sabía moverse si yo no lo dibujaba.</w:t>
+        <w:t xml:space="preserve">Iter se quedó inmóvil. Quieto como un dibujo.</w:t>
       </w:r>
     </w:p>
     <w:p>
@@ -24474,22 +24442,6 @@
       </w:pPr>
       <w:r>
         <w:t xml:space="preserve">Esa sonrisa la conocía. Era la de Madrid. La de cuando algo le salía bien en el trabajo y llegaba a casa y me lo contaba de pie, sin quitarse el abrigo.</w:t>
-      </w:r>
-    </w:p>
-    <w:p>
-      <w:pPr>
-        <w:pStyle w:val="BodyText"/>
-      </w:pPr>
-      <w:r>
-        <w:t xml:space="preserve">El abrigo de paño azul era igual que uno que tenía su padre. Su padre, que se iba. No se murió: se iba. Cogía el coche un martes y volvía un mes después, o tres, con regalos y una explicación que nunca era la misma. Me lo contó una sola vez, en Madrid, de madrugada, como si confesara un crimen. Que de niño se aprendía los horarios de todo, los trenes, las comidas, los turnos de su madre, para que nada volviera a pillarlo por sorpresa. Que el abrigo se lo compró con el primer sueldo, porque era el que llevaba su padre la última vez que volvió.</w:t>
-      </w:r>
-    </w:p>
-    <w:p>
-      <w:pPr>
-        <w:pStyle w:val="BodyText"/>
-      </w:pPr>
-      <w:r>
-        <w:t xml:space="preserve">Yo entonces pensé que era ternura. Después pensé que era otra cosa. Ahora, en el muelle, con todo el pueblo mirando, pensé que eran las dos. Que a los dos se nos fue un padre. Yo me puse a dibujar a alguien que se quedaba. Él aprendió a que nadie pudiera irse.</w:t>
       </w:r>
     </w:p>
     <w:p>
@@ -24709,7 +24661,7 @@
         <w:pStyle w:val="BodyText"/>
       </w:pPr>
       <w:r>
-        <w:t xml:space="preserve">No de golpe. Despacio. Como se borra el sol detrás de un cirro. Y debajo vi, durante un segundo, una cara que todo el pueblo vio también. Que mi abuela vio. Que el de las pinzas vio desde su barca, porque se levantó.</w:t>
+        <w:t xml:space="preserve">Poco a poco. Como se borra el sol detrás de un cirro. Y debajo vi, durante un segundo, una cara que todo el pueblo vio también. Que mi abuela vio. Que el de las pinzas vio desde su barca, porque se levantó.</w:t>
       </w:r>
     </w:p>
     <w:p>
@@ -24749,7 +24701,7 @@
         <w:pStyle w:val="BodyText"/>
       </w:pPr>
       <w:r>
-        <w:t xml:space="preserve">Y se fue andando por el muelle, despacio, sin volverse, hacia el coche que había dejado delante de la iglesia.</w:t>
+        <w:t xml:space="preserve">Y se fue andando por el muelle, sin volverse, hacia el coche que había dejado delante de la iglesia.</w:t>
       </w:r>
     </w:p>
     <w:p>
@@ -24848,7 +24800,7 @@
         <w:pStyle w:val="BodyText"/>
       </w:pPr>
       <w:r>
-        <w:t xml:space="preserve">Iter lo miró mucho rato. No dijo nada. Puso el dedo encima del niño, con cuidado, sin tocar el lápiz.</w:t>
+        <w:t xml:space="preserve">Iter lo miró mucho rato. Puso el dedo encima del niño, con cuidado, sin tocar el lápiz.</w:t>
       </w:r>
     </w:p>
     <w:p>
@@ -24928,7 +24880,7 @@
         <w:pStyle w:val="BodyText"/>
       </w:pPr>
       <w:r>
-        <w:t xml:space="preserve">Mi madre no dijo nada mientras hablaba. Me dejó peinarla. Cuando terminé, me cogió la mano con la suya, delgada, amarilla, con los nudillos hinchados.</w:t>
+        <w:t xml:space="preserve">Mi madre escuchó callada. Me dejó peinarla. Cuando terminé, me cogió la mano con la suya, delgada, amarilla, con los nudillos hinchados.</w:t>
       </w:r>
     </w:p>
     <w:p>
@@ -25000,7 +24952,7 @@
         <w:pStyle w:val="BodyText"/>
       </w:pPr>
       <w:r>
-        <w:t xml:space="preserve">Mi madre asintió despacio, como si eso lo explicara todo.</w:t>
+        <w:t xml:space="preserve">Mi madre asintió, como si eso lo explicara todo.</w:t>
       </w:r>
     </w:p>
     <w:p>
@@ -25748,7 +25700,7 @@
         <w:pStyle w:val="BodyText"/>
       </w:pPr>
       <w:r>
-        <w:t xml:space="preserve">Me tocó el hombro. Donde me lo había tocado en el puerto.</w:t>
+        <w:t xml:space="preserve">Me tocó el hombro. Donde me lo había tocado en el puerto. Donde me había dicho al oído lo que me dijo, que no le he contado a Ada y que no voy a contar aquí. Todavía no.</w:t>
       </w:r>
     </w:p>
     <w:p>
@@ -25796,7 +25748,7 @@
         <w:pStyle w:val="BodyText"/>
       </w:pPr>
       <w:r>
-        <w:t xml:space="preserve">Ada estaba de rodillas a mi lado, con las manos sobre las mías, sin poder agarrarlas. Él la miró. No era la mirada de la cocina, ni la del puerto, ni ninguna de las que yo le había visto. Era la de un niño que se ha perdido en una estación y acaba de entender que nadie va a venir a buscarlo. La miró como se mira a una desconocida. Tres años durmiendo al lado de una mujer que cada noche, en los márgenes de un cuaderno, dibujaba a otro hombre. Y él no lo había sabido nunca. No la había conocido nunca.</w:t>
+        <w:t xml:space="preserve">Ada estaba de rodillas a mi lado, con las manos sobre las mías, sin poder agarrarlas. Él la miró. No era la mirada de la cocina, ni la del puerto, ni ninguna de las que yo le había visto. Era la de un niño que se ha perdido en una estación y acaba de entender que nadie va a venir a buscarlo. La miró como se mira a una desconocida. Sabía que dibujaba: tres años llamándolo dibujitos. Lo que no sabía era a quién. Que desde niña, en los márgenes de todos sus cuadernos, la esperaba otro hombre. Y que a su lado ella había dejado de dibujarlo. No la había conocido nunca.</w:t>
       </w:r>
     </w:p>
     <w:p>
@@ -26921,6 +26873,30 @@
         <w:pStyle w:val="BodyText"/>
       </w:pPr>
       <w:r>
+        <w:t xml:space="preserve">Ya me había pasado una vez. Cuando Ada me borró la boca en la galería no me quedé callado. Callado es cuando tienes las palabras y no las dices. Yo tenía las palabras y no tenía dónde ponerlas. Era como estar dentro de una habitación sin puerta, gritando, y que el grito no llegara ni a la pared.</w:t>
+      </w:r>
+    </w:p>
+    <w:p>
+      <w:pPr>
+        <w:pStyle w:val="BodyText"/>
+      </w:pPr>
+      <w:r>
+        <w:t xml:space="preserve">Y cuando me borró la mano la vi irse. Primero las uñas. Luego los dedos. Vi la barandilla a través de mí. No había dolor. Eso fue lo peor. Si duele, hay algo que duele. Allí no había nada.</w:t>
+      </w:r>
+    </w:p>
+    <w:p>
+      <w:pPr>
+        <w:pStyle w:val="BodyText"/>
+      </w:pPr>
+      <w:r>
+        <w:t xml:space="preserve">Esto era igual. Pero entero.</w:t>
+      </w:r>
+    </w:p>
+    <w:p>
+      <w:pPr>
+        <w:pStyle w:val="BodyText"/>
+      </w:pPr>
+      <w:r>
         <w:t xml:space="preserve">Lo único que tenía eran los ojos. Poco. Lo justo para verla arrodillada a mi lado con el cuaderno deshecho en las manos, buscando algo por la cocina con la mirada, desesperada.</w:t>
       </w:r>
     </w:p>
@@ -27214,15 +27190,15 @@
         <w:pStyle w:val="BodyText"/>
       </w:pPr>
       <w:r>
-        <w:t xml:space="preserve">La cicatriz del alambre también la dibujó. Esa la perdí en la galería, cuando me devolvió la mano desde el papel. Ahora la dibujaba desde lo que había visto. Pequeña, en el nudillo. Y volvió. Los cortes de las rocas no: esos no los vio nunca, me los curé solo, de noche.</w:t>
-      </w:r>
-    </w:p>
-    <w:p>
-      <w:pPr>
-        <w:pStyle w:val="BodyText"/>
-      </w:pPr>
-      <w:r>
-        <w:t xml:space="preserve">Eso también está bien. Eso también es verdad.</w:t>
+        <w:t xml:space="preserve">La cicatriz del alambre también la dibujó. Esa la perdí en la galería, cuando me devolvió la mano desde el papel. Ahora la dibujaba desde lo que había visto. Pequeña, en el nudillo. Y volvió.</w:t>
+      </w:r>
+    </w:p>
+    <w:p>
+      <w:pPr>
+        <w:pStyle w:val="BodyText"/>
+      </w:pPr>
+      <w:r>
+        <w:t xml:space="preserve">Nunca me había alegrado tanto de una herida.</w:t>
       </w:r>
     </w:p>
     <w:p>
@@ -27277,7 +27253,7 @@
         <w:pStyle w:val="BodyText"/>
       </w:pPr>
       <w:r>
-        <w:t xml:space="preserve">Solo se pasó la mano por la cara, despacio, de la frente a la barbilla, como quien se quita el agua.</w:t>
+        <w:t xml:space="preserve">Solo se pasó la mano por la cara, de la frente a la barbilla, para quitarse el agua.</w:t>
       </w:r>
     </w:p>
     <w:p>
@@ -27412,7 +27388,7 @@
         <w:pStyle w:val="BodyText"/>
       </w:pPr>
       <w:r>
-        <w:t xml:space="preserve">Y nos reímos los dos, en el suelo de la cocina, empapados, temblando, mientras el viento golpeaba la contraventana que yo arreglé y el hombre del chubasquero naranja se levantaba despacio, recogía su linterna y se iba hacia la puerta sin hacer ruido.</w:t>
+        <w:t xml:space="preserve">Y nos reímos los dos, en el suelo de la cocina, empapados, temblando, mientras el viento golpeaba la contraventana que yo arreglé y el hombre del chubasquero naranja se levantaba, recogía su linterna y se iba hacia la puerta sin hacer ruido.</w:t>
       </w:r>
     </w:p>
     <w:p>
@@ -27576,7 +27552,7 @@
         <w:t xml:space="preserve">bodia</w:t>
       </w:r>
       <w:r>
-        <w:t xml:space="preserve">, todo junto. Los hombres se reían de él. Él se reía con ellos, rojo como un tomate, y seguía apuntando.</w:t>
+        <w:t xml:space="preserve">, todo junto. Los hombres se reían de él. Él se reía con ellos, colorado, y seguía apuntando.</w:t>
       </w:r>
     </w:p>
     <w:p>
@@ -28464,7 +28440,55 @@
         <w:pStyle w:val="BodyText"/>
       </w:pPr>
       <w:r>
-        <w:t xml:space="preserve">Un dedo. Eso es lo que hacía falta. Desbloquear y escribir</w:t>
+        <w:t xml:space="preserve">Pensé en el abrigo azul abrochado botón a botón en el muelle. Era igual que uno que tenía su padre. Su padre, que se iba. No se murió: se iba. Cogía el coche un martes y volvía un mes después, o tres, con regalos y una explicación que nunca era la misma. Me lo contó una sola vez, en Madrid, de madrugada, como si confesara un crimen. Que de niño se aprendía los horarios de todo, los trenes, las comidas, los turnos de su madre, para que nada volviera a pillarlo por sorpresa. Que el abrigo se lo compró con el primer sueldo, porque era el que llevaba su padre la última vez que volvió.</w:t>
+      </w:r>
+    </w:p>
+    <w:p>
+      <w:pPr>
+        <w:pStyle w:val="BodyText"/>
+      </w:pPr>
+      <w:r>
+        <w:t xml:space="preserve">Yo entonces pensé que era ternura. Después pensé que era otra cosa. En el coche, con el móvil en la mano, pensé que eran las dos. Que a los dos se nos fue un padre. Yo me puse a dibujar a alguien que se quedaba. Él aprendió a que nadie pudiera irse.</w:t>
+      </w:r>
+    </w:p>
+    <w:p>
+      <w:pPr>
+        <w:pStyle w:val="BodyText"/>
+      </w:pPr>
+      <w:r>
+        <w:t xml:space="preserve">Y me acordé de las Perseidas. El primer agosto. Yo le había dicho que los meteorólogos no miramos las estrellas, porque las estrellas no hacen tiempo, y él apareció a las tres de la mañana con un termo de cacao y una manta y me llevó a un descampado de Guadalajara a mirarlas igual. Contó cuarenta y dos. Yo me dormí en la treinta. Me despertó con un beso en la frente y me dijo que había pedido cuarenta y dos deseos y que todos eran yo.</w:t>
+      </w:r>
+    </w:p>
+    <w:p>
+      <w:pPr>
+        <w:pStyle w:val="BodyText"/>
+      </w:pPr>
+      <w:r>
+        <w:t xml:space="preserve">Eso fue verdad. Eso pasó.</w:t>
+      </w:r>
+    </w:p>
+    <w:p>
+      <w:pPr>
+        <w:pStyle w:val="BodyText"/>
+      </w:pPr>
+      <w:r>
+        <w:t xml:space="preserve">Le quise. Durante un tiempo le quise con todo lo que tenía.</w:t>
+      </w:r>
+    </w:p>
+    <w:p>
+      <w:pPr>
+        <w:pStyle w:val="BodyText"/>
+      </w:pPr>
+      <w:r>
+        <w:t xml:space="preserve">Lo desbloqueé.</w:t>
+      </w:r>
+    </w:p>
+    <w:p>
+      <w:pPr>
+        <w:pStyle w:val="BodyText"/>
+      </w:pPr>
+      <w:r>
+        <w:t xml:space="preserve">Fue así de fácil. Un dedo. La conversación se abrió sola, con su último mensaje abajo del todo:</w:t>
       </w:r>
       <w:r>
         <w:t xml:space="preserve"> </w:t>
@@ -28474,10 +28498,13 @@
           <w:iCs/>
           <w:i/>
         </w:rPr>
-        <w:t xml:space="preserve">perdona</w:t>
-      </w:r>
-      <w:r>
-        <w:t xml:space="preserve">,</w:t>
+        <w:t xml:space="preserve">Nos vemos el 12.</w:t>
+      </w:r>
+      <w:r>
+        <w:t xml:space="preserve"> </w:t>
+      </w:r>
+      <w:r>
+        <w:t xml:space="preserve">Y debajo, mi</w:t>
       </w:r>
       <w:r>
         <w:t xml:space="preserve"> </w:t>
@@ -28487,23 +28514,57 @@
           <w:iCs/>
           <w:i/>
         </w:rPr>
-        <w:t xml:space="preserve">estoy muy nerviosa</w:t>
-      </w:r>
-      <w:r>
-        <w:t xml:space="preserve">,</w:t>
+        <w:t xml:space="preserve">No.</w:t>
       </w:r>
       <w:r>
         <w:t xml:space="preserve"> </w:t>
       </w:r>
+      <w:r>
+        <w:t xml:space="preserve">Dos letras. De pronto me parecieron muy pocas.</w:t>
+      </w:r>
+    </w:p>
+    <w:p>
+      <w:pPr>
+        <w:pStyle w:val="BodyText"/>
+      </w:pPr>
+      <w:r>
+        <w:t xml:space="preserve">Empecé a escribir.</w:t>
+      </w:r>
+    </w:p>
+    <w:p>
+      <w:pPr>
+        <w:pStyle w:val="BodyText"/>
+      </w:pPr>
       <w:r>
         <w:rPr>
           <w:iCs/>
           <w:i/>
         </w:rPr>
-        <w:t xml:space="preserve">ha sido todo muy raro</w:t>
-      </w:r>
-      <w:r>
-        <w:t xml:space="preserve">,</w:t>
+        <w:t xml:space="preserve">Perdona. Ha sido todo muy raro. Estoy muy nerviosa, no sé lo que</w:t>
+      </w:r>
+    </w:p>
+    <w:p>
+      <w:pPr>
+        <w:pStyle w:val="BodyText"/>
+      </w:pPr>
+      <w:r>
+        <w:t xml:space="preserve">Me paré. Lo leí. Era mi letra de antes. La de pedir perdón por cosas que no había hecho, con el pulgar rápido, antes de que él se enfadara más.</w:t>
+      </w:r>
+    </w:p>
+    <w:p>
+      <w:pPr>
+        <w:pStyle w:val="BodyText"/>
+      </w:pPr>
+      <w:r>
+        <w:t xml:space="preserve">Lo borré letra a letra.</w:t>
+      </w:r>
+    </w:p>
+    <w:p>
+      <w:pPr>
+        <w:pStyle w:val="BodyText"/>
+      </w:pPr>
+      <w:r>
+        <w:t xml:space="preserve">Lo volví a escribir, más corto.</w:t>
       </w:r>
       <w:r>
         <w:t xml:space="preserve"> </w:t>
@@ -28513,13 +28574,15 @@
           <w:iCs/>
           <w:i/>
         </w:rPr>
-        <w:t xml:space="preserve">¿podemos hablar?</w:t>
-      </w:r>
-      <w:r>
-        <w:t xml:space="preserve"> </w:t>
-      </w:r>
-      <w:r>
-        <w:t xml:space="preserve">Y él contestaría en menos de un minuto, porque siempre contestaba en menos de un minuto. Diría que no pasaba nada. Que lo retiraba todo. Que me esperaba en A Coruña. Y yo volvería al piso de la calle Ibiza, a las sábanas de rayas grises, a las cenas con sus amigos donde todo el mundo se reía de sus chistes. Mi madre volvería a llamarme los domingos. Mi madre lo adoraba.</w:t>
+        <w:t xml:space="preserve">¿Podemos hablar?</w:t>
+      </w:r>
+    </w:p>
+    <w:p>
+      <w:pPr>
+        <w:pStyle w:val="BodyText"/>
+      </w:pPr>
+      <w:r>
+        <w:t xml:space="preserve">Y él contestaría en menos de un minuto, porque siempre contestaba en menos de un minuto. Diría que no pasaba nada. Que lo retiraba todo. Que me esperaba en A Coruña. Me vi subiendo la escalera del piso de la calle Ibiza con la maleta, metiendo la llave, que seguiría girando igual, un poco dura al final. Las sábanas de rayas grises. Las cenas con sus amigos, donde todo el mundo se reía de sus chistes y yo también, un segundo después que los demás. Mi madre volvería a llamarme los domingos. Mi madre lo adoraba.</w:t>
       </w:r>
       <w:r>
         <w:t xml:space="preserve"> </w:t>
@@ -28537,6 +28600,14 @@
         <w:pStyle w:val="BodyText"/>
       </w:pPr>
       <w:r>
+        <w:t xml:space="preserve">Mi madre, que cuando se fue mi padre se encerró en su tristeza como en una habitación sin ventanas y no volvió a salir, porque dentro, por lo menos, sabía dónde estaban las paredes.</w:t>
+      </w:r>
+    </w:p>
+    <w:p>
+      <w:pPr>
+        <w:pStyle w:val="BodyText"/>
+      </w:pPr>
+      <w:r>
         <w:t xml:space="preserve">Sería tan fácil. No porque lo quisiera. Porque me lo sabía. Porque allí sabía dónde estaba cada cosa, incluida yo.</w:t>
       </w:r>
     </w:p>
@@ -28553,23 +28624,39 @@
         <w:pStyle w:val="BodyText"/>
       </w:pPr>
       <w:r>
-        <w:t xml:space="preserve">Tenía la cara hinchada de no dormir y el pelo todavía tieso de sal. Y unos ojos que no me gustaron. Los ojos de alguien que está calculando cuánto le costaría rendirse. Me vi fea. No por las ojeras. Por eso otro.</w:t>
-      </w:r>
-    </w:p>
-    <w:p>
-      <w:pPr>
-        <w:pStyle w:val="BodyText"/>
-      </w:pPr>
-      <w:r>
-        <w:t xml:space="preserve">Tuve el dedo encima del botón mucho rato.</w:t>
-      </w:r>
-    </w:p>
-    <w:p>
-      <w:pPr>
-        <w:pStyle w:val="BodyText"/>
-      </w:pPr>
-      <w:r>
-        <w:t xml:space="preserve">Luego pensé en él agachado en la hierba, mirándose la palma de la mano como si fuera de otro. Tres años a mi lado y no sabía que yo dibujaba.</w:t>
+        <w:t xml:space="preserve">Tenía la cara hinchada de no dormir y el pelo todavía tieso de sal. Y unos ojos que no me gustaron. Los ojos de alguien que está calculando cuánto le costaría rendirse. Me vi fea. No por las ojeras. Por eso otro. Vi a mi madre. La misma boca apretada. Los mismos ojos de hacer cuentas.</w:t>
+      </w:r>
+    </w:p>
+    <w:p>
+      <w:pPr>
+        <w:pStyle w:val="BodyText"/>
+      </w:pPr>
+      <w:r>
+        <w:t xml:space="preserve">Tuve el dedo encima de</w:t>
+      </w:r>
+      <w:r>
+        <w:t xml:space="preserve"> </w:t>
+      </w:r>
+      <w:r>
+        <w:rPr>
+          <w:iCs/>
+          <w:i/>
+        </w:rPr>
+        <w:t xml:space="preserve">enviar</w:t>
+      </w:r>
+      <w:r>
+        <w:t xml:space="preserve"> </w:t>
+      </w:r>
+      <w:r>
+        <w:t xml:space="preserve">mucho rato.</w:t>
+      </w:r>
+    </w:p>
+    <w:p>
+      <w:pPr>
+        <w:pStyle w:val="BodyText"/>
+      </w:pPr>
+      <w:r>
+        <w:t xml:space="preserve">Luego pensé en él agachado en la hierba, mirándose la palma de la mano como si fuera de otro. Tres años a mi lado sabiendo que yo dibujaba, y sin saber nunca a quién.</w:t>
       </w:r>
     </w:p>
     <w:p>
@@ -28585,7 +28672,23 @@
         <w:pStyle w:val="BodyText"/>
       </w:pPr>
       <w:r>
-        <w:t xml:space="preserve">Cerré la lista. Guardé el móvil en la guantera. Arranqué.</w:t>
+        <w:t xml:space="preserve">Borré</w:t>
+      </w:r>
+      <w:r>
+        <w:t xml:space="preserve"> </w:t>
+      </w:r>
+      <w:r>
+        <w:rPr>
+          <w:iCs/>
+          <w:i/>
+        </w:rPr>
+        <w:t xml:space="preserve">¿Podemos hablar?</w:t>
+      </w:r>
+      <w:r>
+        <w:t xml:space="preserve"> </w:t>
+      </w:r>
+      <w:r>
+        <w:t xml:space="preserve">Volví a bloquearlo. Guardé el móvil en la guantera. Arranqué.</w:t>
       </w:r>
     </w:p>
     <w:p>
@@ -28826,6 +28929,126 @@
         <w:pStyle w:val="BodyText"/>
       </w:pPr>
       <w:r>
+        <w:t xml:space="preserve">Antes de arrancar llamé a Lucía.</w:t>
+      </w:r>
+    </w:p>
+    <w:p>
+      <w:pPr>
+        <w:pStyle w:val="BodyText"/>
+      </w:pPr>
+      <w:r>
+        <w:t xml:space="preserve">Contestó al primer tono, como si llevara meses con el teléfono en la mano. A lo mejor llevaba.</w:t>
+      </w:r>
+    </w:p>
+    <w:p>
+      <w:pPr>
+        <w:pStyle w:val="BodyText"/>
+      </w:pPr>
+      <w:r>
+        <w:t xml:space="preserve">—¿Ada? Tú nunca me llamas.</w:t>
+      </w:r>
+    </w:p>
+    <w:p>
+      <w:pPr>
+        <w:pStyle w:val="BodyText"/>
+      </w:pPr>
+      <w:r>
+        <w:t xml:space="preserve">—Estoy bien.</w:t>
+      </w:r>
+    </w:p>
+    <w:p>
+      <w:pPr>
+        <w:pStyle w:val="BodyText"/>
+      </w:pPr>
+      <w:r>
+        <w:t xml:space="preserve">—Eso es lo que dice la gente que no está bien.</w:t>
+      </w:r>
+    </w:p>
+    <w:p>
+      <w:pPr>
+        <w:pStyle w:val="BodyText"/>
+      </w:pPr>
+      <w:r>
+        <w:t xml:space="preserve">—Lucía. Le he dicho su nombre a un guardia civil. En voz alta. Y lo ha escrito en un papel.</w:t>
+      </w:r>
+    </w:p>
+    <w:p>
+      <w:pPr>
+        <w:pStyle w:val="BodyText"/>
+      </w:pPr>
+      <w:r>
+        <w:t xml:space="preserve">Silencio al otro lado. Un silencio largo, de Madrid, con tráfico de fondo.</w:t>
+      </w:r>
+    </w:p>
+    <w:p>
+      <w:pPr>
+        <w:pStyle w:val="BodyText"/>
+      </w:pPr>
+      <w:r>
+        <w:t xml:space="preserve">—¿Y?</w:t>
+      </w:r>
+    </w:p>
+    <w:p>
+      <w:pPr>
+        <w:pStyle w:val="BodyText"/>
+      </w:pPr>
+      <w:r>
+        <w:t xml:space="preserve">—Y nada. No ha pasado nada.</w:t>
+      </w:r>
+    </w:p>
+    <w:p>
+      <w:pPr>
+        <w:pStyle w:val="BodyText"/>
+      </w:pPr>
+      <w:r>
+        <w:t xml:space="preserve">Lucía se echó a llorar. Y luego a reír. Y luego las dos cosas, como hace ella, sin transición.</w:t>
+      </w:r>
+    </w:p>
+    <w:p>
+      <w:pPr>
+        <w:pStyle w:val="BodyText"/>
+      </w:pPr>
+      <w:r>
+        <w:t xml:space="preserve">—Voy en Navidad —dijo cuando pudo—. Me da igual si tienes sitio. Duermo en el sofá, en la escalera, dentro de la lámpara. Y me vas a presentar al de la toalla como Dios manda, que en la videollamada solo le vi media cara y ya me pareció demasiado.</w:t>
+      </w:r>
+    </w:p>
+    <w:p>
+      <w:pPr>
+        <w:pStyle w:val="BodyText"/>
+      </w:pPr>
+      <w:r>
+        <w:t xml:space="preserve">Me reí. En el aparcamiento de un cuartel, con el viento del noroeste, me reí.</w:t>
+      </w:r>
+    </w:p>
+    <w:p>
+      <w:pPr>
+        <w:pStyle w:val="BodyText"/>
+      </w:pPr>
+      <w:r>
+        <w:t xml:space="preserve">—Vale —dije.</w:t>
+      </w:r>
+    </w:p>
+    <w:p>
+      <w:pPr>
+        <w:pStyle w:val="BodyText"/>
+      </w:pPr>
+      <w:r>
+        <w:t xml:space="preserve">—¿Vale qué?</w:t>
+      </w:r>
+    </w:p>
+    <w:p>
+      <w:pPr>
+        <w:pStyle w:val="BodyText"/>
+      </w:pPr>
+      <w:r>
+        <w:t xml:space="preserve">—Vale a todo.</w:t>
+      </w:r>
+    </w:p>
+    <w:p>
+      <w:pPr>
+        <w:pStyle w:val="BodyText"/>
+      </w:pPr>
+      <w:r>
         <w:t xml:space="preserve">Volví por la carretera de la costa con la ventanilla bajada, aunque hacía frío. No me acordé de él hasta Corcubión. Y solo para darme cuenta de que no me había acordado.</w:t>
       </w:r>
     </w:p>
@@ -28967,7 +29190,169 @@
     </w:p>
     <w:bookmarkEnd w:id="79"/>
     <w:bookmarkEnd w:id="80"/>
-    <w:bookmarkStart w:id="82" w:name="julian"/>
+    <w:bookmarkStart w:id="81" w:name="maruxa-la-primera-noche"/>
+    <w:p>
+      <w:pPr>
+        <w:pStyle w:val="Heading2"/>
+      </w:pPr>
+      <w:r>
+        <w:t xml:space="preserve">Maruxa · La primera noche</w:t>
+      </w:r>
+    </w:p>
+    <w:p>
+      <w:pPr>
+        <w:pStyle w:val="FirstParagraph"/>
+      </w:pPr>
+      <w:r>
+        <w:t xml:space="preserve">Klaus se murió un martes de marzo, a las cuatro y diez de la tarde, en el hospital de Cee, con la radio puesta porque quería oír el parte de la mar.</w:t>
+      </w:r>
+    </w:p>
+    <w:p>
+      <w:pPr>
+        <w:pStyle w:val="BodyText"/>
+      </w:pPr>
+      <w:r>
+        <w:t xml:space="preserve">De eso no voy a hablar. Eso es suyo.</w:t>
+      </w:r>
+    </w:p>
+    <w:p>
+      <w:pPr>
+        <w:pStyle w:val="BodyText"/>
+      </w:pPr>
+      <w:r>
+        <w:t xml:space="preserve">Voy a hablar de la primera noche.</w:t>
+      </w:r>
+    </w:p>
+    <w:p>
+      <w:pPr>
+        <w:pStyle w:val="BodyText"/>
+      </w:pPr>
+      <w:r>
+        <w:t xml:space="preserve">Volví a casa con mi hija. Mi hija quería quedarse conmigo en la cama. Le dije que no, que me apañaba. Le hice una tortilla que no se comió y la mandé a dormir a la habitación de arriba. Yo me fui a la nuestra.</w:t>
+      </w:r>
+    </w:p>
+    <w:p>
+      <w:pPr>
+        <w:pStyle w:val="BodyText"/>
+      </w:pPr>
+      <w:r>
+        <w:t xml:space="preserve">La cama estaba hecha. La había hecho yo esa mañana, antes de ir al hospital, porque Klaus decía que una cama sin hacer es una casa que se ha rendido. Su almohada tenía todavía la forma de su cabeza. No la toqué.</w:t>
+      </w:r>
+    </w:p>
+    <w:p>
+      <w:pPr>
+        <w:pStyle w:val="BodyText"/>
+      </w:pPr>
+      <w:r>
+        <w:t xml:space="preserve">Me acosté en mi lado, de cara a la pared, como siempre. Y cerré los ojos.</w:t>
+      </w:r>
+    </w:p>
+    <w:p>
+      <w:pPr>
+        <w:pStyle w:val="BodyText"/>
+      </w:pPr>
+      <w:r>
+        <w:t xml:space="preserve">Hay una cosa que no le he contado nunca a nadie. Ni a mi hija. Ni a Ada.</w:t>
+      </w:r>
+    </w:p>
+    <w:p>
+      <w:pPr>
+        <w:pStyle w:val="BodyText"/>
+      </w:pPr>
+      <w:r>
+        <w:t xml:space="preserve">Durante cincuenta y tres años, Klaus se despertó antes que yo. Siempre. A las cinco, a las cinco y media, la hora de los barcos. Y no se levantaba. Se quedaba mirándome dormir. Lo sé porque la primera vez que lo pillé, en Stuttgart, le pregunté qué miraba, y me dijo que miraba que yo existía.</w:t>
+      </w:r>
+    </w:p>
+    <w:p>
+      <w:pPr>
+        <w:pStyle w:val="BodyText"/>
+      </w:pPr>
+      <w:r>
+        <w:t xml:space="preserve">Y yo, desde entonces, cada mañana, cuando notaba que se despertaba, cerraba los ojos más fuerte y respiraba hondo y me hacía la dormida. Para que pudiera seguir mirando. Cincuenta y tres años. Nunca se lo dije. Creo que él lo sabía. Creo que hacía como que no lo sabía, para que yo pudiera seguir haciéndome la dormida.</w:t>
+      </w:r>
+    </w:p>
+    <w:p>
+      <w:pPr>
+        <w:pStyle w:val="BodyText"/>
+      </w:pPr>
+      <w:r>
+        <w:t xml:space="preserve">Así nos quisimos. Fingiendo los dos a la vez.</w:t>
+      </w:r>
+    </w:p>
+    <w:p>
+      <w:pPr>
+        <w:pStyle w:val="BodyText"/>
+      </w:pPr>
+      <w:r>
+        <w:t xml:space="preserve">Esa primera noche me desperté a las cinco. La hora de los barcos.</w:t>
+      </w:r>
+    </w:p>
+    <w:p>
+      <w:pPr>
+        <w:pStyle w:val="BodyText"/>
+      </w:pPr>
+      <w:r>
+        <w:t xml:space="preserve">Y no había nadie mirándome.</w:t>
+      </w:r>
+    </w:p>
+    <w:p>
+      <w:pPr>
+        <w:pStyle w:val="BodyText"/>
+      </w:pPr>
+      <w:r>
+        <w:t xml:space="preserve">Lo noté antes de abrir los ojos. El aire de la habitación estaba quieto de otra manera. Nadie respiraba al otro lado. Nadie esperaba.</w:t>
+      </w:r>
+    </w:p>
+    <w:p>
+      <w:pPr>
+        <w:pStyle w:val="BodyText"/>
+      </w:pPr>
+      <w:r>
+        <w:t xml:space="preserve">Me quedé con los ojos cerrados mucho rato, haciéndome la dormida. Por costumbre. Por si acaso.</w:t>
+      </w:r>
+    </w:p>
+    <w:p>
+      <w:pPr>
+        <w:pStyle w:val="BodyText"/>
+      </w:pPr>
+      <w:r>
+        <w:t xml:space="preserve">Luego los abrí.</w:t>
+      </w:r>
+    </w:p>
+    <w:p>
+      <w:pPr>
+        <w:pStyle w:val="BodyText"/>
+      </w:pPr>
+      <w:r>
+        <w:t xml:space="preserve">Y lloré. No por él. Él estaba donde estaba. Lloré por mí. Porque me había pasado la vida fingiendo estar dormida para que alguien pudiera mirarme, y ahora ya no hacía falta fingir, y no sabía qué hacer con los ojos abiertos.</w:t>
+      </w:r>
+    </w:p>
+    <w:p>
+      <w:pPr>
+        <w:pStyle w:val="BodyText"/>
+      </w:pPr>
+      <w:r>
+        <w:t xml:space="preserve">Me levanté. Hice café. Dos tazas, sin pensar. Me bebí las dos.</w:t>
+      </w:r>
+    </w:p>
+    <w:p>
+      <w:pPr>
+        <w:pStyle w:val="BodyText"/>
+      </w:pPr>
+      <w:r>
+        <w:t xml:space="preserve">Seis años llevo así. Despertándome a las cinco, abriendo los ojos en una habitación donde nadie me mira.</w:t>
+      </w:r>
+    </w:p>
+    <w:p>
+      <w:pPr>
+        <w:pStyle w:val="BodyText"/>
+      </w:pPr>
+      <w:r>
+        <w:t xml:space="preserve">Y seis años sin cantar. Porque cantar también era una manera de dejar que me mirara.</w:t>
+      </w:r>
+    </w:p>
+    <w:bookmarkEnd w:id="81"/>
+    <w:bookmarkStart w:id="83" w:name="julian"/>
     <w:p>
       <w:pPr>
         <w:pStyle w:val="Heading2"/>
@@ -29113,7 +29498,7 @@
         <w:pStyle w:val="BodyText"/>
       </w:pPr>
       <w:r>
-        <w:t xml:space="preserve">Eso fue lo que más me impresionó. Ni de dónde era. Ni a qué me dedicaba. Ni cómo había conocido a su nieta. Comió despacio, me rellenó el vaso de vino dos veces, y en el café, mientras Ada fregaba, se inclinó hacia mí por encima del hule y me dijo, muy bajo:</w:t>
+        <w:t xml:space="preserve">Eso fue lo que más me impresionó. Ni de dónde era. Ni a qué me dedicaba. Ni cómo había conocido a su nieta. Comió sin prisa, me rellenó el vaso de vino dos veces, y en el café, mientras Ada fregaba, se inclinó hacia mí por encima del hule y me dijo, muy bajo:</w:t>
       </w:r>
     </w:p>
     <w:p>
@@ -29340,7 +29725,7 @@
         <w:pStyle w:val="BodyText"/>
       </w:pPr>
       <w:r>
-        <w:t xml:space="preserve">No sé por qué. Creo que ya entonces sabía que algún día iba a querer hacer esto.</w:t>
+        <w:t xml:space="preserve">Creo que ya entonces sabía que algún día iba a querer hacer esto.</w:t>
       </w:r>
     </w:p>
     <w:p>
@@ -29514,7 +29899,7 @@
         <w:pStyle w:val="BodyText"/>
       </w:pPr>
       <w:r>
-        <w:t xml:space="preserve">Me quedé mirándolo con la boca abierta.</w:t>
+        <w:t xml:space="preserve">Lo miré con la boca abierta.</w:t>
       </w:r>
     </w:p>
     <w:p>
@@ -29561,7 +29946,7 @@
         <w:pStyle w:val="BodyText"/>
       </w:pPr>
       <w:r>
-        <w:t xml:space="preserve">No dijo nada. Se acercó a la barandilla. Miró la luz girar.</w:t>
+        <w:t xml:space="preserve">Se acercó a la barandilla. Miró la luz girar.</w:t>
       </w:r>
     </w:p>
     <w:p>
@@ -29881,7 +30266,7 @@
         </w:pict>
       </w:r>
     </w:p>
-    <w:bookmarkStart w:id="81" w:name="maruxa-costa-da-morte-hoy-1"/>
+    <w:bookmarkStart w:id="82" w:name="maruxa-costa-da-morte-hoy-1"/>
     <w:p>
       <w:pPr>
         <w:pStyle w:val="Heading3"/>
@@ -29975,7 +30360,7 @@
         <w:pStyle w:val="BodyText"/>
       </w:pPr>
       <w:r>
-        <w:t xml:space="preserve">Me quedé en la ventana hasta que amaneció y la luz se apagó.</w:t>
+        <w:t xml:space="preserve">Seguí en la ventana hasta que amaneció y la luz se apagó.</w:t>
       </w:r>
     </w:p>
     <w:p>
@@ -30025,9 +30410,9 @@
         <w:t xml:space="preserve">La historia de Ada Koch continúa en el Libro II.</w:t>
       </w:r>
     </w:p>
-    <w:bookmarkEnd w:id="81"/>
     <w:bookmarkEnd w:id="82"/>
     <w:bookmarkEnd w:id="83"/>
+    <w:bookmarkEnd w:id="84"/>
     <w:sectPr/>
   </w:body>
 </w:document>

</xml_diff>

<commit_message>
Ada Koch I: la coda de abril de 1969 deja de anticipar «La primera noche»
Co-Authored-By: Claude Opus 5.5 <noreply@anthropic.com>
Claude-Session: https://claude.ai/code/session_01HymiadRDUPzWBtequ8tm6m
</commit_message>
<xml_diff>
--- a/ada_koch/libro_1/Los_Amantes_de_la_Espiral.docx
+++ b/ada_koch/libro_1/Los_Amantes_de_la_Espiral.docx
@@ -15764,30 +15764,6 @@
       </w:pPr>
       <w:r>
         <w:t xml:space="preserve">Me quedé muy quieta, dejándome mirar, mientras la luz de la ventana iba pasando de gris a blanca y los tranvías empezaban a sonar en la calle.</w:t>
-      </w:r>
-    </w:p>
-    <w:p>
-      <w:pPr>
-        <w:pStyle w:val="BodyText"/>
-      </w:pPr>
-      <w:r>
-        <w:t xml:space="preserve">En cincuenta y tres años me miró así muchas mañanas. Yo siempre fingía estar dormida, para que pudiera seguir haciéndolo.</w:t>
-      </w:r>
-    </w:p>
-    <w:p>
-      <w:pPr>
-        <w:pStyle w:val="BodyText"/>
-      </w:pPr>
-      <w:r>
-        <w:t xml:space="preserve">Ahora que no está, a veces me despierto a las cinco con la sensación de que alguien me mira.</w:t>
-      </w:r>
-    </w:p>
-    <w:p>
-      <w:pPr>
-        <w:pStyle w:val="BodyText"/>
-      </w:pPr>
-      <w:r>
-        <w:t xml:space="preserve">No abro los ojos. Por si acaso.</w:t>
       </w:r>
     </w:p>
     <w:bookmarkEnd w:id="49"/>

</xml_diff>

<commit_message>
Ada Koch I: «La primera noche» se funde en el último fragmento de Maruxa
El capítulo suelto adelantaba el final y rompía el trenzado de fragmentos.
El ritual de fingir el sueño, la primera noche y el silencio de seis años pasan
al «hoy» que cierra el libro, antes del faro y del canto.

Co-Authored-By: Claude Opus 5.5 <noreply@anthropic.com>
Claude-Session: https://claude.ai/code/session_01HymiadRDUPzWBtequ8tm6m
</commit_message>
<xml_diff>
--- a/ada_koch/libro_1/Los_Amantes_de_la_Espiral.docx
+++ b/ada_koch/libro_1/Los_Amantes_de_la_Espiral.docx
@@ -23270,7 +23270,7 @@
     <w:bookmarkEnd w:id="66"/>
     <w:bookmarkEnd w:id="67"/>
     <w:bookmarkEnd w:id="68"/>
-    <w:bookmarkStart w:id="84" w:name="tercer-acto-el-nombre"/>
+    <w:bookmarkStart w:id="83" w:name="tercer-acto-el-nombre"/>
     <w:p>
       <w:pPr>
         <w:pStyle w:val="Heading1"/>
@@ -29166,169 +29166,7 @@
     </w:p>
     <w:bookmarkEnd w:id="79"/>
     <w:bookmarkEnd w:id="80"/>
-    <w:bookmarkStart w:id="81" w:name="maruxa-la-primera-noche"/>
-    <w:p>
-      <w:pPr>
-        <w:pStyle w:val="Heading2"/>
-      </w:pPr>
-      <w:r>
-        <w:t xml:space="preserve">Maruxa · La primera noche</w:t>
-      </w:r>
-    </w:p>
-    <w:p>
-      <w:pPr>
-        <w:pStyle w:val="FirstParagraph"/>
-      </w:pPr>
-      <w:r>
-        <w:t xml:space="preserve">Klaus se murió un martes de marzo, a las cuatro y diez de la tarde, en el hospital de Cee, con la radio puesta porque quería oír el parte de la mar.</w:t>
-      </w:r>
-    </w:p>
-    <w:p>
-      <w:pPr>
-        <w:pStyle w:val="BodyText"/>
-      </w:pPr>
-      <w:r>
-        <w:t xml:space="preserve">De eso no voy a hablar. Eso es suyo.</w:t>
-      </w:r>
-    </w:p>
-    <w:p>
-      <w:pPr>
-        <w:pStyle w:val="BodyText"/>
-      </w:pPr>
-      <w:r>
-        <w:t xml:space="preserve">Voy a hablar de la primera noche.</w:t>
-      </w:r>
-    </w:p>
-    <w:p>
-      <w:pPr>
-        <w:pStyle w:val="BodyText"/>
-      </w:pPr>
-      <w:r>
-        <w:t xml:space="preserve">Volví a casa con mi hija. Mi hija quería quedarse conmigo en la cama. Le dije que no, que me apañaba. Le hice una tortilla que no se comió y la mandé a dormir a la habitación de arriba. Yo me fui a la nuestra.</w:t>
-      </w:r>
-    </w:p>
-    <w:p>
-      <w:pPr>
-        <w:pStyle w:val="BodyText"/>
-      </w:pPr>
-      <w:r>
-        <w:t xml:space="preserve">La cama estaba hecha. La había hecho yo esa mañana, antes de ir al hospital, porque Klaus decía que una cama sin hacer es una casa que se ha rendido. Su almohada tenía todavía la forma de su cabeza. No la toqué.</w:t>
-      </w:r>
-    </w:p>
-    <w:p>
-      <w:pPr>
-        <w:pStyle w:val="BodyText"/>
-      </w:pPr>
-      <w:r>
-        <w:t xml:space="preserve">Me acosté en mi lado, de cara a la pared, como siempre. Y cerré los ojos.</w:t>
-      </w:r>
-    </w:p>
-    <w:p>
-      <w:pPr>
-        <w:pStyle w:val="BodyText"/>
-      </w:pPr>
-      <w:r>
-        <w:t xml:space="preserve">Hay una cosa que no le he contado nunca a nadie. Ni a mi hija. Ni a Ada.</w:t>
-      </w:r>
-    </w:p>
-    <w:p>
-      <w:pPr>
-        <w:pStyle w:val="BodyText"/>
-      </w:pPr>
-      <w:r>
-        <w:t xml:space="preserve">Durante cincuenta y tres años, Klaus se despertó antes que yo. Siempre. A las cinco, a las cinco y media, la hora de los barcos. Y no se levantaba. Se quedaba mirándome dormir. Lo sé porque la primera vez que lo pillé, en Stuttgart, le pregunté qué miraba, y me dijo que miraba que yo existía.</w:t>
-      </w:r>
-    </w:p>
-    <w:p>
-      <w:pPr>
-        <w:pStyle w:val="BodyText"/>
-      </w:pPr>
-      <w:r>
-        <w:t xml:space="preserve">Y yo, desde entonces, cada mañana, cuando notaba que se despertaba, cerraba los ojos más fuerte y respiraba hondo y me hacía la dormida. Para que pudiera seguir mirando. Cincuenta y tres años. Nunca se lo dije. Creo que él lo sabía. Creo que hacía como que no lo sabía, para que yo pudiera seguir haciéndome la dormida.</w:t>
-      </w:r>
-    </w:p>
-    <w:p>
-      <w:pPr>
-        <w:pStyle w:val="BodyText"/>
-      </w:pPr>
-      <w:r>
-        <w:t xml:space="preserve">Así nos quisimos. Fingiendo los dos a la vez.</w:t>
-      </w:r>
-    </w:p>
-    <w:p>
-      <w:pPr>
-        <w:pStyle w:val="BodyText"/>
-      </w:pPr>
-      <w:r>
-        <w:t xml:space="preserve">Esa primera noche me desperté a las cinco. La hora de los barcos.</w:t>
-      </w:r>
-    </w:p>
-    <w:p>
-      <w:pPr>
-        <w:pStyle w:val="BodyText"/>
-      </w:pPr>
-      <w:r>
-        <w:t xml:space="preserve">Y no había nadie mirándome.</w:t>
-      </w:r>
-    </w:p>
-    <w:p>
-      <w:pPr>
-        <w:pStyle w:val="BodyText"/>
-      </w:pPr>
-      <w:r>
-        <w:t xml:space="preserve">Lo noté antes de abrir los ojos. El aire de la habitación estaba quieto de otra manera. Nadie respiraba al otro lado. Nadie esperaba.</w:t>
-      </w:r>
-    </w:p>
-    <w:p>
-      <w:pPr>
-        <w:pStyle w:val="BodyText"/>
-      </w:pPr>
-      <w:r>
-        <w:t xml:space="preserve">Me quedé con los ojos cerrados mucho rato, haciéndome la dormida. Por costumbre. Por si acaso.</w:t>
-      </w:r>
-    </w:p>
-    <w:p>
-      <w:pPr>
-        <w:pStyle w:val="BodyText"/>
-      </w:pPr>
-      <w:r>
-        <w:t xml:space="preserve">Luego los abrí.</w:t>
-      </w:r>
-    </w:p>
-    <w:p>
-      <w:pPr>
-        <w:pStyle w:val="BodyText"/>
-      </w:pPr>
-      <w:r>
-        <w:t xml:space="preserve">Y lloré. No por él. Él estaba donde estaba. Lloré por mí. Porque me había pasado la vida fingiendo estar dormida para que alguien pudiera mirarme, y ahora ya no hacía falta fingir, y no sabía qué hacer con los ojos abiertos.</w:t>
-      </w:r>
-    </w:p>
-    <w:p>
-      <w:pPr>
-        <w:pStyle w:val="BodyText"/>
-      </w:pPr>
-      <w:r>
-        <w:t xml:space="preserve">Me levanté. Hice café. Dos tazas, sin pensar. Me bebí las dos.</w:t>
-      </w:r>
-    </w:p>
-    <w:p>
-      <w:pPr>
-        <w:pStyle w:val="BodyText"/>
-      </w:pPr>
-      <w:r>
-        <w:t xml:space="preserve">Seis años llevo así. Despertándome a las cinco, abriendo los ojos en una habitación donde nadie me mira.</w:t>
-      </w:r>
-    </w:p>
-    <w:p>
-      <w:pPr>
-        <w:pStyle w:val="BodyText"/>
-      </w:pPr>
-      <w:r>
-        <w:t xml:space="preserve">Y seis años sin cantar. Porque cantar también era una manera de dejar que me mirara.</w:t>
-      </w:r>
-    </w:p>
-    <w:bookmarkEnd w:id="81"/>
-    <w:bookmarkStart w:id="83" w:name="julian"/>
+    <w:bookmarkStart w:id="82" w:name="julian"/>
     <w:p>
       <w:pPr>
         <w:pStyle w:val="Heading2"/>
@@ -30242,7 +30080,7 @@
         </w:pict>
       </w:r>
     </w:p>
-    <w:bookmarkStart w:id="82" w:name="maruxa-costa-da-morte-hoy-1"/>
+    <w:bookmarkStart w:id="81" w:name="maruxa-costa-da-morte-hoy-1"/>
     <w:p>
       <w:pPr>
         <w:pStyle w:val="Heading3"/>
@@ -30257,6 +30095,38 @@
       </w:pPr>
       <w:r>
         <w:t xml:space="preserve">Non durmo ben desde que morreu Klaus. Seis anos.</w:t>
+      </w:r>
+    </w:p>
+    <w:p>
+      <w:pPr>
+        <w:pStyle w:val="BodyText"/>
+      </w:pPr>
+      <w:r>
+        <w:t xml:space="preserve">Cincuenta y tres años se despertó antes que yo. A las cinco, la hora de los barcos. Y no se levantaba: se quedaba mirándome dormir, como aquella mañana de Stuttgart. Yo, cada vez que lo notaba despierto, cerraba los ojos más fuerte y me hacía la dormida, para que pudiera seguir mirando. Nunca se lo dije. Creo que él lo sabía, y hacía como que no, para que yo pudiera seguir fingiendo.</w:t>
+      </w:r>
+    </w:p>
+    <w:p>
+      <w:pPr>
+        <w:pStyle w:val="BodyText"/>
+      </w:pPr>
+      <w:r>
+        <w:t xml:space="preserve">Así nos quisimos. Fingiendo los dos a la vez.</w:t>
+      </w:r>
+    </w:p>
+    <w:p>
+      <w:pPr>
+        <w:pStyle w:val="BodyText"/>
+      </w:pPr>
+      <w:r>
+        <w:t xml:space="preserve">La primera noche sin él volví del hospital a una cama que había hecho yo por la mañana, porque Klaus decía que una cama sin hacer es una casa que se ha rendido. Me desperté a las cinco y no había nadie mirándome. Lo noté antes de abrir los ojos: el aire de la habitación estaba quieto de otra manera. Me quedé mucho rato haciéndome la dormida. Por costumbre. Por si acaso. Luego me levanté e hice café. Dos tazas, sin pensar. Me bebí las dos.</w:t>
+      </w:r>
+    </w:p>
+    <w:p>
+      <w:pPr>
+        <w:pStyle w:val="BodyText"/>
+      </w:pPr>
+      <w:r>
+        <w:t xml:space="preserve">Tampoco he vuelto a cantar. Cantar también era una manera de dejar que me mirara.</w:t>
       </w:r>
     </w:p>
     <w:p>
@@ -30386,9 +30256,9 @@
         <w:t xml:space="preserve">La historia de Ada Koch continúa en el Libro II.</w:t>
       </w:r>
     </w:p>
+    <w:bookmarkEnd w:id="81"/>
     <w:bookmarkEnd w:id="82"/>
     <w:bookmarkEnd w:id="83"/>
-    <w:bookmarkEnd w:id="84"/>
     <w:sectPr/>
   </w:body>
 </w:document>

</xml_diff>

<commit_message>
Ada Koch I: fuera la frase que explicaba el canto del espigón
Co-Authored-By: Claude Opus 5.5 <noreply@anthropic.com>
Claude-Session: https://claude.ai/code/session_01HymiadRDUPzWBtequ8tm6m
</commit_message>
<xml_diff>
--- a/ada_koch/libro_1/Los_Amantes_de_la_Espiral.docx
+++ b/ada_koch/libro_1/Los_Amantes_de_la_Espiral.docx
@@ -30119,14 +30119,6 @@
       </w:pPr>
       <w:r>
         <w:t xml:space="preserve">La primera noche sin él volví del hospital a una cama que había hecho yo por la mañana, porque Klaus decía que una cama sin hacer es una casa que se ha rendido. Me desperté a las cinco y no había nadie mirándome. Lo noté antes de abrir los ojos: el aire de la habitación estaba quieto de otra manera. Me quedé mucho rato haciéndome la dormida. Por costumbre. Por si acaso. Luego me levanté e hice café. Dos tazas, sin pensar. Me bebí las dos.</w:t>
-      </w:r>
-    </w:p>
-    <w:p>
-      <w:pPr>
-        <w:pStyle w:val="BodyText"/>
-      </w:pPr>
-      <w:r>
-        <w:t xml:space="preserve">Tampoco he vuelto a cantar. Cantar también era una manera de dejar que me mirara.</w:t>
       </w:r>
     </w:p>
     <w:p>

</xml_diff>

<commit_message>
Ada Koch I: montaje del 23, mañana de convivencia, rótulo «23 · Ada (continúa)», puntuación del 29
- El encuentro con la abuela en el camino se cuenta una vez: Ada hasta la mirada,
  Maruxa la carrera y la pregunta.
- Dos escenas breves la mañana después de la galería: el café flojo, la mandarina,
  el atlas, la mano en el pelo sin pedir permiso.
- Cap. 29: raya en «Álvaro», inciso de «Julian» partido, Perseidas en dos frases.

Co-Authored-By: Claude Opus 5.5 <noreply@anthropic.com>
Claude-Session: https://claude.ai/code/session_01HymiadRDUPzWBtequ8tm6m
</commit_message>
<xml_diff>
--- a/ada_koch/libro_1/Los_Amantes_de_la_Espiral.docx
+++ b/ada_koch/libro_1/Los_Amantes_de_la_Espiral.docx
@@ -22305,6 +22305,152 @@
         <w:pStyle w:val="FirstParagraph"/>
       </w:pPr>
       <w:r>
+        <w:t xml:space="preserve">No me dio buenos días. Me apartó el pelo de la cara con un dedo, lo justo para verme los dos ojos, y se levantó a hacer café.</w:t>
+      </w:r>
+    </w:p>
+    <w:p>
+      <w:pPr>
+        <w:pStyle w:val="BodyText"/>
+      </w:pPr>
+      <w:r>
+        <w:t xml:space="preserve">Lo oí desde la cama. La cafetera. Un cajón. Otro cajón. Una cucharilla contra las baldosas. Una palabrota en voz baja, de las mías.</w:t>
+      </w:r>
+    </w:p>
+    <w:p>
+      <w:pPr>
+        <w:pStyle w:val="BodyText"/>
+      </w:pPr>
+      <w:r>
+        <w:t xml:space="preserve">Cuando llegué a la cocina había dos tazas en la mesa. El café era casi transparente, color de té. Me había visto hacerlo todas las mañanas y se había quedado con todo menos con la cantidad.</w:t>
+      </w:r>
+    </w:p>
+    <w:p>
+      <w:pPr>
+        <w:pStyle w:val="BodyText"/>
+      </w:pPr>
+      <w:r>
+        <w:t xml:space="preserve">Me lo bebí entero. No le dije nada.</w:t>
+      </w:r>
+    </w:p>
+    <w:p>
+      <w:pPr>
+        <w:pStyle w:val="BodyText"/>
+      </w:pPr>
+      <w:r>
+        <w:t xml:space="preserve">Había tostado en la sartén el pan del día anterior y lo había partido con las manos en trozos pequeños, como lo partía siempre. Luego peló una mandarina con toda su paciencia, hilo blanco a hilo blanco, la abrió en dos y me dio la mitad sin mirarme, como se pasa la sal.</w:t>
+      </w:r>
+    </w:p>
+    <w:p>
+      <w:pPr>
+        <w:pStyle w:val="BodyText"/>
+      </w:pPr>
+      <w:r>
+        <w:t xml:space="preserve">Comimos sin hablar.</w:t>
+      </w:r>
+    </w:p>
+    <w:p>
+      <w:pPr>
+        <w:pStyle w:val="BodyText"/>
+      </w:pPr>
+      <w:r>
+        <w:t xml:space="preserve">En Madrid los silencios del desayuno había que romperlos antes de que se rompieran solos. Este no pedía nada. Estaba ahí, como la estufa.</w:t>
+      </w:r>
+    </w:p>
+    <w:p>
+      <w:r>
+        <w:pict>
+          <v:rect style="width:0;height:1.5pt" o:hralign="center" o:hrstd="t" o:hr="t"/>
+        </w:pict>
+      </w:r>
+    </w:p>
+    <w:p>
+      <w:pPr>
+        <w:pStyle w:val="FirstParagraph"/>
+      </w:pPr>
+      <w:r>
+        <w:t xml:space="preserve">Después me senté a los monitores. Tenía que mandar a Bilbao la predicción de un parque eólico de Lugo, y estuve media hora mirando las isobaras sin verlas.</w:t>
+      </w:r>
+    </w:p>
+    <w:p>
+      <w:pPr>
+        <w:pStyle w:val="BodyText"/>
+      </w:pPr>
+      <w:r>
+        <w:t xml:space="preserve">Él se sentó en el suelo, con la espalda contra las patas de mi silla y el atlas de mi abuelo abierto sobre las rodillas. De vez en cuando levantaba el libro por encima de la cabeza, sin volverse, con el dedo encima de una foto. Yo le decía el nombre. Él lo repetía bajito y pasaba la página.</w:t>
+      </w:r>
+    </w:p>
+    <w:p>
+      <w:pPr>
+        <w:pStyle w:val="BodyText"/>
+      </w:pPr>
+      <w:r>
+        <w:rPr>
+          <w:iCs/>
+          <w:i/>
+        </w:rPr>
+        <w:t xml:space="preserve">Mammatus. Pileus. Virga.</w:t>
+      </w:r>
+    </w:p>
+    <w:p>
+      <w:pPr>
+        <w:pStyle w:val="BodyText"/>
+      </w:pPr>
+      <w:r>
+        <w:t xml:space="preserve">En algún momento dejó caer la cabeza hacia atrás, contra mi rodilla. Le puse la mano en el pelo y seguí escribiendo con la otra.</w:t>
+      </w:r>
+    </w:p>
+    <w:p>
+      <w:pPr>
+        <w:pStyle w:val="BodyText"/>
+      </w:pPr>
+      <w:r>
+        <w:t xml:space="preserve">Me di cuenta al enviar el informe, mirándome la mano enredada en su pelo. Llevábamos semanas pidiéndonos permiso para todo. Para tocarnos el brazo. Para corregir una palabra. Para mirarnos demasiado rato. Dos personas educadísimas en una casa demasiado grande.</w:t>
+      </w:r>
+    </w:p>
+    <w:p>
+      <w:pPr>
+        <w:pStyle w:val="BodyText"/>
+      </w:pPr>
+      <w:r>
+        <w:t xml:space="preserve">Esa mañana se nos había olvidado a los dos.</w:t>
+      </w:r>
+    </w:p>
+    <w:p>
+      <w:pPr>
+        <w:pStyle w:val="BodyText"/>
+      </w:pPr>
+      <w:r>
+        <w:t xml:space="preserve">Una sola vez, al pasar una página, lo vi mirar la puerta de la torre. Un segundo. Luego volvió a las nubes.</w:t>
+      </w:r>
+    </w:p>
+    <w:p>
+      <w:pPr>
+        <w:pStyle w:val="BodyText"/>
+      </w:pPr>
+      <w:r>
+        <w:t xml:space="preserve">No le pregunté. Tenía su cabeza en la rodilla y el sol en la mesa, y no quise saber nada que no fuera eso.</w:t>
+      </w:r>
+    </w:p>
+    <w:p>
+      <w:pPr>
+        <w:pStyle w:val="BodyText"/>
+      </w:pPr>
+      <w:r>
+        <w:t xml:space="preserve">Luego se levantó, me dio un beso en la coronilla y salió de la cocina.</w:t>
+      </w:r>
+    </w:p>
+    <w:p>
+      <w:r>
+        <w:pict>
+          <v:rect style="width:0;height:1.5pt" o:hralign="center" o:hrstd="t" o:hr="t"/>
+        </w:pict>
+      </w:r>
+    </w:p>
+    <w:p>
+      <w:pPr>
+        <w:pStyle w:val="FirstParagraph"/>
+      </w:pPr>
+      <w:r>
         <w:t xml:space="preserve">A las once oí el motor.</w:t>
       </w:r>
     </w:p>
@@ -22426,38 +22572,6 @@
       </w:pPr>
       <w:r>
         <w:t xml:space="preserve">Se quedaron así mucho rato.</w:t>
-      </w:r>
-    </w:p>
-    <w:p>
-      <w:pPr>
-        <w:pStyle w:val="BodyText"/>
-      </w:pPr>
-      <w:r>
-        <w:t xml:space="preserve">Dejé el café en la mesa. Salí descalza, en camiseta, por la explanada mojada, sin abrigo, sin nada. Bajé el camino corriendo. Las piedras me cortaban los pies.</w:t>
-      </w:r>
-    </w:p>
-    <w:p>
-      <w:pPr>
-        <w:pStyle w:val="BodyText"/>
-      </w:pPr>
-      <w:r>
-        <w:t xml:space="preserve">Llegué a su lado sin aliento.</w:t>
-      </w:r>
-    </w:p>
-    <w:p>
-      <w:pPr>
-        <w:pStyle w:val="BodyText"/>
-      </w:pPr>
-      <w:r>
-        <w:t xml:space="preserve">No me miró. Seguía mirando la torre.</w:t>
-      </w:r>
-    </w:p>
-    <w:p>
-      <w:pPr>
-        <w:pStyle w:val="BodyText"/>
-      </w:pPr>
-      <w:r>
-        <w:t xml:space="preserve">—¿Quién es ese? —preguntó.</w:t>
       </w:r>
     </w:p>
     <w:p>
@@ -22632,7 +22746,7 @@
         <w:pStyle w:val="BodyText"/>
       </w:pPr>
       <w:r>
-        <w:t xml:space="preserve">Oí a mi nieta bajar el camino corriendo. Descalza. Sin abrigo. Con el pelo como una nube de tormenta.</w:t>
+        <w:t xml:space="preserve">Oí a mi nieta bajar el camino corriendo. Descalza, sobre las piedras. Sin abrigo. Con el pelo como una nube de tormenta.</w:t>
       </w:r>
     </w:p>
     <w:p>
@@ -22648,7 +22762,23 @@
         <w:pStyle w:val="BodyText"/>
       </w:pPr>
       <w:r>
-        <w:t xml:space="preserve">No la miré. Seguí mirando la torre. Le pregunté quién era, aunque ya lo sabía. Porque a veces hay que preguntar las cosas para que la otra persona aprenda a contestarlas.</w:t>
+        <w:t xml:space="preserve">No la miré. Seguí mirando la torre.</w:t>
+      </w:r>
+    </w:p>
+    <w:p>
+      <w:pPr>
+        <w:pStyle w:val="BodyText"/>
+      </w:pPr>
+      <w:r>
+        <w:t xml:space="preserve">—¿Quién es ese? —le pregunté.</w:t>
+      </w:r>
+    </w:p>
+    <w:p>
+      <w:pPr>
+        <w:pStyle w:val="BodyText"/>
+      </w:pPr>
+      <w:r>
+        <w:t xml:space="preserve">Ya lo sabía. Pero a veces hay que preguntar las cosas para que la otra persona aprenda a contestarlas.</w:t>
       </w:r>
     </w:p>
     <w:p>
@@ -22683,13 +22813,13 @@
       </w:r>
     </w:p>
     <w:bookmarkEnd w:id="65"/>
-    <w:bookmarkStart w:id="66" w:name="ada-el-faro-hoy"/>
+    <w:bookmarkStart w:id="66" w:name="ada-continúa"/>
     <w:p>
       <w:pPr>
         <w:pStyle w:val="Heading3"/>
       </w:pPr>
       <w:r>
-        <w:t xml:space="preserve">Ada · El faro, hoy</w:t>
+        <w:t xml:space="preserve">23 · Ada (continúa)</w:t>
       </w:r>
     </w:p>
     <w:p>
@@ -27957,7 +28087,15 @@
         <w:pStyle w:val="BodyText"/>
       </w:pPr>
       <w:r>
-        <w:t xml:space="preserve">—Julian —repitió. Probando. Como probó las lentejas, el café, la mandarina, la palabra</w:t>
+        <w:t xml:space="preserve">—Julian —repitió.</w:t>
+      </w:r>
+    </w:p>
+    <w:p>
+      <w:pPr>
+        <w:pStyle w:val="BodyText"/>
+      </w:pPr>
+      <w:r>
+        <w:t xml:space="preserve">Probando. Como probó las lentejas, el café, la mandarina, la palabra</w:t>
       </w:r>
       <w:r>
         <w:t xml:space="preserve"> </w:t>
@@ -27970,7 +28108,15 @@
         <w:t xml:space="preserve">Iter</w:t>
       </w:r>
       <w:r>
-        <w:t xml:space="preserve">. Pero esta vez no lo probó en la boca. Lo probó en el pecho. Lo vi—. Julian.</w:t>
+        <w:t xml:space="preserve">. Pero esta vez no lo probó en la boca. Lo probó en el pecho. Lo vi.</w:t>
+      </w:r>
+    </w:p>
+    <w:p>
+      <w:pPr>
+        <w:pStyle w:val="BodyText"/>
+      </w:pPr>
+      <w:r>
+        <w:t xml:space="preserve">—Julian.</w:t>
       </w:r>
     </w:p>
     <w:p>
@@ -28432,7 +28578,7 @@
         <w:pStyle w:val="BodyText"/>
       </w:pPr>
       <w:r>
-        <w:t xml:space="preserve">Y me acordé de las Perseidas. El primer agosto. Yo le había dicho que los meteorólogos no miramos las estrellas, porque las estrellas no hacen tiempo, y él apareció a las tres de la mañana con un termo de cacao y una manta y me llevó a un descampado de Guadalajara a mirarlas igual. Contó cuarenta y dos. Yo me dormí en la treinta. Me despertó con un beso en la frente y me dijo que había pedido cuarenta y dos deseos y que todos eran yo.</w:t>
+        <w:t xml:space="preserve">Y me acordé de las Perseidas. El primer agosto. Yo le había dicho que los meteorólogos no miramos las estrellas, porque las estrellas no hacen tiempo. Y él apareció a las tres de la mañana con un termo de cacao y una manta y me llevó a un descampado de Guadalajara a mirarlas igual. Contó cuarenta y dos. Yo me dormí en la treinta. Me despertó con un beso en la frente y me dijo que había pedido cuarenta y dos deseos y que todos eran yo.</w:t>
       </w:r>
     </w:p>
     <w:p>
@@ -28889,7 +29035,7 @@
         <w:pStyle w:val="BodyText"/>
       </w:pPr>
       <w:r>
-        <w:t xml:space="preserve">Álvaro.</w:t>
+        <w:t xml:space="preserve">—Álvaro.</w:t>
       </w:r>
     </w:p>
     <w:p>

</xml_diff>

<commit_message>
Ada Koch I: el libro termina con «Me llamo Ada.»
El capítulo 30 pasa a ser de Ada y tiene una sola línea. El resto del antiguo 30
(Julian, la comida con la abuela, la vuelta al faro) se guarda para el libro II; la
noche del faro encendido y el último fragmento de la abuela, para el libro III.
Aplicado al original (Docs, md, docx, epub) y a las dos ediciones inglesas.

Co-Authored-By: Claude Opus 5.5 <noreply@anthropic.com>
Claude-Session: https://claude.ai/code/session_01HymiadRDUPzWBtequ8tm6m
</commit_message>
<xml_diff>
--- a/ada_koch/libro_1/Los_Amantes_de_la_Espiral.docx
+++ b/ada_koch/libro_1/Los_Amantes_de_la_Espiral.docx
@@ -23400,7 +23400,7 @@
     <w:bookmarkEnd w:id="66"/>
     <w:bookmarkEnd w:id="67"/>
     <w:bookmarkEnd w:id="68"/>
-    <w:bookmarkStart w:id="83" w:name="tercer-acto-el-nombre"/>
+    <w:bookmarkStart w:id="82" w:name="tercer-acto-el-nombre"/>
     <w:p>
       <w:pPr>
         <w:pStyle w:val="Heading1"/>
@@ -29312,13 +29312,13 @@
     </w:p>
     <w:bookmarkEnd w:id="79"/>
     <w:bookmarkEnd w:id="80"/>
-    <w:bookmarkStart w:id="82" w:name="julian"/>
+    <w:bookmarkStart w:id="81" w:name="ada-26"/>
     <w:p>
       <w:pPr>
         <w:pStyle w:val="Heading2"/>
       </w:pPr>
       <w:r>
-        <w:t xml:space="preserve">30 · Julian</w:t>
+        <w:t xml:space="preserve">30 · Ada</w:t>
       </w:r>
     </w:p>
     <w:p>
@@ -29326,1041 +29326,7 @@
         <w:pStyle w:val="FirstParagraph"/>
       </w:pPr>
       <w:r>
-        <w:t xml:space="preserve">Me llamo Julian.</w:t>
-      </w:r>
-    </w:p>
-    <w:p>
-      <w:pPr>
-        <w:pStyle w:val="BodyText"/>
-      </w:pPr>
-      <w:r>
-        <w:t xml:space="preserve">Lo he dicho once veces desde esta mañana. Las he contado. A la perra. Al espejo del baño. A una gaviota en la barandilla de la galería, que no se inmutó. A Brais. A la abuela de Ada, en la puerta de su casa, con el olor de la empanada saliendo por detrás de ella como una bienvenida.</w:t>
-      </w:r>
-    </w:p>
-    <w:p>
-      <w:pPr>
-        <w:pStyle w:val="BodyText"/>
-      </w:pPr>
-      <w:r>
-        <w:t xml:space="preserve">La abuela me miró de arriba abajo. La barba. Las ojeras. La media luna de la mano.</w:t>
-      </w:r>
-    </w:p>
-    <w:p>
-      <w:pPr>
-        <w:pStyle w:val="BodyText"/>
-      </w:pPr>
-      <w:r>
-        <w:t xml:space="preserve">—Xa era hora —dijo.</w:t>
-      </w:r>
-    </w:p>
-    <w:p>
-      <w:pPr>
-        <w:pStyle w:val="BodyText"/>
-      </w:pPr>
-      <w:r>
-        <w:t xml:space="preserve">Y se apartó para dejarme pasar.</w:t>
-      </w:r>
-    </w:p>
-    <w:p>
-      <w:r>
-        <w:pict>
-          <v:rect style="width:0;height:1.5pt" o:hralign="center" o:hrstd="t" o:hr="t"/>
-        </w:pict>
-      </w:r>
-    </w:p>
-    <w:p>
-      <w:pPr>
-        <w:pStyle w:val="FirstParagraph"/>
-      </w:pPr>
-      <w:r>
-        <w:t xml:space="preserve">La cocina era pequeña y estaba caliente. Había un mantel de hule con limones. Tres platos. Tres vasos. Una radio encendida muy bajito, con un hombre hablando en gallego del estado de la mar.</w:t>
-      </w:r>
-    </w:p>
-    <w:p>
-      <w:pPr>
-        <w:pStyle w:val="BodyText"/>
-      </w:pPr>
-      <w:r>
-        <w:t xml:space="preserve">Me senté donde me dijo. Ada se sentó a mi lado. Su abuela, enfrente.</w:t>
-      </w:r>
-    </w:p>
-    <w:p>
-      <w:pPr>
-        <w:pStyle w:val="BodyText"/>
-      </w:pPr>
-      <w:r>
-        <w:t xml:space="preserve">Cortó la empanada con un cuchillo que tenía más años que yo. Mucho más. Me sirvió el trozo más grande.</w:t>
-      </w:r>
-    </w:p>
-    <w:p>
-      <w:pPr>
-        <w:pStyle w:val="BodyText"/>
-      </w:pPr>
-      <w:r>
-        <w:t xml:space="preserve">—Come —dijo—. Estás moi fraco.</w:t>
-      </w:r>
-    </w:p>
-    <w:p>
-      <w:pPr>
-        <w:pStyle w:val="BodyText"/>
-      </w:pPr>
-      <w:r>
-        <w:t xml:space="preserve">No sé qué era</w:t>
-      </w:r>
-      <w:r>
-        <w:t xml:space="preserve"> </w:t>
-      </w:r>
-      <w:r>
-        <w:rPr>
-          <w:iCs/>
-          <w:i/>
-        </w:rPr>
-        <w:t xml:space="preserve">fraco</w:t>
-      </w:r>
-      <w:r>
-        <w:t xml:space="preserve">. Lo supe por cómo me miró. Igual que me miraba Ada al principio, cuando me ponía lentejas: como a algo que hay que sujetar a la tierra con comida.</w:t>
-      </w:r>
-    </w:p>
-    <w:p>
-      <w:pPr>
-        <w:pStyle w:val="BodyText"/>
-      </w:pPr>
-      <w:r>
-        <w:t xml:space="preserve">Comí.</w:t>
-      </w:r>
-    </w:p>
-    <w:p>
-      <w:pPr>
-        <w:pStyle w:val="BodyText"/>
-      </w:pPr>
-      <w:r>
-        <w:t xml:space="preserve">Era de bonito, con pimiento y cebolla, y la masa se deshacía. Me quemé la lengua. No me importó. Era la primera vez que comía algo que había hecho otra persona que no era Ada. La primera vez que alguien me ponía un plato sin saber de dónde venía yo.</w:t>
-      </w:r>
-    </w:p>
-    <w:p>
-      <w:pPr>
-        <w:pStyle w:val="BodyText"/>
-      </w:pPr>
-      <w:r>
-        <w:t xml:space="preserve">O sabiéndolo y poniéndomelo igual.</w:t>
-      </w:r>
-    </w:p>
-    <w:p>
-      <w:pPr>
-        <w:pStyle w:val="BodyText"/>
-      </w:pPr>
-      <w:r>
-        <w:t xml:space="preserve">La abuela no preguntó nada.</w:t>
-      </w:r>
-    </w:p>
-    <w:p>
-      <w:pPr>
-        <w:pStyle w:val="BodyText"/>
-      </w:pPr>
-      <w:r>
-        <w:t xml:space="preserve">Eso fue lo que más me impresionó. Ni de dónde era. Ni a qué me dedicaba. Ni cómo había conocido a su nieta. Comió sin prisa, me rellenó el vaso de vino dos veces, y en el café, mientras Ada fregaba, se inclinó hacia mí por encima del hule y me dijo, muy bajo:</w:t>
-      </w:r>
-    </w:p>
-    <w:p>
-      <w:pPr>
-        <w:pStyle w:val="BodyText"/>
-      </w:pPr>
-      <w:r>
-        <w:t xml:space="preserve">—Ti cantas?</w:t>
-      </w:r>
-    </w:p>
-    <w:p>
-      <w:pPr>
-        <w:pStyle w:val="BodyText"/>
-      </w:pPr>
-      <w:r>
-        <w:t xml:space="preserve">No entendí.</w:t>
-      </w:r>
-    </w:p>
-    <w:p>
-      <w:pPr>
-        <w:pStyle w:val="BodyText"/>
-      </w:pPr>
-      <w:r>
-        <w:t xml:space="preserve">—¿Cantas? —repitió, en castellano.</w:t>
-      </w:r>
-    </w:p>
-    <w:p>
-      <w:pPr>
-        <w:pStyle w:val="BodyText"/>
-      </w:pPr>
-      <w:r>
-        <w:t xml:space="preserve">Miré a Ada. Ada se había quedado quieta en el fregadero, con un plato en la mano, de espaldas.</w:t>
-      </w:r>
-    </w:p>
-    <w:p>
-      <w:pPr>
-        <w:pStyle w:val="BodyText"/>
-      </w:pPr>
-      <w:r>
-        <w:t xml:space="preserve">—No lo sé —dije—. Nunca lo he probado.</w:t>
-      </w:r>
-    </w:p>
-    <w:p>
-      <w:pPr>
-        <w:pStyle w:val="BodyText"/>
-      </w:pPr>
-      <w:r>
-        <w:t xml:space="preserve">La abuela asintió. Como si eso fuera una respuesta buena. La mejor posible.</w:t>
-      </w:r>
-    </w:p>
-    <w:p>
-      <w:pPr>
-        <w:pStyle w:val="BodyText"/>
-      </w:pPr>
-      <w:r>
-        <w:t xml:space="preserve">—Pois proba —dijo—. Que non sexa tarde.</w:t>
-      </w:r>
-    </w:p>
-    <w:p>
-      <w:r>
-        <w:pict>
-          <v:rect style="width:0;height:1.5pt" o:hralign="center" o:hrstd="t" o:hr="t"/>
-        </w:pict>
-      </w:r>
-    </w:p>
-    <w:p>
-      <w:pPr>
-        <w:pStyle w:val="FirstParagraph"/>
-      </w:pPr>
-      <w:r>
-        <w:t xml:space="preserve">Volvimos al faro andando, con la tarde cayendo.</w:t>
-      </w:r>
-    </w:p>
-    <w:p>
-      <w:pPr>
-        <w:pStyle w:val="BodyText"/>
-      </w:pPr>
-      <w:r>
-        <w:t xml:space="preserve">Ada iba callada. Le cogí la mano. La apretó.</w:t>
-      </w:r>
-    </w:p>
-    <w:p>
-      <w:pPr>
-        <w:pStyle w:val="BodyText"/>
-      </w:pPr>
-      <w:r>
-        <w:t xml:space="preserve">—Te ha dicho lo de cantar —dijo.</w:t>
-      </w:r>
-    </w:p>
-    <w:p>
-      <w:pPr>
-        <w:pStyle w:val="BodyText"/>
-      </w:pPr>
-      <w:r>
-        <w:t xml:space="preserve">—Sí.</w:t>
-      </w:r>
-    </w:p>
-    <w:p>
-      <w:pPr>
-        <w:pStyle w:val="BodyText"/>
-      </w:pPr>
-      <w:r>
-        <w:t xml:space="preserve">—A mi abuelo se lo dijo una vez. Hace cincuenta y cinco años.</w:t>
-      </w:r>
-    </w:p>
-    <w:p>
-      <w:pPr>
-        <w:pStyle w:val="BodyText"/>
-      </w:pPr>
-      <w:r>
-        <w:t xml:space="preserve">—¿Y cantaba?</w:t>
-      </w:r>
-    </w:p>
-    <w:p>
-      <w:pPr>
-        <w:pStyle w:val="BodyText"/>
-      </w:pPr>
-      <w:r>
-        <w:t xml:space="preserve">Se rió. Por primera vez en una semana. Con la cabeza echada hacia atrás.</w:t>
-      </w:r>
-    </w:p>
-    <w:p>
-      <w:pPr>
-        <w:pStyle w:val="BodyText"/>
-      </w:pPr>
-      <w:r>
-        <w:t xml:space="preserve">—Fatal. Cantaba fatal. Pero se quedó.</w:t>
-      </w:r>
-    </w:p>
-    <w:p>
-      <w:r>
-        <w:pict>
-          <v:rect style="width:0;height:1.5pt" o:hralign="center" o:hrstd="t" o:hr="t"/>
-        </w:pict>
-      </w:r>
-    </w:p>
-    <w:p>
-      <w:pPr>
-        <w:pStyle w:val="FirstParagraph"/>
-      </w:pPr>
-      <w:r>
-        <w:t xml:space="preserve">Aquella noche esperé a que se durmiera.</w:t>
-      </w:r>
-    </w:p>
-    <w:p>
-      <w:pPr>
-        <w:pStyle w:val="BodyText"/>
-      </w:pPr>
-      <w:r>
-        <w:t xml:space="preserve">No tardó. Llevaba días sin dormir de verdad. Se quedó dormida en la cama de arriba con el lápiz rojo todavía en la mano y la hoja de</w:t>
-      </w:r>
-      <w:r>
-        <w:t xml:space="preserve"> </w:t>
-      </w:r>
-      <w:r>
-        <w:rPr>
-          <w:iCs/>
-          <w:i/>
-        </w:rPr>
-        <w:t xml:space="preserve">El niño que se queda</w:t>
-      </w:r>
-      <w:r>
-        <w:t xml:space="preserve"> </w:t>
-      </w:r>
-      <w:r>
-        <w:t xml:space="preserve">boca abajo en la mesilla, conmigo dibujado por detrás.</w:t>
-      </w:r>
-    </w:p>
-    <w:p>
-      <w:pPr>
-        <w:pStyle w:val="BodyText"/>
-      </w:pPr>
-      <w:r>
-        <w:t xml:space="preserve">Le quité el lápiz. Le subí la manta. Bajé.</w:t>
-      </w:r>
-    </w:p>
-    <w:p>
-      <w:pPr>
-        <w:pStyle w:val="BodyText"/>
-      </w:pPr>
-      <w:r>
-        <w:t xml:space="preserve">El baúl de hierro estaba arriba, en la linterna, debajo de la lámpara. El mismo donde Ada había encerrado el cuaderno con candado. Ya no tenía candado. Dentro había cosas de los fareros que vivieron aquí antes que ella. Una gorra. Un libro de registro con las tapas hinchadas por la humedad. Y dos manuales, en castellano antiguo, con dibujos a plumilla:</w:t>
-      </w:r>
-      <w:r>
-        <w:t xml:space="preserve"> </w:t>
-      </w:r>
-      <w:r>
-        <w:rPr>
-          <w:iCs/>
-          <w:i/>
-        </w:rPr>
-        <w:t xml:space="preserve">Instrucciones para el servicio del alumbrado</w:t>
-      </w:r>
-      <w:r>
-        <w:t xml:space="preserve"> </w:t>
-      </w:r>
-      <w:r>
-        <w:t xml:space="preserve">y</w:t>
-      </w:r>
-      <w:r>
-        <w:t xml:space="preserve"> </w:t>
-      </w:r>
-      <w:r>
-        <w:rPr>
-          <w:iCs/>
-          <w:i/>
-        </w:rPr>
-        <w:t xml:space="preserve">Del grupo electrógeno auxiliar</w:t>
-      </w:r>
-      <w:r>
-        <w:t xml:space="preserve">.</w:t>
-      </w:r>
-    </w:p>
-    <w:p>
-      <w:pPr>
-        <w:pStyle w:val="BodyText"/>
-      </w:pPr>
-      <w:r>
-        <w:t xml:space="preserve">Los había leído enteros. Tres veces. Las noches que ella dormía y yo no.</w:t>
-      </w:r>
-    </w:p>
-    <w:p>
-      <w:pPr>
-        <w:pStyle w:val="BodyText"/>
-      </w:pPr>
-      <w:r>
-        <w:t xml:space="preserve">Creo que ya entonces sabía que algún día iba a querer hacer esto.</w:t>
-      </w:r>
-    </w:p>
-    <w:p>
-      <w:r>
-        <w:pict>
-          <v:rect style="width:0;height:1.5pt" o:hralign="center" o:hrstd="t" o:hr="t"/>
-        </w:pict>
-      </w:r>
-    </w:p>
-    <w:p>
-      <w:pPr>
-        <w:pStyle w:val="FirstParagraph"/>
-      </w:pPr>
-      <w:r>
-        <w:t xml:space="preserve">El grupo auxiliar de la lámpara estaba en la caseta de atrás. No el pequeño de la casa, el que Ada enciende cada vez que se va la luz: el otro, el grande, el que nadie había arrancado desde el ochenta y siete. Oxidado. Con una capa de polvo y de nidos.</w:t>
-      </w:r>
-    </w:p>
-    <w:p>
-      <w:pPr>
-        <w:pStyle w:val="BodyText"/>
-      </w:pPr>
-      <w:r>
-        <w:t xml:space="preserve">Lo limpié. Le cambié el aceite con una lata que había en la estantería y que olía a viejo pero servía. Purgué el gasoil. Comprobé los cables uno a uno, con la linterna en la boca, como explicaba el dibujo de la página cuarenta.</w:t>
-      </w:r>
-    </w:p>
-    <w:p>
-      <w:pPr>
-        <w:pStyle w:val="BodyText"/>
-      </w:pPr>
-      <w:r>
-        <w:t xml:space="preserve">Tiré de la cuerda.</w:t>
-      </w:r>
-    </w:p>
-    <w:p>
-      <w:pPr>
-        <w:pStyle w:val="BodyText"/>
-      </w:pPr>
-      <w:r>
-        <w:t xml:space="preserve">Nada.</w:t>
-      </w:r>
-    </w:p>
-    <w:p>
-      <w:pPr>
-        <w:pStyle w:val="BodyText"/>
-      </w:pPr>
-      <w:r>
-        <w:t xml:space="preserve">Otra vez.</w:t>
-      </w:r>
-    </w:p>
-    <w:p>
-      <w:pPr>
-        <w:pStyle w:val="BodyText"/>
-      </w:pPr>
-      <w:r>
-        <w:t xml:space="preserve">Nada.</w:t>
-      </w:r>
-    </w:p>
-    <w:p>
-      <w:pPr>
-        <w:pStyle w:val="BodyText"/>
-      </w:pPr>
-      <w:r>
-        <w:t xml:space="preserve">La tercera vez tosió. Escupió humo negro. Se ahogó.</w:t>
-      </w:r>
-    </w:p>
-    <w:p>
-      <w:pPr>
-        <w:pStyle w:val="BodyText"/>
-      </w:pPr>
-      <w:r>
-        <w:t xml:space="preserve">Me senté en el suelo de la caseta, con las manos negras de grasa, y me di cuenta de que estaba sonriendo.</w:t>
-      </w:r>
-    </w:p>
-    <w:p>
-      <w:pPr>
-        <w:pStyle w:val="BodyText"/>
-      </w:pPr>
-      <w:r>
-        <w:t xml:space="preserve">Porque había fallado. Porque nadie me había dibujado sabiendo arrancar un generador de 1962. Porque lo estaba aprendiendo yo, solo, a oscuras, con la grasa hasta los codos y un manual mojado. Porque si salía, iba a ser mío.</w:t>
-      </w:r>
-    </w:p>
-    <w:p>
-      <w:pPr>
-        <w:pStyle w:val="BodyText"/>
-      </w:pPr>
-      <w:r>
-        <w:t xml:space="preserve">La cuarta vez arrancó.</w:t>
-      </w:r>
-    </w:p>
-    <w:p>
-      <w:pPr>
-        <w:pStyle w:val="BodyText"/>
-      </w:pPr>
-      <w:r>
-        <w:t xml:space="preserve">Un ruido sordo, regular, que hizo temblar la chapa. Las bombillas de la caseta parpadearon. Se quedaron encendidas.</w:t>
-      </w:r>
-    </w:p>
-    <w:p>
-      <w:r>
-        <w:pict>
-          <v:rect style="width:0;height:1.5pt" o:hralign="center" o:hrstd="t" o:hr="t"/>
-        </w:pict>
-      </w:r>
-    </w:p>
-    <w:p>
-      <w:pPr>
-        <w:pStyle w:val="FirstParagraph"/>
-      </w:pPr>
-      <w:r>
-        <w:t xml:space="preserve">Subí los ciento doce escalones de la torre.</w:t>
-      </w:r>
-    </w:p>
-    <w:p>
-      <w:pPr>
-        <w:pStyle w:val="BodyText"/>
-      </w:pPr>
-      <w:r>
-        <w:t xml:space="preserve">Los conté. Los había subido muchas veces con ella, de día, para mirar el mar. Nunca de noche. Nunca solo.</w:t>
-      </w:r>
-    </w:p>
-    <w:p>
-      <w:pPr>
-        <w:pStyle w:val="BodyText"/>
-      </w:pPr>
-      <w:r>
-        <w:t xml:space="preserve">Arriba, la linterna. La lente grande, de cristal tallado en anillos, como una cebolla de vidrio del tamaño de un hombre. Ada le había quitado la funda la semana anterior, para enseñármela. Decía que era la cosa más bonita que había visto nunca. Decía que nadie la había encendido desde 1987, cuando automatizaron el de Fisterra y este se quedó sin oficio.</w:t>
-      </w:r>
-    </w:p>
-    <w:p>
-      <w:pPr>
-        <w:pStyle w:val="BodyText"/>
-      </w:pPr>
-      <w:r>
-        <w:t xml:space="preserve">Cerré el circuito. Como decía la página doce.</w:t>
-      </w:r>
-    </w:p>
-    <w:p>
-      <w:pPr>
-        <w:pStyle w:val="BodyText"/>
-      </w:pPr>
-      <w:r>
-        <w:t xml:space="preserve">La bombilla de dentro se encendió. Primero naranja. Luego blanca. Luego tan blanca que tuve que cerrar los ojos.</w:t>
-      </w:r>
-    </w:p>
-    <w:p>
-      <w:pPr>
-        <w:pStyle w:val="BodyText"/>
-      </w:pPr>
-      <w:r>
-        <w:t xml:space="preserve">Y la lente empezó a girar.</w:t>
-      </w:r>
-    </w:p>
-    <w:p>
-      <w:pPr>
-        <w:pStyle w:val="BodyText"/>
-      </w:pPr>
-      <w:r>
-        <w:t xml:space="preserve">Despacio. Con un chirrido de engranaje viejo que se fue suavizando. Y la luz salió por los anillos de cristal hecha un haz, un brazo largo y blanco que barrió el mar, las rocas, la cala, la carretera, el pueblo allá abajo con sus cuatro luces, el monte, y volvió al mar.</w:t>
-      </w:r>
-    </w:p>
-    <w:p>
-      <w:pPr>
-        <w:pStyle w:val="BodyText"/>
-      </w:pPr>
-      <w:r>
-        <w:t xml:space="preserve">Una vez cada doce segundos.</w:t>
-      </w:r>
-    </w:p>
-    <w:p>
-      <w:pPr>
-        <w:pStyle w:val="BodyText"/>
-      </w:pPr>
-      <w:r>
-        <w:t xml:space="preserve">Lo miré con la boca abierta.</w:t>
-      </w:r>
-    </w:p>
-    <w:p>
-      <w:pPr>
-        <w:pStyle w:val="BodyText"/>
-      </w:pPr>
-      <w:r>
-        <w:t xml:space="preserve">Era lo primero que hacía en el mundo que no me había dibujado nadie.</w:t>
-      </w:r>
-    </w:p>
-    <w:p>
-      <w:r>
-        <w:pict>
-          <v:rect style="width:0;height:1.5pt" o:hralign="center" o:hrstd="t" o:hr="t"/>
-        </w:pict>
-      </w:r>
-    </w:p>
-    <w:p>
-      <w:pPr>
-        <w:pStyle w:val="FirstParagraph"/>
-      </w:pPr>
-      <w:r>
-        <w:t xml:space="preserve">No la oí subir.</w:t>
-      </w:r>
-    </w:p>
-    <w:p>
-      <w:pPr>
-        <w:pStyle w:val="BodyText"/>
-      </w:pPr>
-      <w:r>
-        <w:t xml:space="preserve">Me di cuenta porque, en el cristal de la linterna, vi algo moverse detrás de mí. Me di la vuelta.</w:t>
-      </w:r>
-    </w:p>
-    <w:p>
-      <w:pPr>
-        <w:pStyle w:val="BodyText"/>
-      </w:pPr>
-      <w:r>
-        <w:t xml:space="preserve">Era Ada. Descalza, con mi jersey de pescador encima del pijama, el pelo revuelto, sin aliento por los ciento doce escalones.</w:t>
-      </w:r>
-    </w:p>
-    <w:p>
-      <w:pPr>
-        <w:pStyle w:val="BodyText"/>
-      </w:pPr>
-      <w:r>
-        <w:t xml:space="preserve">Se acercó a la barandilla. Miró la luz girar.</w:t>
-      </w:r>
-    </w:p>
-    <w:p>
-      <w:pPr>
-        <w:pStyle w:val="BodyText"/>
-      </w:pPr>
-      <w:r>
-        <w:t xml:space="preserve">Llevaba un mes viviendo en un faro apagado. Llevaba toda la vida viviendo apagada. Lo sé porque me lo contó, a trozos, en las noches, con la luz de la estufa. Sé lo que es una nube cumulonimbus y sé lo que es una mujer que ha dejado de cantar.</w:t>
-      </w:r>
-    </w:p>
-    <w:p>
-      <w:pPr>
-        <w:pStyle w:val="BodyText"/>
-      </w:pPr>
-      <w:r>
-        <w:t xml:space="preserve">—Lo he encendido para que lo vieras al volver —dije—. Pero has vuelto antes.</w:t>
-      </w:r>
-    </w:p>
-    <w:p>
-      <w:pPr>
-        <w:pStyle w:val="BodyText"/>
-      </w:pPr>
-      <w:r>
-        <w:t xml:space="preserve">—¿Volver de dónde?</w:t>
-      </w:r>
-    </w:p>
-    <w:p>
-      <w:pPr>
-        <w:pStyle w:val="BodyText"/>
-      </w:pPr>
-      <w:r>
-        <w:t xml:space="preserve">—No lo sé. —Me encogí de hombros—. De donde estabas.</w:t>
-      </w:r>
-    </w:p>
-    <w:p>
-      <w:pPr>
-        <w:pStyle w:val="BodyText"/>
-      </w:pPr>
-      <w:r>
-        <w:t xml:space="preserve">Se le escapó un sonido. No sé si risa o llanto. Las dos cosas.</w:t>
-      </w:r>
-    </w:p>
-    <w:p>
-      <w:pPr>
-        <w:pStyle w:val="BodyText"/>
-      </w:pPr>
-      <w:r>
-        <w:t xml:space="preserve">El haz pasó por encima de nosotros. Nos iluminó entera la cara un segundo. Volvió a irse.</w:t>
-      </w:r>
-    </w:p>
-    <w:p>
-      <w:pPr>
-        <w:pStyle w:val="BodyText"/>
-      </w:pPr>
-      <w:r>
-        <w:t xml:space="preserve">—Gracias —dijo.</w:t>
-      </w:r>
-    </w:p>
-    <w:p>
-      <w:pPr>
-        <w:pStyle w:val="BodyText"/>
-      </w:pPr>
-      <w:r>
-        <w:t xml:space="preserve">—No es para ti. —Le aparté el pelo de la cara—. Bueno, sí. Pero no solo.</w:t>
-      </w:r>
-    </w:p>
-    <w:p>
-      <w:pPr>
-        <w:pStyle w:val="BodyText"/>
-      </w:pPr>
-      <w:r>
-        <w:t xml:space="preserve">—¿Para quién más?</w:t>
-      </w:r>
-    </w:p>
-    <w:p>
-      <w:pPr>
-        <w:pStyle w:val="BodyText"/>
-      </w:pPr>
-      <w:r>
-        <w:t xml:space="preserve">Miré abajo. Al pueblo. A una ventana pequeña del puerto, la única que seguía encendida a esas horas, encima de la casa de las redes.</w:t>
-      </w:r>
-    </w:p>
-    <w:p>
-      <w:pPr>
-        <w:pStyle w:val="BodyText"/>
-      </w:pPr>
-      <w:r>
-        <w:t xml:space="preserve">—Para cualquiera que esté mirando.</w:t>
-      </w:r>
-    </w:p>
-    <w:p>
-      <w:r>
-        <w:pict>
-          <v:rect style="width:0;height:1.5pt" o:hralign="center" o:hrstd="t" o:hr="t"/>
-        </w:pict>
-      </w:r>
-    </w:p>
-    <w:p>
-      <w:pPr>
-        <w:pStyle w:val="FirstParagraph"/>
-      </w:pPr>
-      <w:r>
-        <w:t xml:space="preserve">Nos sentamos en el suelo de hierro, espalda contra espalda. El generador ronroneaba abajo. El mar respiraba. La luz giraba.</w:t>
-      </w:r>
-    </w:p>
-    <w:p>
-      <w:pPr>
-        <w:pStyle w:val="BodyText"/>
-      </w:pPr>
-      <w:r>
-        <w:t xml:space="preserve">—Algún día lo encenderé yo —dijo ella, de pronto.</w:t>
-      </w:r>
-    </w:p>
-    <w:p>
-      <w:pPr>
-        <w:pStyle w:val="BodyText"/>
-      </w:pPr>
-      <w:r>
-        <w:t xml:space="preserve">—Puedo enseñarte.</w:t>
-      </w:r>
-    </w:p>
-    <w:p>
-      <w:pPr>
-        <w:pStyle w:val="BodyText"/>
-      </w:pPr>
-      <w:r>
-        <w:t xml:space="preserve">—No. —Negó con la cabeza contra mi nuca—. Quiero aprenderlo sola. Como tú. Con el manual mojado y las manos negras. Quiero que me salga a la cuarta vez.</w:t>
-      </w:r>
-    </w:p>
-    <w:p>
-      <w:pPr>
-        <w:pStyle w:val="BodyText"/>
-      </w:pPr>
-      <w:r>
-        <w:t xml:space="preserve">No sé cómo sabía lo de la cuarta vez. No se lo había contado.</w:t>
-      </w:r>
-    </w:p>
-    <w:p>
-      <w:pPr>
-        <w:pStyle w:val="BodyText"/>
-      </w:pPr>
-      <w:r>
-        <w:t xml:space="preserve">No pregunté. Igual que ella no había preguntado el nombre de Brais. Hay cosas que no se preguntan porque preguntarlas sería empezar a querer saberlas, y otras que no se preguntan porque ya se saben.</w:t>
-      </w:r>
-    </w:p>
-    <w:p>
-      <w:pPr>
-        <w:pStyle w:val="BodyText"/>
-      </w:pPr>
-      <w:r>
-        <w:t xml:space="preserve">—Vale —dije.</w:t>
-      </w:r>
-    </w:p>
-    <w:p>
-      <w:pPr>
-        <w:pStyle w:val="BodyText"/>
-      </w:pPr>
-      <w:r>
-        <w:t xml:space="preserve">—Prométeme que no lo vas a dejar encendido hasta entonces.</w:t>
-      </w:r>
-    </w:p>
-    <w:p>
-      <w:pPr>
-        <w:pStyle w:val="BodyText"/>
-      </w:pPr>
-      <w:r>
-        <w:t xml:space="preserve">—¿Por qué?</w:t>
-      </w:r>
-    </w:p>
-    <w:p>
-      <w:pPr>
-        <w:pStyle w:val="BodyText"/>
-      </w:pPr>
-      <w:r>
-        <w:t xml:space="preserve">—Porque la próxima vez que se encienda tiene que ser porque yo he vuelto. De verdad. Del todo.</w:t>
-      </w:r>
-    </w:p>
-    <w:p>
-      <w:pPr>
-        <w:pStyle w:val="BodyText"/>
-      </w:pPr>
-      <w:r>
-        <w:t xml:space="preserve">Asentí.</w:t>
-      </w:r>
-    </w:p>
-    <w:p>
-      <w:pPr>
-        <w:pStyle w:val="BodyText"/>
-      </w:pPr>
-      <w:r>
-        <w:t xml:space="preserve">Nos quedamos así mucho rato. Hasta que empezó a clarear por detrás del monte. Hasta que ella se durmió otra vez, contra mí, con la boca un poco abierta.</w:t>
-      </w:r>
-    </w:p>
-    <w:p>
-      <w:pPr>
-        <w:pStyle w:val="BodyText"/>
-      </w:pPr>
-      <w:r>
-        <w:t xml:space="preserve">Roncó una vez. Flojito.</w:t>
-      </w:r>
-    </w:p>
-    <w:p>
-      <w:r>
-        <w:pict>
-          <v:rect style="width:0;height:1.5pt" o:hralign="center" o:hrstd="t" o:hr="t"/>
-        </w:pict>
-      </w:r>
-    </w:p>
-    <w:p>
-      <w:pPr>
-        <w:pStyle w:val="FirstParagraph"/>
-      </w:pPr>
-      <w:r>
-        <w:t xml:space="preserve">Antes de apagar, me levanté a mirar el mar por última vez desde arriba.</w:t>
-      </w:r>
-    </w:p>
-    <w:p>
-      <w:pPr>
-        <w:pStyle w:val="BodyText"/>
-      </w:pPr>
-      <w:r>
-        <w:t xml:space="preserve">En el cristal de la linterna, con el amanecer detrás, se reflejaba la torre, la barandilla, Ada dormida en el suelo envuelta en mi jersey.</w:t>
-      </w:r>
-    </w:p>
-    <w:p>
-      <w:pPr>
-        <w:pStyle w:val="BodyText"/>
-      </w:pPr>
-      <w:r>
-        <w:t xml:space="preserve">Y una silueta de pie, detrás de ella. Alta. Quieta. Mirándola.</w:t>
-      </w:r>
-    </w:p>
-    <w:p>
-      <w:pPr>
-        <w:pStyle w:val="BodyText"/>
-      </w:pPr>
-      <w:r>
-        <w:t xml:space="preserve">Me quedé helado.</w:t>
-      </w:r>
-    </w:p>
-    <w:p>
-      <w:pPr>
-        <w:pStyle w:val="BodyText"/>
-      </w:pPr>
-      <w:r>
-        <w:t xml:space="preserve">Luego levanté la mano. La silueta levantó la mano.</w:t>
-      </w:r>
-    </w:p>
-    <w:p>
-      <w:pPr>
-        <w:pStyle w:val="BodyText"/>
-      </w:pPr>
-      <w:r>
-        <w:t xml:space="preserve">Mi reflejo. Claro. Era mi reflejo.</w:t>
-      </w:r>
-    </w:p>
-    <w:p>
-      <w:pPr>
-        <w:pStyle w:val="BodyText"/>
-      </w:pPr>
-      <w:r>
-        <w:t xml:space="preserve">Bajé la mano.</w:t>
-      </w:r>
-    </w:p>
-    <w:p>
-      <w:pPr>
-        <w:pStyle w:val="BodyText"/>
-      </w:pPr>
-      <w:r>
-        <w:t xml:space="preserve">La silueta tardó un segundo más en bajar la suya.</w:t>
-      </w:r>
-    </w:p>
-    <w:p>
-      <w:pPr>
-        <w:pStyle w:val="BodyText"/>
-      </w:pPr>
-      <w:r>
-        <w:t xml:space="preserve">Un segundo. Nada. El cristal es viejo, me dije. Los anillos tuercen la luz. Llevaba toda la noche sin dormir.</w:t>
-      </w:r>
-    </w:p>
-    <w:p>
-      <w:pPr>
-        <w:pStyle w:val="BodyText"/>
-      </w:pPr>
-      <w:r>
-        <w:t xml:space="preserve">Apagué el circuito. La lente se detuvo. La luz se fue.</w:t>
-      </w:r>
-    </w:p>
-    <w:p>
-      <w:pPr>
-        <w:pStyle w:val="BodyText"/>
-      </w:pPr>
-      <w:r>
-        <w:t xml:space="preserve">Cogí a Ada en brazos y la bajé por los ciento doce escalones, uno a uno, sin despertarla.</w:t>
-      </w:r>
-    </w:p>
-    <w:p>
-      <w:pPr>
-        <w:pStyle w:val="BodyText"/>
-      </w:pPr>
-      <w:r>
-        <w:t xml:space="preserve">No volví a mirar el cristal.</w:t>
-      </w:r>
-    </w:p>
-    <w:p>
-      <w:pPr>
-        <w:pStyle w:val="BodyText"/>
-      </w:pPr>
-      <w:r>
-        <w:t xml:space="preserve">Me llamo Julian. Es la duodécima vez que lo digo. Hoy lo he dicho solo para mí.</w:t>
-      </w:r>
-    </w:p>
-    <w:p>
-      <w:r>
-        <w:pict>
-          <v:rect style="width:0;height:1.5pt" o:hralign="center" o:hrstd="t" o:hr="t"/>
-        </w:pict>
-      </w:r>
-    </w:p>
-    <w:bookmarkStart w:id="81" w:name="maruxa-costa-da-morte-hoy-1"/>
-    <w:p>
-      <w:pPr>
-        <w:pStyle w:val="Heading3"/>
-      </w:pPr>
-      <w:r>
-        <w:t xml:space="preserve">Maruxa · Costa da Morte, hoy</w:t>
-      </w:r>
-    </w:p>
-    <w:p>
-      <w:pPr>
-        <w:pStyle w:val="FirstParagraph"/>
-      </w:pPr>
-      <w:r>
-        <w:t xml:space="preserve">Non durmo ben desde que morreu Klaus. Seis anos.</w:t>
-      </w:r>
-    </w:p>
-    <w:p>
-      <w:pPr>
-        <w:pStyle w:val="BodyText"/>
-      </w:pPr>
-      <w:r>
-        <w:t xml:space="preserve">Cincuenta y tres años se despertó antes que yo. A las cinco, la hora de los barcos. Y no se levantaba: se quedaba mirándome dormir, como aquella mañana de Stuttgart. Yo, cada vez que lo notaba despierto, cerraba los ojos más fuerte y me hacía la dormida, para que pudiera seguir mirando. Nunca se lo dije. Creo que él lo sabía, y hacía como que no, para que yo pudiera seguir fingiendo.</w:t>
-      </w:r>
-    </w:p>
-    <w:p>
-      <w:pPr>
-        <w:pStyle w:val="BodyText"/>
-      </w:pPr>
-      <w:r>
-        <w:t xml:space="preserve">Así nos quisimos. Fingiendo los dos a la vez.</w:t>
-      </w:r>
-    </w:p>
-    <w:p>
-      <w:pPr>
-        <w:pStyle w:val="BodyText"/>
-      </w:pPr>
-      <w:r>
-        <w:t xml:space="preserve">La primera noche sin él volví del hospital a una cama que había hecho yo por la mañana, porque Klaus decía que una cama sin hacer es una casa que se ha rendido. Me desperté a las cinco y no había nadie mirándome. Lo noté antes de abrir los ojos: el aire de la habitación estaba quieto de otra manera. Me quedé mucho rato haciéndome la dormida. Por costumbre. Por si acaso. Luego me levanté e hice café. Dos tazas, sin pensar. Me bebí las dos.</w:t>
-      </w:r>
-    </w:p>
-    <w:p>
-      <w:pPr>
-        <w:pStyle w:val="BodyText"/>
-      </w:pPr>
-      <w:r>
-        <w:t xml:space="preserve">Me levanto a las tres, a las cuatro, y me siento en la ventana de la cocina con la luz apagada, a mirar el puerto. Las barcas. El espigón. El monte negro contra el cielo negro. Y arriba del monte, donde acaba la tierra, el faro.</w:t>
-      </w:r>
-    </w:p>
-    <w:p>
-      <w:pPr>
-        <w:pStyle w:val="BodyText"/>
-      </w:pPr>
-      <w:r>
-        <w:t xml:space="preserve">Apagado. Siempre apagado. Desde el ochenta y siete.</w:t>
-      </w:r>
-    </w:p>
-    <w:p>
-      <w:pPr>
-        <w:pStyle w:val="BodyText"/>
-      </w:pPr>
-      <w:r>
-        <w:t xml:space="preserve">Esa noche no.</w:t>
-      </w:r>
-    </w:p>
-    <w:p>
-      <w:pPr>
-        <w:pStyle w:val="BodyText"/>
-      </w:pPr>
-      <w:r>
-        <w:t xml:space="preserve">Esa noche, a las dos y diez, estaba en la ventana con una manzanilla y lo vi encenderse. Primero una lucecita amarilla, como una vela. Luego blanca. Luego el brazo de luz que pasó por encima del mar, por encima del puerto, por encima de mi ventana, por encima de mí.</w:t>
-      </w:r>
-    </w:p>
-    <w:p>
-      <w:pPr>
-        <w:pStyle w:val="BodyText"/>
-      </w:pPr>
-      <w:r>
-        <w:t xml:space="preserve">Una vez cada doce segundos. Lo conté.</w:t>
-      </w:r>
-    </w:p>
-    <w:p>
-      <w:pPr>
-        <w:pStyle w:val="BodyText"/>
-      </w:pPr>
-      <w:r>
-        <w:t xml:space="preserve">Me puse la mano en la boca.</w:t>
-      </w:r>
-    </w:p>
-    <w:p>
-      <w:pPr>
-        <w:pStyle w:val="BodyText"/>
-      </w:pPr>
-      <w:r>
-        <w:t xml:space="preserve">Klaus me contó una vez que, cuando era niño, su madre encendía una vela en la ventana las noches de invierno para que su padre supiera dónde estaba la casa al volver. Que no hacía falta. Que la calle tenía mil luces. Pero que la de la ventana era la única que estaba encendida para él.</w:t>
-      </w:r>
-    </w:p>
-    <w:p>
-      <w:pPr>
-        <w:pStyle w:val="BodyText"/>
-      </w:pPr>
-      <w:r>
-        <w:t xml:space="preserve">No sé quién ha encendido el faro. Sé quién vive allí.</w:t>
-      </w:r>
-    </w:p>
-    <w:p>
-      <w:pPr>
-        <w:pStyle w:val="BodyText"/>
-      </w:pPr>
-      <w:r>
-        <w:t xml:space="preserve">Y sé, porque lo he visto hoy en mi cocina comiéndose la empanada con los ojos cerrados, que el muchacho de la barba no es de este mundo. Ni falta que le hace. Klaus tampoco lo era. Llegó con un diccionario y un abrigo gris a un pueblo que no lo quería, y se quedó cincuenta y tres años.</w:t>
-      </w:r>
-    </w:p>
-    <w:p>
-      <w:pPr>
-        <w:pStyle w:val="BodyText"/>
-      </w:pPr>
-      <w:r>
-        <w:t xml:space="preserve">Seguí en la ventana hasta que amaneció y la luz se apagó.</w:t>
-      </w:r>
-    </w:p>
-    <w:p>
-      <w:pPr>
-        <w:pStyle w:val="BodyText"/>
-      </w:pPr>
-      <w:r>
-        <w:t xml:space="preserve">Luego lavé la taza. Me vestí. Bajé al puerto como todas las mañanas.</w:t>
-      </w:r>
-    </w:p>
-    <w:p>
-      <w:pPr>
-        <w:pStyle w:val="BodyText"/>
-      </w:pPr>
-      <w:r>
-        <w:t xml:space="preserve">Y en el espigón, de cara al mar, sin nadie que me oyera, después de seis años, canté.</w:t>
+        <w:t xml:space="preserve">Me llamo Ada.</w:t>
       </w:r>
     </w:p>
     <w:p>
@@ -30396,7 +29362,6 @@
     </w:p>
     <w:bookmarkEnd w:id="81"/>
     <w:bookmarkEnd w:id="82"/>
-    <w:bookmarkEnd w:id="83"/>
     <w:sectPr/>
   </w:body>
 </w:document>

</xml_diff>